<commit_message>
JMEP R1: Sec. 4.4 comparison with domain LMs, tool-using agents and closed-loop studies (R2#18c, verified refs); cite SMST 2026 extended abstract; rebuild
</commit_message>
<xml_diff>
--- a/submissions/JMEP-R1/Cai_Fe-SMA_JMEP_R1_clean.docx
+++ b/submissions/JMEP-R1/Cai_Fe-SMA_JMEP_R1_clean.docx
@@ -323,6 +323,15 @@
         <w:t xml:space="preserve">(Ref 12)</w:t>
       </w:r>
       <w:r>
+        <w:t xml:space="preserve">; preliminary results were reported at SMST 2026</w:t>
+      </w:r>
+      <w:r>
+        <w:t xml:space="preserve"> </w:t>
+      </w:r>
+      <w:r>
+        <w:t xml:space="preserve">(Ref 15)</w:t>
+      </w:r>
+      <w:r>
         <w:t xml:space="preserve">. Both alloys were then put through the same nominal processing route. Identical nominal parameters do not guarantee identical recrystallization, grain size, texture or precipitation state in two different compositions, so what follows is a comparison of how each alloy responds to a common route rather than a controlled isolation of composition; the limits of that comparison are stated in Sec. 4.1.</w:t>
       </w:r>
     </w:p>
@@ -383,7 +392,7 @@
         <w:t xml:space="preserve"> </w:t>
       </w:r>
       <w:r>
-        <w:t xml:space="preserve">(Ref 12,15)</w:t>
+        <w:t xml:space="preserve">(Ref 12,16)</w:t>
       </w:r>
       <w:r>
         <w:t xml:space="preserve"> </w:t>
@@ -483,7 +492,7 @@
         <w:t xml:space="preserve"> </w:t>
       </w:r>
       <w:r>
-        <w:t xml:space="preserve">(Ref 16)</w:t>
+        <w:t xml:space="preserve">(Ref 17)</w:t>
       </w:r>
       <w:r>
         <w:t xml:space="preserve"> </w:t>
@@ -495,7 +504,7 @@
         <w:t xml:space="preserve"> </w:t>
       </w:r>
       <w:r>
-        <w:t xml:space="preserve">(Ref 17)</w:t>
+        <w:t xml:space="preserve">(Ref 18)</w:t>
       </w:r>
       <w:r>
         <w:t xml:space="preserve"> </w:t>
@@ -571,7 +580,7 @@
         <w:t xml:space="preserve"> </w:t>
       </w:r>
       <w:r>
-        <w:t xml:space="preserve">(Ref 18)</w:t>
+        <w:t xml:space="preserve">(Ref 19)</w:t>
       </w:r>
       <w:r>
         <w:t xml:space="preserve">, which carries the alloy repeatedly between the single-phase α field and the α + γ two-phase field; the rod schedule shares its 900 °C lower step and three cycles with that of Viebranz</w:t>
@@ -590,7 +599,7 @@
         <w:t xml:space="preserve"> </w:t>
       </w:r>
       <w:r>
-        <w:t xml:space="preserve">(Ref 19)</w:t>
+        <w:t xml:space="preserve">(Ref 20)</w:t>
       </w:r>
       <w:r>
         <w:t xml:space="preserve">. What a cycle of this kind does in an alloy whose calculated constitution is α + γ at 1200 °C and, in the primary database, fully γ at 900 °C (Sec. 3.4) is taken up in Sec. 3.5.</w:t>
@@ -635,7 +644,7 @@
         <w:t xml:space="preserve"> </w:t>
       </w:r>
       <w:r>
-        <w:t xml:space="preserve">(Ref 20)</w:t>
+        <w:t xml:space="preserve">(Ref 21)</w:t>
       </w:r>
       <w:r>
         <w:t xml:space="preserve">, and the parameters needed to run it are specified here. Engineering stress is computed from each specimen’s measured diameter as entered in the instrument record, and engineering strain is reported throughout as crosshead extension divided by the gauge length recorded by the instrument for that test, without extensometry, so the elastic portion of each curve carries the compliance of the load train and the moduli in</w:t>
@@ -718,7 +727,7 @@
         <w:t xml:space="preserve"> </w:t>
       </w:r>
       <w:r>
-        <w:t xml:space="preserve">(Ref 21)</w:t>
+        <w:t xml:space="preserve">(Ref 22)</w:t>
       </w:r>
       <w:r>
         <w:t xml:space="preserve">; this alters the stress–strain response of an alloy that transforms rather than suppressing the transformation, and it is expected to be weaker in Fe-Mn-Al-Ni, whose transformation stress depends only weakly on temperature (0.53 MPa °C⁻¹</w:t>
@@ -754,7 +763,7 @@
         <w:t xml:space="preserve"> </w:t>
       </w:r>
       <w:r>
-        <w:t xml:space="preserve">(Ref 22,23)</w:t>
+        <w:t xml:space="preserve">(Ref 23,24)</w:t>
       </w:r>
       <w:r>
         <w:t xml:space="preserve">. The incident wavelength was λ = 0.12587 Å with a beam size of 0.5 × 0.5 mm². Patterns were recorded in transmission on a 4288 × 4288-pixel area detector with 100 µm pixels, ≈1.83 m from the specimen; the beam center and the distance were fitted from the Debye–Scherrer rings themselves, consistent to better than 0.1% across six indexed rings, and a CeO₂ calibrant frame gives the same beam center. Two-dimensional Debye–Scherrer patterns were collected, one or two frames per specimen, from separate specimens of each alloy before and after tensile deformation (10% strain for the LLM-alloy, 8% for the benchmark) to test for any potential phase transformation, and from the cyclically treated LLM-alloy rod examined in Sec. 3.3. These 2D images were processed using FIT2D</w:t>
@@ -763,7 +772,7 @@
         <w:t xml:space="preserve"> </w:t>
       </w:r>
       <w:r>
-        <w:t xml:space="preserve">(Ref 24)</w:t>
+        <w:t xml:space="preserve">(Ref 25)</w:t>
       </w:r>
       <w:r>
         <w:t xml:space="preserve">, where diffraction data were sliced at 5-degree intervals along the 360-degree azimuth and integrated to generate 72 diffraction spectra, which were then fitted by Rietveld refinement</w:t>
@@ -772,7 +781,7 @@
         <w:t xml:space="preserve"> </w:t>
       </w:r>
       <w:r>
-        <w:t xml:space="preserve">(Ref 25)</w:t>
+        <w:t xml:space="preserve">(Ref 26)</w:t>
       </w:r>
       <w:r>
         <w:t xml:space="preserve"> </w:t>
@@ -784,7 +793,7 @@
         <w:t xml:space="preserve"> </w:t>
       </w:r>
       <w:r>
-        <w:t xml:space="preserve">(Ref 26)</w:t>
+        <w:t xml:space="preserve">(Ref 27)</w:t>
       </w:r>
       <w:r>
         <w:t xml:space="preserve"> </w:t>
@@ -814,7 +823,7 @@
         <w:t xml:space="preserve"> </w:t>
       </w:r>
       <w:r>
-        <w:t xml:space="preserve">(Ref 27)</w:t>
+        <w:t xml:space="preserve">(Ref 28)</w:t>
       </w:r>
       <w:r>
         <w:t xml:space="preserve"> </w:t>
@@ -826,7 +835,7 @@
         <w:t xml:space="preserve"> </w:t>
       </w:r>
       <w:r>
-        <w:t xml:space="preserve">(Ref 28)</w:t>
+        <w:t xml:space="preserve">(Ref 29)</w:t>
       </w:r>
       <w:r>
         <w:t xml:space="preserve">. Isoplethal step diagrams were calculated at 1 atm from 400 to 1400 °C in 10 °C increments, with the liquid phase and every other phase listed for each database in Table S2 (Online Resource 2) included in every calculation; a first pass on a 20 °C grid reproduced every shared point exactly, so the results do not depend on the temperature step. They can depend on the density of the composition grid from which the global Gibbs-energy minimization starts: near the solidus of the LLM-alloy, different densities converged to different states, and for those temperatures in the step diagrams (Fig. 9, Tables 3 and 4) the state of lowest Gibbs energy across a ladder of densities was retained; the nickel and composition scans of Sec. 3.4 were not arbitrated (Table S2). Starting grids were 500 points per degree of freedom (2000 for mc_fe v2.059), and the density ladders used for this arbitration spanned 300–4000 points per degree of freedom. Input compositions were the ICP-AES chemistries of</w:t>
@@ -885,7 +894,7 @@
         <w:t xml:space="preserve"> </w:t>
       </w:r>
       <w:r>
-        <w:t xml:space="preserve">(Ref 29,30)</w:t>
+        <w:t xml:space="preserve">(Ref 30,31)</w:t>
       </w:r>
       <w:r>
         <w:t xml:space="preserve">, the only one covering Fe–Mn–Al–Ni–C together, in which B2 is treated as an ordered partition of the disordered A2 lattice; it does not contain Si.</w:t>
@@ -904,7 +913,7 @@
         <w:t xml:space="preserve"> </w:t>
       </w:r>
       <w:r>
-        <w:t xml:space="preserve">(Ref 31)</w:t>
+        <w:t xml:space="preserve">(Ref 32)</w:t>
       </w:r>
       <w:r>
         <w:t xml:space="preserve"> </w:t>
@@ -926,7 +935,7 @@
         <w:t xml:space="preserve"> </w:t>
       </w:r>
       <w:r>
-        <w:t xml:space="preserve">(Ref 32)</w:t>
+        <w:t xml:space="preserve">(Ref 33)</w:t>
       </w:r>
       <w:r>
         <w:t xml:space="preserve"> </w:t>
@@ -1128,7 +1137,7 @@
         <w:t xml:space="preserve"> </w:t>
       </w:r>
       <w:r>
-        <w:t xml:space="preserve">(Ref 33,34)</w:t>
+        <w:t xml:space="preserve">(Ref 34,35)</w:t>
       </w:r>
       <w:r>
         <w:t xml:space="preserve">; this was not the case for the LLM-alloy (</w:t>
@@ -1788,7 +1797,7 @@
         <w:t xml:space="preserve"> </w:t>
       </w:r>
       <w:r>
-        <w:t xml:space="preserve">(Ref 35)</w:t>
+        <w:t xml:space="preserve">(Ref 36)</w:t>
       </w:r>
       <w:r>
         <w:t xml:space="preserve">. These textures are the reason the azimuthal dimension was retained in the refinement (Sec. 2.5).</w:t>
@@ -1952,7 +1961,7 @@
         <w:t xml:space="preserve"> </w:t>
       </w:r>
       <w:r>
-        <w:t xml:space="preserve">(Ref 18,36)</w:t>
+        <w:t xml:space="preserve">(Ref 19,37)</w:t>
       </w:r>
       <w:r>
         <w:t xml:space="preserve">, and</w:t>
@@ -2164,7 +2173,7 @@
         <w:t xml:space="preserve"> </w:t>
       </w:r>
       <w:r>
-        <w:t xml:space="preserve">(Ref 12,18)</w:t>
+        <w:t xml:space="preserve">(Ref 12,19)</w:t>
       </w:r>
       <w:r>
         <w:t xml:space="preserve">. After cyclic treatment (Sec. 2.2) its 0.64 mm wire is bamboo throughout in optical metallography (not shown): individual grains occupy the full width of the section, and their boundaries run across the wire rather than along it, so that a tensile axis intersects few boundaries and each grain can accommodate a transformation shape strain with little constraint from its neighbors.</w:t>
@@ -2889,7 +2898,7 @@
         <w:t xml:space="preserve"> </w:t>
       </w:r>
       <w:r>
-        <w:t xml:space="preserve">(Ref 37)</w:t>
+        <w:t xml:space="preserve">(Ref 38)</w:t>
       </w:r>
       <w:r>
         <w:t xml:space="preserve"> </w:t>
@@ -3046,171 +3055,171 @@
         <w:t xml:space="preserve"> </w:t>
       </w:r>
       <w:r>
+        <w:t xml:space="preserve">(Ref 38)</w:t>
+      </w:r>
+      <w:r>
+        <w:t xml:space="preserve"> </w:t>
+      </w:r>
+      <w:r>
+        <w:t xml:space="preserve">and so would not be separated from α by chemistry alone; the EDS result is reported qualitatively (Sec. 3.1), without a map of composition against crystal structure and without a fraction of either constituent. The microstructural test is a phase map with composition on the same area (EBSD with EDS), in which Al-rich regions indexing as FCC would be the signature of the second reading, or an areal fraction of the Mn-rich constituent on the same mount, which the first reading requires to match the ≈62% γ of the refinement and the second to fall below it; neither was performed. The lath-like appearance of the cyclically treated wire (</w:t>
+      </w:r>
+      <w:r>
+        <w:rPr>
+          <w:b/>
+          <w:bCs/>
+        </w:rPr>
+        <w:t xml:space="preserve">Fig. 1d</w:t>
+      </w:r>
+      <w:r>
+        <w:t xml:space="preserve">, Sec. 3.1) is consistent with either reading. The control bears on this without deciding it: the benchmark is calculated to be single-phase α at 1200 °C, yet its pattern after the same 1-minute anneal and quench carries γ reflections (</w:t>
+      </w:r>
+      <w:r>
+        <w:rPr>
+          <w:b/>
+          <w:bCs/>
+        </w:rPr>
+        <w:t xml:space="preserve">Fig. 4c</w:t>
+      </w:r>
+      <w:r>
+        <w:t xml:space="preserve">, Sec. 3.3), so a calculated single-phase α state at temperature does not guarantee a γ-free quenched state even in an alloy that transforms; the amount of that γ could not be refined, and whether it was present at temperature or formed on cooling is equally open. The two readings do not bear equally on this interpretation, and the difference should be stated. Under the first, the γ excess was already present at 1200 °C, and the scarcity of α after the quench reflects the constitution at the solution-treatment temperature. Under the second, more α was present at 1200 °C than survived the quench, and the proportion at temperature is then known only from the calculation. What holds under both is narrower: no strain recovery beyond σ/E in any condition in which unloading was recorded (Secs. 3.2 and 3.5), none on heating in the one condition given that test (</w:t>
+      </w:r>
+      <w:r>
+        <w:rPr>
+          <w:b/>
+          <w:bCs/>
+        </w:rPr>
+        <w:t xml:space="preserve">Fig. 3a</w:t>
+      </w:r>
+      <w:r>
+        <w:t xml:space="preserve">), a minority of α after the quench (≈34%, Sec. 3.3), and the calculated absence of any single-phase α field from which the benchmark’s microstructure could be produced (Sec. 3.4). Attributing the null result to the missing single-phase parent state is therefore an interpretation consistent with both readings but established by neither, and it is offered on that basis. The direct test of whether a transformation occurs on cooling is differential scanning calorimetry of the strand-annealed wire through heating and cooling, with the benchmark wire as the control; it has not been performed, and the question is carried as open in Sec. 4.4.</w:t>
+      </w:r>
+    </w:p>
+    <w:p>
+      <w:pPr>
+        <w:pStyle w:val="BodyText"/>
+      </w:pPr>
+      <w:r>
+        <w:t xml:space="preserve">The calculations also clarify the status of the ordered phases. D0₃ is not predicted to be an equilibrium phase at ≈12 at% Al (Sec. 3.4), yet it is observed. Its presence is therefore best understood as a metastable ordering product formed on cooling — exactly the kind of kinetic outcome that a screening step based on composition and equilibrium thermodynamics alone cannot anticipate. It is not, however, peculiar to this heat. Both B2 and D0₃ are documented ordering products in the Fe-Mn-Al-C low-density steels</w:t>
+      </w:r>
+      <w:r>
+        <w:t xml:space="preserve"> </w:t>
+      </w:r>
+      <w:r>
+        <w:t xml:space="preserve">(Ref 17)</w:t>
+      </w:r>
+      <w:r>
+        <w:t xml:space="preserve">, and in the Ni-alloyed members of that family the B2 that does form is only marginally stable at the temperature used here: nanoscale NiAl-type B2 confined to the BCC constituent of a γ-majority Fe-16Mn-9Al-0.9C-5Ni steel coarsens on holding at 1110 °C and breaks up again after 30 min at 1200 °C</w:t>
+      </w:r>
+      <w:r>
+        <w:t xml:space="preserve"> </w:t>
+      </w:r>
+      <w:r>
+        <w:t xml:space="preserve">(Ref 18)</w:t>
+      </w:r>
+      <w:r>
+        <w:t xml:space="preserve">. The ordering behavior observed in the LLM-alloy is thus characteristic of the alloy field its chemistry actually places it in, rather than of the shape-memory field it was designed for. Conversely, the ordered bcc that the LLM-alloy can form at equilibrium is small (≤11%) and confined below ≈850 °C. At those temperatures both alloys are calculated to be ordered bcc coexisting with γ; what separates them is the step before. The benchmark can be quenched from a single-phase α field and then aged, so that B2 orders coherently within α before γ has time to nucleate. The LLM-alloy has no accessible single-phase α field to quench from (Sec. 3.4), so there is no single-phase α matrix in which coherent B2 could form, and the microstructure the benchmark relies upon is, on the equilibrium calculation of Sec. 3.4, unavailable to this composition at any temperature in the solid state. This is a stronger statement than the absence of a B2 reflection alone would support, and it offers an account, though not a demonstrated cause, of the failure of the 200 °C aging treatment (</w:t>
+      </w:r>
+      <w:r>
+        <w:rPr>
+          <w:b/>
+          <w:bCs/>
+        </w:rPr>
+        <w:t xml:space="preserve">Fig. 2h</w:t>
+      </w:r>
+      <w:r>
+        <w:t xml:space="preserve">) to induce any pseudoelastic response.</w:t>
+      </w:r>
+    </w:p>
+    <w:p>
+      <w:pPr>
+        <w:pStyle w:val="BodyText"/>
+      </w:pPr>
+      <w:r>
+        <w:t xml:space="preserve">One asymmetry in the experimental design is worth making explicit, because it bears directly on whether the processing route was simply the wrong route for this composition. The two alloys were not treated identically in the respect that matters most for aging. The LLM-alloy received the 200 °C / 3 h age reported to improve pseudoelasticity in this family</w:t>
+      </w:r>
+      <w:r>
+        <w:t xml:space="preserve"> </w:t>
+      </w:r>
+      <w:r>
+        <w:t xml:space="preserve">(Ref 34,35)</w:t>
+      </w:r>
+      <w:r>
+        <w:t xml:space="preserve"> </w:t>
+      </w:r>
+      <w:r>
+        <w:t xml:space="preserve">and showed no response whatever (</w:t>
+      </w:r>
+      <w:r>
+        <w:rPr>
+          <w:b/>
+          <w:bCs/>
+        </w:rPr>
+        <w:t xml:space="preserve">Fig. 2h</w:t>
+      </w:r>
+      <w:r>
+        <w:t xml:space="preserve">, indistinguishable from the unaged</w:t>
+      </w:r>
+      <w:r>
+        <w:t xml:space="preserve"> </w:t>
+      </w:r>
+      <w:r>
+        <w:rPr>
+          <w:b/>
+          <w:bCs/>
+        </w:rPr>
+        <w:t xml:space="preserve">Fig. 2g</w:t>
+      </w:r>
+      <w:r>
+        <w:t xml:space="preserve">). The benchmark in</w:t>
+      </w:r>
+      <w:r>
+        <w:t xml:space="preserve"> </w:t>
+      </w:r>
+      <w:r>
+        <w:rPr>
+          <w:b/>
+          <w:bCs/>
+        </w:rPr>
+        <w:t xml:space="preserve">Fig. 3b</w:t>
+      </w:r>
+      <w:r>
+        <w:t xml:space="preserve"> </w:t>
+      </w:r>
+      <w:r>
+        <w:t xml:space="preserve">received no age at all — 1200 °C for 1 min and cooling, nothing more — and still showed reverse transformation on heating. The two tests differ — the aged LLM-alloy was examined on unloading (</w:t>
+      </w:r>
+      <w:r>
+        <w:rPr>
+          <w:b/>
+          <w:bCs/>
+        </w:rPr>
+        <w:t xml:space="preserve">Fig. 2h</w:t>
+      </w:r>
+      <w:r>
+        <w:t xml:space="preserve">), not in the heating test — but the aging asymmetry runs in the LLM-alloy’s favor rather than against it, and the null result cannot be attributed to an aging treatment that was withheld. This is not the same as claiming the route was optimal for the LLM composition: no route was optimized for either alloy, and whether some other solution or aging window could unlock a transformation in this chemistry is untested and is named as such in Sec. 4.4.</w:t>
+      </w:r>
+    </w:p>
+    <w:p>
+      <w:pPr>
+        <w:pStyle w:val="BodyText"/>
+      </w:pPr>
+      <w:r>
+        <w:t xml:space="preserve">Furthermore, mechanical and structural analyses indicate that the LLM-alloy accommodates macroscopic deformation via irreversible dislocation slip rather than phase transitions. Coherent, ordered β-NiAl (B2) precipitates within a BCC matrix contribute to, rather than solely determine, the transformation reversibility of the benchmark</w:t>
+      </w:r>
+      <w:r>
+        <w:t xml:space="preserve"> </w:t>
+      </w:r>
+      <w:r>
         <w:t xml:space="preserve">(Ref 37)</w:t>
       </w:r>
       <w:r>
-        <w:t xml:space="preserve"> </w:t>
-      </w:r>
-      <w:r>
-        <w:t xml:space="preserve">and so would not be separated from α by chemistry alone; the EDS result is reported qualitatively (Sec. 3.1), without a map of composition against crystal structure and without a fraction of either constituent. The microstructural test is a phase map with composition on the same area (EBSD with EDS), in which Al-rich regions indexing as FCC would be the signature of the second reading, or an areal fraction of the Mn-rich constituent on the same mount, which the first reading requires to match the ≈62% γ of the refinement and the second to fall below it; neither was performed. The lath-like appearance of the cyclically treated wire (</w:t>
-      </w:r>
-      <w:r>
-        <w:rPr>
-          <w:b/>
-          <w:bCs/>
-        </w:rPr>
-        <w:t xml:space="preserve">Fig. 1d</w:t>
-      </w:r>
-      <w:r>
-        <w:t xml:space="preserve">, Sec. 3.1) is consistent with either reading. The control bears on this without deciding it: the benchmark is calculated to be single-phase α at 1200 °C, yet its pattern after the same 1-minute anneal and quench carries γ reflections (</w:t>
-      </w:r>
-      <w:r>
-        <w:rPr>
-          <w:b/>
-          <w:bCs/>
-        </w:rPr>
-        <w:t xml:space="preserve">Fig. 4c</w:t>
-      </w:r>
-      <w:r>
-        <w:t xml:space="preserve">, Sec. 3.3), so a calculated single-phase α state at temperature does not guarantee a γ-free quenched state even in an alloy that transforms; the amount of that γ could not be refined, and whether it was present at temperature or formed on cooling is equally open. The two readings do not bear equally on this interpretation, and the difference should be stated. Under the first, the γ excess was already present at 1200 °C, and the scarcity of α after the quench reflects the constitution at the solution-treatment temperature. Under the second, more α was present at 1200 °C than survived the quench, and the proportion at temperature is then known only from the calculation. What holds under both is narrower: no strain recovery beyond σ/E in any condition in which unloading was recorded (Secs. 3.2 and 3.5), none on heating in the one condition given that test (</w:t>
-      </w:r>
-      <w:r>
-        <w:rPr>
-          <w:b/>
-          <w:bCs/>
-        </w:rPr>
-        <w:t xml:space="preserve">Fig. 3a</w:t>
-      </w:r>
-      <w:r>
-        <w:t xml:space="preserve">), a minority of α after the quench (≈34%, Sec. 3.3), and the calculated absence of any single-phase α field from which the benchmark’s microstructure could be produced (Sec. 3.4). Attributing the null result to the missing single-phase parent state is therefore an interpretation consistent with both readings but established by neither, and it is offered on that basis. The direct test of whether a transformation occurs on cooling is differential scanning calorimetry of the strand-annealed wire through heating and cooling, with the benchmark wire as the control; it has not been performed, and the question is carried as open in Sec. 4.4.</w:t>
-      </w:r>
-    </w:p>
-    <w:p>
-      <w:pPr>
-        <w:pStyle w:val="BodyText"/>
-      </w:pPr>
-      <w:r>
-        <w:t xml:space="preserve">The calculations also clarify the status of the ordered phases. D0₃ is not predicted to be an equilibrium phase at ≈12 at% Al (Sec. 3.4), yet it is observed. Its presence is therefore best understood as a metastable ordering product formed on cooling — exactly the kind of kinetic outcome that a screening step based on composition and equilibrium thermodynamics alone cannot anticipate. It is not, however, peculiar to this heat. Both B2 and D0₃ are documented ordering products in the Fe-Mn-Al-C low-density steels</w:t>
-      </w:r>
-      <w:r>
-        <w:t xml:space="preserve"> </w:t>
-      </w:r>
-      <w:r>
-        <w:t xml:space="preserve">(Ref 16)</w:t>
-      </w:r>
-      <w:r>
-        <w:t xml:space="preserve">, and in the Ni-alloyed members of that family the B2 that does form is only marginally stable at the temperature used here: nanoscale NiAl-type B2 confined to the BCC constituent of a γ-majority Fe-16Mn-9Al-0.9C-5Ni steel coarsens on holding at 1110 °C and breaks up again after 30 min at 1200 °C</w:t>
-      </w:r>
-      <w:r>
-        <w:t xml:space="preserve"> </w:t>
-      </w:r>
-      <w:r>
-        <w:t xml:space="preserve">(Ref 17)</w:t>
-      </w:r>
-      <w:r>
-        <w:t xml:space="preserve">. The ordering behavior observed in the LLM-alloy is thus characteristic of the alloy field its chemistry actually places it in, rather than of the shape-memory field it was designed for. Conversely, the ordered bcc that the LLM-alloy can form at equilibrium is small (≤11%) and confined below ≈850 °C. At those temperatures both alloys are calculated to be ordered bcc coexisting with γ; what separates them is the step before. The benchmark can be quenched from a single-phase α field and then aged, so that B2 orders coherently within α before γ has time to nucleate. The LLM-alloy has no accessible single-phase α field to quench from (Sec. 3.4), so there is no single-phase α matrix in which coherent B2 could form, and the microstructure the benchmark relies upon is, on the equilibrium calculation of Sec. 3.4, unavailable to this composition at any temperature in the solid state. This is a stronger statement than the absence of a B2 reflection alone would support, and it offers an account, though not a demonstrated cause, of the failure of the 200 °C aging treatment (</w:t>
-      </w:r>
-      <w:r>
-        <w:rPr>
-          <w:b/>
-          <w:bCs/>
-        </w:rPr>
-        <w:t xml:space="preserve">Fig. 2h</w:t>
-      </w:r>
-      <w:r>
-        <w:t xml:space="preserve">) to induce any pseudoelastic response.</w:t>
-      </w:r>
-    </w:p>
-    <w:p>
-      <w:pPr>
-        <w:pStyle w:val="BodyText"/>
-      </w:pPr>
-      <w:r>
-        <w:t xml:space="preserve">One asymmetry in the experimental design is worth making explicit, because it bears directly on whether the processing route was simply the wrong route for this composition. The two alloys were not treated identically in the respect that matters most for aging. The LLM-alloy received the 200 °C / 3 h age reported to improve pseudoelasticity in this family</w:t>
-      </w:r>
-      <w:r>
-        <w:t xml:space="preserve"> </w:t>
-      </w:r>
-      <w:r>
-        <w:t xml:space="preserve">(Ref 33,34)</w:t>
-      </w:r>
-      <w:r>
-        <w:t xml:space="preserve"> </w:t>
-      </w:r>
-      <w:r>
-        <w:t xml:space="preserve">and showed no response whatever (</w:t>
-      </w:r>
-      <w:r>
-        <w:rPr>
-          <w:b/>
-          <w:bCs/>
-        </w:rPr>
-        <w:t xml:space="preserve">Fig. 2h</w:t>
-      </w:r>
-      <w:r>
-        <w:t xml:space="preserve">, indistinguishable from the unaged</w:t>
-      </w:r>
-      <w:r>
-        <w:t xml:space="preserve"> </w:t>
-      </w:r>
-      <w:r>
-        <w:rPr>
-          <w:b/>
-          <w:bCs/>
-        </w:rPr>
-        <w:t xml:space="preserve">Fig. 2g</w:t>
-      </w:r>
-      <w:r>
-        <w:t xml:space="preserve">). The benchmark in</w:t>
-      </w:r>
-      <w:r>
-        <w:t xml:space="preserve"> </w:t>
-      </w:r>
-      <w:r>
-        <w:rPr>
-          <w:b/>
-          <w:bCs/>
-        </w:rPr>
-        <w:t xml:space="preserve">Fig. 3b</w:t>
-      </w:r>
-      <w:r>
-        <w:t xml:space="preserve"> </w:t>
-      </w:r>
-      <w:r>
-        <w:t xml:space="preserve">received no age at all — 1200 °C for 1 min and cooling, nothing more — and still showed reverse transformation on heating. The two tests differ — the aged LLM-alloy was examined on unloading (</w:t>
-      </w:r>
-      <w:r>
-        <w:rPr>
-          <w:b/>
-          <w:bCs/>
-        </w:rPr>
-        <w:t xml:space="preserve">Fig. 2h</w:t>
-      </w:r>
-      <w:r>
-        <w:t xml:space="preserve">), not in the heating test — but the aging asymmetry runs in the LLM-alloy’s favor rather than against it, and the null result cannot be attributed to an aging treatment that was withheld. This is not the same as claiming the route was optimal for the LLM composition: no route was optimized for either alloy, and whether some other solution or aging window could unlock a transformation in this chemistry is untested and is named as such in Sec. 4.4.</w:t>
-      </w:r>
-    </w:p>
-    <w:p>
-      <w:pPr>
-        <w:pStyle w:val="BodyText"/>
-      </w:pPr>
-      <w:r>
-        <w:t xml:space="preserve">Furthermore, mechanical and structural analyses indicate that the LLM-alloy accommodates macroscopic deformation via irreversible dislocation slip rather than phase transitions. Coherent, ordered β-NiAl (B2) precipitates within a BCC matrix contribute to, rather than solely determine, the transformation reversibility of the benchmark</w:t>
-      </w:r>
-      <w:r>
-        <w:t xml:space="preserve"> </w:t>
-      </w:r>
-      <w:r>
-        <w:t xml:space="preserve">(Ref 36)</w:t>
-      </w:r>
-      <w:r>
         <w:t xml:space="preserve">; parent-phase stability, transformation temperature, grain size, crystallographic orientation and texture, and the competition between the transformation stress and the plastic yield stress all bear on whether a stress-induced transformation can proceed reversibly. The precipitates are not even a purely mechanical contribution: by drawing Ni and Al out of solution they alter the composition of the matrix that surrounds them, and hence its transformation temperatures, so that the same aging treatment shifts both the obstacle field and the thermodynamic setting in which the transformation must occur</w:t>
       </w:r>
       <w:r>
         <w:t xml:space="preserve"> </w:t>
       </w:r>
       <w:r>
-        <w:t xml:space="preserve">(Ref 38)</w:t>
+        <w:t xml:space="preserve">(Ref 39)</w:t>
       </w:r>
       <w:r>
         <w:t xml:space="preserve">. In the LLM-alloy the ordered phase that forms is D0₃ Fe₃Al, present at ≈4% (Sec. 3.3) and not shown by the present data to form a fine coherent dispersion, so there is no evidence that it raises the resistance to plastic flow in the way that B2 does in the benchmark. The post-deformation synchrotron patterns are consistent with this interpretation: the change from sharp, discrete spots to broader, partially arced rings is what dislocation multiplication and sub-grain formation would produce, although it was not quantified and texture evolution could contribute to it (Sec. 3.3). Thus, as processed here, the duplex LLM-alloy is interpreted to deform by dislocation slip rather than by stress-induced martensitic transformation.</w:t>
@@ -3337,7 +3346,7 @@
         <w:t xml:space="preserve"> </w:t>
       </w:r>
       <w:r>
-        <w:t xml:space="preserve">(Ref 39)</w:t>
+        <w:t xml:space="preserve">(Ref 40)</w:t>
       </w:r>
       <w:r>
         <w:t xml:space="preserve"> </w:t>
@@ -3394,7 +3403,7 @@
         <w:t xml:space="preserve"> </w:t>
       </w:r>
       <w:r>
-        <w:t xml:space="preserve">(Ref 16,17)</w:t>
+        <w:t xml:space="preserve">(Ref 17,18)</w:t>
       </w:r>
       <w:r>
         <w:t xml:space="preserve">), roughly an order of magnitude above the ≈0.10 wt% present here. The LLM-alloy carries enough carbon to incur the γ-stabilization penalty that, on the calculation, closes the single-phase α field the shape-memory route requires, but not enough to collect the precipitation strengthening that would justify it.</w:t>
@@ -3411,7 +3420,7 @@
         <w:t xml:space="preserve"> </w:t>
       </w:r>
       <w:r>
-        <w:t xml:space="preserve">(Ref 16,17)</w:t>
+        <w:t xml:space="preserve">(Ref 17,18)</w:t>
       </w:r>
       <w:r>
         <w:t xml:space="preserve">. What differs is the purpose those phases are put to. In the shape-memory alloys, coherent B2 within a single-phase α parent raises the resistance to slip so that a reversible transformation can outrun plasticity. In the low-density steels, the same precipitates are strengtheners in an alloy that is never intended to transform: the design objective is specific strength and ductility in a duplex or γ-majority structure, nickel is added specifically to form NiAl-type B2 and to hold it stable above the recrystallization temperature, and the ordering of α to B2 is a liability to be managed for its embrittling effect rather than a mechanism to be exploited</w:t>
@@ -3420,7 +3429,7 @@
         <w:t xml:space="preserve"> </w:t>
       </w:r>
       <w:r>
-        <w:t xml:space="preserve">(Ref 16)</w:t>
+        <w:t xml:space="preserve">(Ref 17)</w:t>
       </w:r>
       <w:r>
         <w:t xml:space="preserve">. Judged against that second family, the LLM-alloy is neither anomalous nor a failure. It is a γ-majority duplex Fe-Mn-Al-Ni-C alloy that orders and deforms by slip, which is what alloys of that chemistry do. The failure lies in the expectation that was attached to it, and the practical lesson is that a composition can sit in two literatures at once while satisfying the design intent of only one.</w:t>
@@ -3519,7 +3528,7 @@
         <w:t xml:space="preserve"> </w:t>
       </w:r>
       <w:r>
-        <w:t xml:space="preserve">(Ref 16)</w:t>
+        <w:t xml:space="preserve">(Ref 17)</w:t>
       </w:r>
       <w:r>
         <w:t xml:space="preserve">, and, with the protocol qualification stated above, the 1000–1200 °C conditions of</w:t>
@@ -3620,6 +3629,112 @@
         <w:pStyle w:val="BodyText"/>
       </w:pPr>
       <w:r>
+        <w:t xml:space="preserve">The workflow examined here sits at one end of a range of AI-assisted alloy-design approaches. Domain-trained language models learn composition–property relationships from explicit datasets and report quantitative test-set errors, as AlloyBERT does for elastic modulus and yield strength</w:t>
+      </w:r>
+      <w:r>
+        <w:t xml:space="preserve"> </w:t>
+      </w:r>
+      <w:r>
+        <w:t xml:space="preserve">(Ref 41)</w:t>
+      </w:r>
+      <w:r>
+        <w:t xml:space="preserve"> </w:t>
+      </w:r>
+      <w:r>
+        <w:t xml:space="preserve">and as AlloyGPT, trained on CALPHAD-generated records of Al-based alloys for additive manufacturing, does for forward prediction and inverse design</w:t>
+      </w:r>
+      <w:r>
+        <w:t xml:space="preserve"> </w:t>
+      </w:r>
+      <w:r>
+        <w:t xml:space="preserve">(Ref 42)</w:t>
+      </w:r>
+      <w:r>
+        <w:t xml:space="preserve">; neither reports new experiments. LLM agents have also been given physics tools: in AtomAgents the agents call atomistic simulations while designing alloys</w:t>
+      </w:r>
+      <w:r>
+        <w:t xml:space="preserve"> </w:t>
+      </w:r>
+      <w:r>
+        <w:t xml:space="preserve">(Ref 43)</w:t>
+      </w:r>
+      <w:r>
+        <w:t xml:space="preserve">, and a multi-agent system evaluates proposed additive-manufacturing alloys with thermophysical properties calculated in Thermo-Calc</w:t>
+      </w:r>
+      <w:r>
+        <w:t xml:space="preserve"> </w:t>
+      </w:r>
+      <w:r>
+        <w:t xml:space="preserve">(Ref 44)</w:t>
+      </w:r>
+      <w:r>
+        <w:t xml:space="preserve">. Adaptive and active-learning loops close on experiment: Xue</w:t>
+      </w:r>
+      <w:r>
+        <w:t xml:space="preserve"> </w:t>
+      </w:r>
+      <w:r>
+        <w:rPr>
+          <w:i/>
+          <w:iCs/>
+        </w:rPr>
+        <w:t xml:space="preserve">et al.</w:t>
+      </w:r>
+      <w:r>
+        <w:t xml:space="preserve"> </w:t>
+      </w:r>
+      <w:r>
+        <w:t xml:space="preserve">synthesized 36 predicted NiTi-based compositions over nine feedback loops in a search for low thermal hysteresis</w:t>
+      </w:r>
+      <w:r>
+        <w:t xml:space="preserve"> </w:t>
+      </w:r>
+      <w:r>
+        <w:t xml:space="preserve">(Ref 45)</w:t>
+      </w:r>
+      <w:r>
+        <w:t xml:space="preserve">, and Rao</w:t>
+      </w:r>
+      <w:r>
+        <w:t xml:space="preserve"> </w:t>
+      </w:r>
+      <w:r>
+        <w:rPr>
+          <w:i/>
+          <w:iCs/>
+        </w:rPr>
+        <w:t xml:space="preserve">et al.</w:t>
+      </w:r>
+      <w:r>
+        <w:t xml:space="preserve"> </w:t>
+      </w:r>
+      <w:r>
+        <w:t xml:space="preserve">combined machine learning, density-functional theory, thermodynamic calculations and 17 newly made alloys to identify high-entropy Invar alloys</w:t>
+      </w:r>
+      <w:r>
+        <w:t xml:space="preserve"> </w:t>
+      </w:r>
+      <w:r>
+        <w:t xml:space="preserve">(Ref 46)</w:t>
+      </w:r>
+      <w:r>
+        <w:t xml:space="preserve">; the AIMS framework of Sec. 1 selected a NiTiCu shape memory alloy together with its processing and confirmed it experimentally</w:t>
+      </w:r>
+      <w:r>
+        <w:t xml:space="preserve"> </w:t>
+      </w:r>
+      <w:r>
+        <w:t xml:space="preserve">(Ref 4)</w:t>
+      </w:r>
+      <w:r>
+        <w:t xml:space="preserve">. In the agent and loop workflows, a calculation or an experiment stands between a proposed composition and the decision to pursue it. The single-shot, tool-free workflow tested here had no such step: the equilibrium check that its own report recommended was not run before melting.</w:t>
+      </w:r>
+    </w:p>
+    <w:p>
+      <w:pPr>
+        <w:pStyle w:val="BodyText"/>
+      </w:pPr>
+      <w:r>
         <w:t xml:space="preserve">The scope of what a single experiment can support should be stated plainly. One composition, drawn from one agent’s proposal in one session and processed by one route, is a case study of that composition: it is not an experimental test of Hypothesis A2 as a whole, whose range the melt leaves in manganese and aluminum (Sec. 2.1), and still less an evaluation of AI-assisted alloy design as a practice. Nothing here establishes a failure rate, and a different prompt, a different agent, or a different processing window might well have produced a different outcome; the experimental claims of this paper are bounded accordingly. A second session, given the processing ceiling and asked to screen its own candidates against it, was not run. It would answer a different question from the one this paper asks: a candidate that passes an equilibrium screen has met a necessary condition, not shown that it transforms — the D0₃ that formed here is not an equilibrium prediction either (Sec. 4.1) — so that question would be answered only once such a candidate is melted and tested, which is a further study. Three specific tests remain open, and are named here rather than left implicit. A solution-and-aging window optimized for this composition, rather than inherited from the benchmark, would establish whether any accessible treatment can produce a transforming state — the route used here was biased in the LLM-alloy’s favor (Sec. 4.1) but was not optimized for it. An in-situ or loading-stage diffraction measurement would observe the material under load instead of after unloading, closing the one gap that ex-situ patterns cannot (Sec. 3.3). And the carbon-free heat of Sec. 4.2 remains the direct experimental form of the control that was performed here in silico. None of the three would change the calculated absence of a single-phase α field below the alloy’s melting point, which is a property of the composition rather than of the treatment; but each bounds a different part of the claim, and the paper does not assert what they would show. A fourth test bears on the interpretation of Sec. 4.1 rather than on the calculation: differential scanning calorimetry of the strand-annealed wire, with the benchmark as the control, would establish whether a transformation event occurs on heating or on cooling within the range scanned, which is the point on which the two readings of Sec. 4.1 differ; it would not by itself assign an event to α → γ or quantify the γ formed. It has not been performed. Likewise, the loading–unloading–heating protocol of</w:t>
       </w:r>
       <w:r>
@@ -3666,7 +3781,7 @@
         <w:t xml:space="preserve"> </w:t>
       </w:r>
       <w:r>
-        <w:t xml:space="preserve">(Ref 27)</w:t>
+        <w:t xml:space="preserve">(Ref 28)</w:t>
       </w:r>
       <w:r>
         <w:t xml:space="preserve">, and the report’s own recommendation shows the agent treated it as one. The finding is that an LLM-assisted workflow omitted that established step, and that the step would have flagged this composition before melting, from the nominal composition and the processing ceiling alone (Sec. 3.4).</w:t>
@@ -4008,7 +4123,7 @@
       </w:r>
     </w:p>
     <w:bookmarkEnd w:id="31"/>
-    <w:bookmarkStart w:id="108" w:name="references"/>
+    <w:bookmarkStart w:id="122" w:name="references"/>
     <w:p>
       <w:pPr>
         <w:pStyle w:val="Heading1"/>
@@ -4017,7 +4132,7 @@
         <w:t xml:space="preserve">References</w:t>
       </w:r>
     </w:p>
-    <w:bookmarkStart w:id="107" w:name="refs"/>
+    <w:bookmarkStart w:id="121" w:name="refs"/>
     <w:bookmarkStart w:id="33" w:name="ref-merchant2023gnome"/>
     <w:p>
       <w:pPr>
@@ -4796,7 +4911,7 @@
       </w:hyperlink>
     </w:p>
     <w:bookmarkEnd w:id="59"/>
-    <w:bookmarkStart w:id="61" w:name="ref-omori2017martensitic"/>
+    <w:bookmarkStart w:id="61" w:name="ref-cai2026smst"/>
     <w:p>
       <w:pPr>
         <w:pStyle w:val="Bibliography"/>
@@ -4811,7 +4926,25 @@
         <w:t xml:space="preserve">	</w:t>
       </w:r>
       <w:r>
-        <w:t xml:space="preserve">T. Omori and R. Kainuma, Martensitic Transformation and Superelasticity in Fe-Mn-Al-Based Shape Memory Alloys,</w:t>
+        <w:t xml:space="preserve">F. Cai and S. Cai,</w:t>
+      </w:r>
+      <w:r>
+        <w:t xml:space="preserve"> </w:t>
+      </w:r>
+      <w:r>
+        <w:t xml:space="preserve">AI</w:t>
+      </w:r>
+      <w:r>
+        <w:t xml:space="preserve">-Driven Exploration of Cost-Effective</w:t>
+      </w:r>
+      <w:r>
+        <w:t xml:space="preserve"> </w:t>
+      </w:r>
+      <w:r>
+        <w:t xml:space="preserve">Fe</w:t>
+      </w:r>
+      <w:r>
+        <w:t xml:space="preserve">-Based Shape Memory Alloys: Bridging the Gap Between Prediction and Processability,</w:t>
       </w:r>
       <w:r>
         <w:t xml:space="preserve"> </w:t>
@@ -4821,6 +4954,49 @@
           <w:i/>
           <w:iCs/>
         </w:rPr>
+        <w:t xml:space="preserve">SMST 2026: Extended abstracts from the international conference on shape memory and superelastic technologies</w:t>
+      </w:r>
+      <w:r>
+        <w:t xml:space="preserve">, ASM International, 2026, p 11–13.</w:t>
+      </w:r>
+      <w:r>
+        <w:t xml:space="preserve"> </w:t>
+      </w:r>
+      <w:hyperlink r:id="rId60">
+        <w:r>
+          <w:rPr>
+            <w:rStyle w:val="Hyperlink"/>
+          </w:rPr>
+          <w:t xml:space="preserve">https://doi.org/10.31399/asm.cp.smst2026p0011</w:t>
+        </w:r>
+      </w:hyperlink>
+    </w:p>
+    <w:bookmarkEnd w:id="61"/>
+    <w:bookmarkStart w:id="63" w:name="ref-omori2017martensitic"/>
+    <w:p>
+      <w:pPr>
+        <w:pStyle w:val="Bibliography"/>
+      </w:pPr>
+      <w:r>
+        <w:t xml:space="preserve">16.</w:t>
+      </w:r>
+      <w:r>
+        <w:t xml:space="preserve"> </w:t>
+      </w:r>
+      <w:r>
+        <w:t xml:space="preserve">	</w:t>
+      </w:r>
+      <w:r>
+        <w:t xml:space="preserve">T. Omori and R. Kainuma, Martensitic Transformation and Superelasticity in Fe-Mn-Al-Based Shape Memory Alloys,</w:t>
+      </w:r>
+      <w:r>
+        <w:t xml:space="preserve"> </w:t>
+      </w:r>
+      <w:r>
+        <w:rPr>
+          <w:i/>
+          <w:iCs/>
+        </w:rPr>
         <w:t xml:space="preserve">Shape Mem. Superelasticity</w:t>
       </w:r>
       <w:r>
@@ -4842,7 +5018,7 @@
       <w:r>
         <w:t xml:space="preserve"> </w:t>
       </w:r>
-      <w:hyperlink r:id="rId60">
+      <w:hyperlink r:id="rId62">
         <w:r>
           <w:rPr>
             <w:rStyle w:val="Hyperlink"/>
@@ -4851,14 +5027,14 @@
         </w:r>
       </w:hyperlink>
     </w:p>
-    <w:bookmarkEnd w:id="61"/>
-    <w:bookmarkStart w:id="63" w:name="ref-rahnama2017acta"/>
+    <w:bookmarkEnd w:id="63"/>
+    <w:bookmarkStart w:id="65" w:name="ref-rahnama2017acta"/>
     <w:p>
       <w:pPr>
         <w:pStyle w:val="Bibliography"/>
       </w:pPr>
       <w:r>
-        <w:t xml:space="preserve">16.</w:t>
+        <w:t xml:space="preserve">17.</w:t>
       </w:r>
       <w:r>
         <w:t xml:space="preserve"> </w:t>
@@ -4910,7 +5086,7 @@
       <w:r>
         <w:t xml:space="preserve"> </w:t>
       </w:r>
-      <w:hyperlink r:id="rId62">
+      <w:hyperlink r:id="rId64">
         <w:r>
           <w:rPr>
             <w:rStyle w:val="Hyperlink"/>
@@ -4919,14 +5095,14 @@
         </w:r>
       </w:hyperlink>
     </w:p>
-    <w:bookmarkEnd w:id="63"/>
-    <w:bookmarkStart w:id="65" w:name="ref-saha2022jom"/>
+    <w:bookmarkEnd w:id="65"/>
+    <w:bookmarkStart w:id="67" w:name="ref-saha2022jom"/>
     <w:p>
       <w:pPr>
         <w:pStyle w:val="Bibliography"/>
       </w:pPr>
       <w:r>
-        <w:t xml:space="preserve">17.</w:t>
+        <w:t xml:space="preserve">18.</w:t>
       </w:r>
       <w:r>
         <w:t xml:space="preserve"> </w:t>
@@ -5020,7 +5196,7 @@
       <w:r>
         <w:t xml:space="preserve"> </w:t>
       </w:r>
-      <w:hyperlink r:id="rId64">
+      <w:hyperlink r:id="rId66">
         <w:r>
           <w:rPr>
             <w:rStyle w:val="Hyperlink"/>
@@ -5029,14 +5205,14 @@
         </w:r>
       </w:hyperlink>
     </w:p>
-    <w:bookmarkEnd w:id="65"/>
-    <w:bookmarkStart w:id="67" w:name="ref-omori2016agg"/>
+    <w:bookmarkEnd w:id="67"/>
+    <w:bookmarkStart w:id="69" w:name="ref-omori2016agg"/>
     <w:p>
       <w:pPr>
         <w:pStyle w:val="Bibliography"/>
       </w:pPr>
       <w:r>
-        <w:t xml:space="preserve">18.</w:t>
+        <w:t xml:space="preserve">19.</w:t>
       </w:r>
       <w:r>
         <w:t xml:space="preserve"> </w:t>
@@ -5088,7 +5264,7 @@
       <w:r>
         <w:t xml:space="preserve"> </w:t>
       </w:r>
-      <w:hyperlink r:id="rId66">
+      <w:hyperlink r:id="rId68">
         <w:r>
           <w:rPr>
             <w:rStyle w:val="Hyperlink"/>
@@ -5097,14 +5273,14 @@
         </w:r>
       </w:hyperlink>
     </w:p>
-    <w:bookmarkEnd w:id="67"/>
-    <w:bookmarkStart w:id="69" w:name="ref-viebranz2024agg"/>
+    <w:bookmarkEnd w:id="69"/>
+    <w:bookmarkStart w:id="71" w:name="ref-viebranz2024agg"/>
     <w:p>
       <w:pPr>
         <w:pStyle w:val="Bibliography"/>
       </w:pPr>
       <w:r>
-        <w:t xml:space="preserve">19.</w:t>
+        <w:t xml:space="preserve">20.</w:t>
       </w:r>
       <w:r>
         <w:t xml:space="preserve"> </w:t>
@@ -5156,7 +5332,7 @@
       <w:r>
         <w:t xml:space="preserve"> </w:t>
       </w:r>
-      <w:hyperlink r:id="rId68">
+      <w:hyperlink r:id="rId70">
         <w:r>
           <w:rPr>
             <w:rStyle w:val="Hyperlink"/>
@@ -5165,14 +5341,14 @@
         </w:r>
       </w:hyperlink>
     </w:p>
-    <w:bookmarkEnd w:id="69"/>
-    <w:bookmarkStart w:id="71" w:name="ref-cai2024niticu"/>
+    <w:bookmarkEnd w:id="71"/>
+    <w:bookmarkStart w:id="73" w:name="ref-cai2024niticu"/>
     <w:p>
       <w:pPr>
         <w:pStyle w:val="Bibliography"/>
       </w:pPr>
       <w:r>
-        <w:t xml:space="preserve">20.</w:t>
+        <w:t xml:space="preserve">21.</w:t>
       </w:r>
       <w:r>
         <w:t xml:space="preserve"> </w:t>
@@ -5236,7 +5412,7 @@
       <w:r>
         <w:t xml:space="preserve"> </w:t>
       </w:r>
-      <w:hyperlink r:id="rId70">
+      <w:hyperlink r:id="rId72">
         <w:r>
           <w:rPr>
             <w:rStyle w:val="Hyperlink"/>
@@ -5245,14 +5421,14 @@
         </w:r>
       </w:hyperlink>
     </w:p>
-    <w:bookmarkEnd w:id="71"/>
-    <w:bookmarkStart w:id="73" w:name="ref-shaw1995niti"/>
+    <w:bookmarkEnd w:id="73"/>
+    <w:bookmarkStart w:id="75" w:name="ref-shaw1995niti"/>
     <w:p>
       <w:pPr>
         <w:pStyle w:val="Bibliography"/>
       </w:pPr>
       <w:r>
-        <w:t xml:space="preserve">21.</w:t>
+        <w:t xml:space="preserve">22.</w:t>
       </w:r>
       <w:r>
         <w:t xml:space="preserve"> </w:t>
@@ -5301,7 +5477,7 @@
       <w:r>
         <w:t xml:space="preserve"> </w:t>
       </w:r>
-      <w:hyperlink r:id="rId72">
+      <w:hyperlink r:id="rId74">
         <w:r>
           <w:rPr>
             <w:rStyle w:val="Hyperlink"/>
@@ -5310,14 +5486,14 @@
         </w:r>
       </w:hyperlink>
     </w:p>
-    <w:bookmarkEnd w:id="73"/>
-    <w:bookmarkStart w:id="75" w:name="ref-tai2024ssrf"/>
+    <w:bookmarkEnd w:id="75"/>
+    <w:bookmarkStart w:id="77" w:name="ref-tai2024ssrf"/>
     <w:p>
       <w:pPr>
         <w:pStyle w:val="Bibliography"/>
       </w:pPr>
       <w:r>
-        <w:t xml:space="preserve">22.</w:t>
+        <w:t xml:space="preserve">23.</w:t>
       </w:r>
       <w:r>
         <w:t xml:space="preserve"> </w:t>
@@ -5378,7 +5554,7 @@
       <w:r>
         <w:t xml:space="preserve"> </w:t>
       </w:r>
-      <w:hyperlink r:id="rId74">
+      <w:hyperlink r:id="rId76">
         <w:r>
           <w:rPr>
             <w:rStyle w:val="Hyperlink"/>
@@ -5387,14 +5563,14 @@
         </w:r>
       </w:hyperlink>
     </w:p>
-    <w:bookmarkEnd w:id="75"/>
-    <w:bookmarkStart w:id="77" w:name="ref-yang2024ssrf"/>
+    <w:bookmarkEnd w:id="77"/>
+    <w:bookmarkStart w:id="79" w:name="ref-yang2024ssrf"/>
     <w:p>
       <w:pPr>
         <w:pStyle w:val="Bibliography"/>
       </w:pPr>
       <w:r>
-        <w:t xml:space="preserve">23.</w:t>
+        <w:t xml:space="preserve">24.</w:t>
       </w:r>
       <w:r>
         <w:t xml:space="preserve"> </w:t>
@@ -5455,7 +5631,7 @@
       <w:r>
         <w:t xml:space="preserve"> </w:t>
       </w:r>
-      <w:hyperlink r:id="rId76">
+      <w:hyperlink r:id="rId78">
         <w:r>
           <w:rPr>
             <w:rStyle w:val="Hyperlink"/>
@@ -5464,14 +5640,14 @@
         </w:r>
       </w:hyperlink>
     </w:p>
-    <w:bookmarkEnd w:id="77"/>
-    <w:bookmarkStart w:id="78" w:name="ref-hammersley1998fit2d"/>
+    <w:bookmarkEnd w:id="79"/>
+    <w:bookmarkStart w:id="80" w:name="ref-hammersley1998fit2d"/>
     <w:p>
       <w:pPr>
         <w:pStyle w:val="Bibliography"/>
       </w:pPr>
       <w:r>
-        <w:t xml:space="preserve">24.</w:t>
+        <w:t xml:space="preserve">25.</w:t>
       </w:r>
       <w:r>
         <w:t xml:space="preserve"> </w:t>
@@ -5504,14 +5680,14 @@
         <w:t xml:space="preserve">ESRF98HA01T, ESRF, Grenoble, 1998.</w:t>
       </w:r>
     </w:p>
-    <w:bookmarkEnd w:id="78"/>
-    <w:bookmarkStart w:id="80" w:name="ref-rietveld1969"/>
+    <w:bookmarkEnd w:id="80"/>
+    <w:bookmarkStart w:id="82" w:name="ref-rietveld1969"/>
     <w:p>
       <w:pPr>
         <w:pStyle w:val="Bibliography"/>
       </w:pPr>
       <w:r>
-        <w:t xml:space="preserve">25.</w:t>
+        <w:t xml:space="preserve">26.</w:t>
       </w:r>
       <w:r>
         <w:t xml:space="preserve"> </w:t>
@@ -5551,7 +5727,7 @@
       <w:r>
         <w:t xml:space="preserve"> </w:t>
       </w:r>
-      <w:hyperlink r:id="rId79">
+      <w:hyperlink r:id="rId81">
         <w:r>
           <w:rPr>
             <w:rStyle w:val="Hyperlink"/>
@@ -5560,14 +5736,14 @@
         </w:r>
       </w:hyperlink>
     </w:p>
-    <w:bookmarkEnd w:id="80"/>
-    <w:bookmarkStart w:id="82" w:name="ref-lutterotti1997maud"/>
+    <w:bookmarkEnd w:id="82"/>
+    <w:bookmarkStart w:id="84" w:name="ref-lutterotti1997maud"/>
     <w:p>
       <w:pPr>
         <w:pStyle w:val="Bibliography"/>
       </w:pPr>
       <w:r>
-        <w:t xml:space="preserve">26.</w:t>
+        <w:t xml:space="preserve">27.</w:t>
       </w:r>
       <w:r>
         <w:t xml:space="preserve"> </w:t>
@@ -5607,7 +5783,7 @@
       <w:r>
         <w:t xml:space="preserve"> </w:t>
       </w:r>
-      <w:hyperlink r:id="rId81">
+      <w:hyperlink r:id="rId83">
         <w:r>
           <w:rPr>
             <w:rStyle w:val="Hyperlink"/>
@@ -5616,14 +5792,14 @@
         </w:r>
       </w:hyperlink>
     </w:p>
-    <w:bookmarkEnd w:id="82"/>
-    <w:bookmarkStart w:id="84" w:name="ref-lukas2007calphad"/>
+    <w:bookmarkEnd w:id="84"/>
+    <w:bookmarkStart w:id="86" w:name="ref-lukas2007calphad"/>
     <w:p>
       <w:pPr>
         <w:pStyle w:val="Bibliography"/>
       </w:pPr>
       <w:r>
-        <w:t xml:space="preserve">27.</w:t>
+        <w:t xml:space="preserve">28.</w:t>
       </w:r>
       <w:r>
         <w:t xml:space="preserve"> </w:t>
@@ -5637,7 +5813,7 @@
       <w:r>
         <w:t xml:space="preserve"> </w:t>
       </w:r>
-      <w:hyperlink r:id="rId83">
+      <w:hyperlink r:id="rId85">
         <w:r>
           <w:rPr>
             <w:rStyle w:val="Hyperlink"/>
@@ -5646,14 +5822,14 @@
         </w:r>
       </w:hyperlink>
     </w:p>
-    <w:bookmarkEnd w:id="84"/>
-    <w:bookmarkStart w:id="86" w:name="ref-otis2017pycalphad"/>
+    <w:bookmarkEnd w:id="86"/>
+    <w:bookmarkStart w:id="88" w:name="ref-otis2017pycalphad"/>
     <w:p>
       <w:pPr>
         <w:pStyle w:val="Bibliography"/>
       </w:pPr>
       <w:r>
-        <w:t xml:space="preserve">28.</w:t>
+        <w:t xml:space="preserve">29.</w:t>
       </w:r>
       <w:r>
         <w:t xml:space="preserve"> </w:t>
@@ -5720,7 +5896,7 @@
       <w:r>
         <w:t xml:space="preserve"> </w:t>
       </w:r>
-      <w:hyperlink r:id="rId85">
+      <w:hyperlink r:id="rId87">
         <w:r>
           <w:rPr>
             <w:rStyle w:val="Hyperlink"/>
@@ -5729,14 +5905,14 @@
         </w:r>
       </w:hyperlink>
     </w:p>
-    <w:bookmarkEnd w:id="86"/>
-    <w:bookmarkStart w:id="88" w:name="ref-hallstedt2017mpea"/>
+    <w:bookmarkEnd w:id="88"/>
+    <w:bookmarkStart w:id="90" w:name="ref-hallstedt2017mpea"/>
     <w:p>
       <w:pPr>
         <w:pStyle w:val="Bibliography"/>
       </w:pPr>
       <w:r>
-        <w:t xml:space="preserve">29.</w:t>
+        <w:t xml:space="preserve">30.</w:t>
       </w:r>
       <w:r>
         <w:t xml:space="preserve"> </w:t>
@@ -5756,7 +5932,7 @@
       <w:r>
         <w:t xml:space="preserve"> </w:t>
       </w:r>
-      <w:hyperlink r:id="rId87">
+      <w:hyperlink r:id="rId89">
         <w:r>
           <w:rPr>
             <w:rStyle w:val="Hyperlink"/>
@@ -5768,14 +5944,14 @@
         <w:t xml:space="preserve">. Accessed 28 September 2026</w:t>
       </w:r>
     </w:p>
-    <w:bookmarkEnd w:id="88"/>
-    <w:bookmarkStart w:id="90" w:name="ref-hallstedt2023mpea"/>
+    <w:bookmarkEnd w:id="90"/>
+    <w:bookmarkStart w:id="92" w:name="ref-hallstedt2023mpea"/>
     <w:p>
       <w:pPr>
         <w:pStyle w:val="Bibliography"/>
       </w:pPr>
       <w:r>
-        <w:t xml:space="preserve">30.</w:t>
+        <w:t xml:space="preserve">31.</w:t>
       </w:r>
       <w:r>
         <w:t xml:space="preserve"> </w:t>
@@ -5824,7 +6000,7 @@
       <w:r>
         <w:t xml:space="preserve"> </w:t>
       </w:r>
-      <w:hyperlink r:id="rId89">
+      <w:hyperlink r:id="rId91">
         <w:r>
           <w:rPr>
             <w:rStyle w:val="Hyperlink"/>
@@ -5833,14 +6009,14 @@
         </w:r>
       </w:hyperlink>
     </w:p>
-    <w:bookmarkEnd w:id="90"/>
-    <w:bookmarkStart w:id="92" w:name="ref-prechimn04"/>
+    <w:bookmarkEnd w:id="92"/>
+    <w:bookmarkStart w:id="94" w:name="ref-prechimn04"/>
     <w:p>
       <w:pPr>
         <w:pStyle w:val="Bibliography"/>
       </w:pPr>
       <w:r>
-        <w:t xml:space="preserve">31.</w:t>
+        <w:t xml:space="preserve">32.</w:t>
       </w:r>
       <w:r>
         <w:t xml:space="preserve"> </w:t>
@@ -5907,7 +6083,7 @@
       <w:r>
         <w:t xml:space="preserve"> </w:t>
       </w:r>
-      <w:hyperlink r:id="rId91">
+      <w:hyperlink r:id="rId93">
         <w:r>
           <w:rPr>
             <w:rStyle w:val="Hyperlink"/>
@@ -5916,14 +6092,14 @@
         </w:r>
       </w:hyperlink>
     </w:p>
-    <w:bookmarkEnd w:id="92"/>
-    <w:bookmarkStart w:id="94" w:name="ref-mcfe"/>
+    <w:bookmarkEnd w:id="94"/>
+    <w:bookmarkStart w:id="96" w:name="ref-mcfe"/>
     <w:p>
       <w:pPr>
         <w:pStyle w:val="Bibliography"/>
       </w:pPr>
       <w:r>
-        <w:t xml:space="preserve">32.</w:t>
+        <w:t xml:space="preserve">33.</w:t>
       </w:r>
       <w:r>
         <w:t xml:space="preserve"> </w:t>
@@ -5958,7 +6134,7 @@
       <w:r>
         <w:t xml:space="preserve"> </w:t>
       </w:r>
-      <w:hyperlink r:id="rId93">
+      <w:hyperlink r:id="rId95">
         <w:r>
           <w:rPr>
             <w:rStyle w:val="Hyperlink"/>
@@ -5970,14 +6146,14 @@
         <w:t xml:space="preserve">. Accessed 28 September 2026</w:t>
       </w:r>
     </w:p>
-    <w:bookmarkEnd w:id="94"/>
-    <w:bookmarkStart w:id="96" w:name="ref-tanaka2010science"/>
+    <w:bookmarkEnd w:id="96"/>
+    <w:bookmarkStart w:id="98" w:name="ref-tanaka2010science"/>
     <w:p>
       <w:pPr>
         <w:pStyle w:val="Bibliography"/>
       </w:pPr>
       <w:r>
-        <w:t xml:space="preserve">33.</w:t>
+        <w:t xml:space="preserve">34.</w:t>
       </w:r>
       <w:r>
         <w:t xml:space="preserve"> </w:t>
@@ -6017,7 +6193,7 @@
       <w:r>
         <w:t xml:space="preserve"> </w:t>
       </w:r>
-      <w:hyperlink r:id="rId95">
+      <w:hyperlink r:id="rId97">
         <w:r>
           <w:rPr>
             <w:rStyle w:val="Hyperlink"/>
@@ -6026,14 +6202,14 @@
         </w:r>
       </w:hyperlink>
     </w:p>
-    <w:bookmarkEnd w:id="96"/>
-    <w:bookmarkStart w:id="98" w:name="ref-vollmer2019natcomm"/>
+    <w:bookmarkEnd w:id="98"/>
+    <w:bookmarkStart w:id="100" w:name="ref-vollmer2019natcomm"/>
     <w:p>
       <w:pPr>
         <w:pStyle w:val="Bibliography"/>
       </w:pPr>
       <w:r>
-        <w:t xml:space="preserve">34.</w:t>
+        <w:t xml:space="preserve">35.</w:t>
       </w:r>
       <w:r>
         <w:t xml:space="preserve"> </w:t>
@@ -6082,7 +6258,7 @@
       <w:r>
         <w:t xml:space="preserve"> </w:t>
       </w:r>
-      <w:hyperlink r:id="rId97">
+      <w:hyperlink r:id="rId99">
         <w:r>
           <w:rPr>
             <w:rStyle w:val="Hyperlink"/>
@@ -6091,14 +6267,14 @@
         </w:r>
       </w:hyperlink>
     </w:p>
-    <w:bookmarkEnd w:id="98"/>
-    <w:bookmarkStart w:id="99" w:name="ref-engler2010texture"/>
+    <w:bookmarkEnd w:id="100"/>
+    <w:bookmarkStart w:id="101" w:name="ref-engler2010texture"/>
     <w:p>
       <w:pPr>
         <w:pStyle w:val="Bibliography"/>
       </w:pPr>
       <w:r>
-        <w:t xml:space="preserve">35.</w:t>
+        <w:t xml:space="preserve">36.</w:t>
       </w:r>
       <w:r>
         <w:t xml:space="preserve"> </w:t>
@@ -6110,14 +6286,14 @@
         <w:t xml:space="preserve">O. Engler and V. Randle, Introduction to Texture Analysis: Macrotexture, Microtexture, and Orientation Mapping, 2nd ed., CRC Press, 2010.</w:t>
       </w:r>
     </w:p>
-    <w:bookmarkEnd w:id="99"/>
-    <w:bookmarkStart w:id="101" w:name="ref-omori2012apl"/>
+    <w:bookmarkEnd w:id="101"/>
+    <w:bookmarkStart w:id="103" w:name="ref-omori2012apl"/>
     <w:p>
       <w:pPr>
         <w:pStyle w:val="Bibliography"/>
       </w:pPr>
       <w:r>
-        <w:t xml:space="preserve">36.</w:t>
+        <w:t xml:space="preserve">37.</w:t>
       </w:r>
       <w:r>
         <w:t xml:space="preserve"> </w:t>
@@ -6178,7 +6354,7 @@
       <w:r>
         <w:t xml:space="preserve"> </w:t>
       </w:r>
-      <w:hyperlink r:id="rId100">
+      <w:hyperlink r:id="rId102">
         <w:r>
           <w:rPr>
             <w:rStyle w:val="Hyperlink"/>
@@ -6187,14 +6363,14 @@
         </w:r>
       </w:hyperlink>
     </w:p>
-    <w:bookmarkEnd w:id="101"/>
-    <w:bookmarkStart w:id="102" w:name="ref-bhadeshia2010steels"/>
+    <w:bookmarkEnd w:id="103"/>
+    <w:bookmarkStart w:id="104" w:name="ref-bhadeshia2010steels"/>
     <w:p>
       <w:pPr>
         <w:pStyle w:val="Bibliography"/>
       </w:pPr>
       <w:r>
-        <w:t xml:space="preserve">37.</w:t>
+        <w:t xml:space="preserve">38.</w:t>
       </w:r>
       <w:r>
         <w:t xml:space="preserve"> </w:t>
@@ -6206,14 +6382,14 @@
         <w:t xml:space="preserve">H.K.D.H. Bhadeshia and R.W.K. Honeycombe, Steels: Microstructure and Properties, 4th ed., Elsevier Butterworth-Heinemann, 2017.</w:t>
       </w:r>
     </w:p>
-    <w:bookmarkEnd w:id="102"/>
-    <w:bookmarkStart w:id="104" w:name="ref-laroca2017jalcom"/>
+    <w:bookmarkEnd w:id="104"/>
+    <w:bookmarkStart w:id="106" w:name="ref-laroca2017jalcom"/>
     <w:p>
       <w:pPr>
         <w:pStyle w:val="Bibliography"/>
       </w:pPr>
       <w:r>
-        <w:t xml:space="preserve">38.</w:t>
+        <w:t xml:space="preserve">39.</w:t>
       </w:r>
       <w:r>
         <w:t xml:space="preserve"> </w:t>
@@ -6265,7 +6441,7 @@
       <w:r>
         <w:t xml:space="preserve"> </w:t>
       </w:r>
-      <w:hyperlink r:id="rId103">
+      <w:hyperlink r:id="rId105">
         <w:r>
           <w:rPr>
             <w:rStyle w:val="Hyperlink"/>
@@ -6274,14 +6450,14 @@
         </w:r>
       </w:hyperlink>
     </w:p>
-    <w:bookmarkEnd w:id="104"/>
-    <w:bookmarkStart w:id="106" w:name="ref-heo2012mmta"/>
+    <w:bookmarkEnd w:id="106"/>
+    <w:bookmarkStart w:id="108" w:name="ref-heo2012mmta"/>
     <w:p>
       <w:pPr>
         <w:pStyle w:val="Bibliography"/>
       </w:pPr>
       <w:r>
-        <w:t xml:space="preserve">39.</w:t>
+        <w:t xml:space="preserve">40.</w:t>
       </w:r>
       <w:r>
         <w:t xml:space="preserve"> </w:t>
@@ -6333,7 +6509,7 @@
       <w:r>
         <w:t xml:space="preserve"> </w:t>
       </w:r>
-      <w:hyperlink r:id="rId105">
+      <w:hyperlink r:id="rId107">
         <w:r>
           <w:rPr>
             <w:rStyle w:val="Hyperlink"/>
@@ -6342,10 +6518,376 @@
         </w:r>
       </w:hyperlink>
     </w:p>
-    <w:bookmarkEnd w:id="106"/>
-    <w:bookmarkEnd w:id="107"/>
     <w:bookmarkEnd w:id="108"/>
-    <w:bookmarkStart w:id="109" w:name="figure-captions"/>
+    <w:bookmarkStart w:id="110" w:name="ref-chaudhari2024alloybert"/>
+    <w:p>
+      <w:pPr>
+        <w:pStyle w:val="Bibliography"/>
+      </w:pPr>
+      <w:r>
+        <w:t xml:space="preserve">41.</w:t>
+      </w:r>
+      <w:r>
+        <w:t xml:space="preserve"> </w:t>
+      </w:r>
+      <w:r>
+        <w:t xml:space="preserve">	</w:t>
+      </w:r>
+      <w:r>
+        <w:t xml:space="preserve">A. Chaudhari, C. Guntuboina, H. Huang, and A. Barati Farimani,</w:t>
+      </w:r>
+      <w:r>
+        <w:t xml:space="preserve"> </w:t>
+      </w:r>
+      <w:r>
+        <w:t xml:space="preserve">AlloyBERT</w:t>
+      </w:r>
+      <w:r>
+        <w:t xml:space="preserve">: Alloy Property Prediction with Large Language Models,</w:t>
+      </w:r>
+      <w:r>
+        <w:t xml:space="preserve"> </w:t>
+      </w:r>
+      <w:r>
+        <w:rPr>
+          <w:i/>
+          <w:iCs/>
+        </w:rPr>
+        <w:t xml:space="preserve">Comput. Mater. Sci.</w:t>
+      </w:r>
+      <w:r>
+        <w:t xml:space="preserve">, 2024,</w:t>
+      </w:r>
+      <w:r>
+        <w:t xml:space="preserve"> </w:t>
+      </w:r>
+      <w:r>
+        <w:rPr>
+          <w:b/>
+          <w:bCs/>
+        </w:rPr>
+        <w:t xml:space="preserve">244</w:t>
+      </w:r>
+      <w:r>
+        <w:t xml:space="preserve">, p 113256.</w:t>
+      </w:r>
+      <w:r>
+        <w:t xml:space="preserve"> </w:t>
+      </w:r>
+      <w:hyperlink r:id="rId109">
+        <w:r>
+          <w:rPr>
+            <w:rStyle w:val="Hyperlink"/>
+          </w:rPr>
+          <w:t xml:space="preserve">https://doi.org/10.1016/j.commatsci.2024.113256</w:t>
+        </w:r>
+      </w:hyperlink>
+    </w:p>
+    <w:bookmarkEnd w:id="110"/>
+    <w:bookmarkStart w:id="112" w:name="ref-ni2025alloygpt"/>
+    <w:p>
+      <w:pPr>
+        <w:pStyle w:val="Bibliography"/>
+      </w:pPr>
+      <w:r>
+        <w:t xml:space="preserve">42.</w:t>
+      </w:r>
+      <w:r>
+        <w:t xml:space="preserve"> </w:t>
+      </w:r>
+      <w:r>
+        <w:t xml:space="preserve">	</w:t>
+      </w:r>
+      <w:r>
+        <w:t xml:space="preserve">B. Ni, B. Glaser, and S.M. Taheri-Mousavi, End-to-End Prediction and Design of Additively Manufacturable Alloys Using a Generative</w:t>
+      </w:r>
+      <w:r>
+        <w:t xml:space="preserve"> </w:t>
+      </w:r>
+      <w:r>
+        <w:t xml:space="preserve">AlloyGPT</w:t>
+      </w:r>
+      <w:r>
+        <w:t xml:space="preserve"> </w:t>
+      </w:r>
+      <w:r>
+        <w:t xml:space="preserve">Model,</w:t>
+      </w:r>
+      <w:r>
+        <w:t xml:space="preserve"> </w:t>
+      </w:r>
+      <w:r>
+        <w:rPr>
+          <w:i/>
+          <w:iCs/>
+        </w:rPr>
+        <w:t xml:space="preserve">npj Comput. Mater.</w:t>
+      </w:r>
+      <w:r>
+        <w:t xml:space="preserve">, 2025,</w:t>
+      </w:r>
+      <w:r>
+        <w:t xml:space="preserve"> </w:t>
+      </w:r>
+      <w:r>
+        <w:rPr>
+          <w:b/>
+          <w:bCs/>
+        </w:rPr>
+        <w:t xml:space="preserve">11</w:t>
+      </w:r>
+      <w:r>
+        <w:t xml:space="preserve">(1), p 294.</w:t>
+      </w:r>
+      <w:r>
+        <w:t xml:space="preserve"> </w:t>
+      </w:r>
+      <w:hyperlink r:id="rId111">
+        <w:r>
+          <w:rPr>
+            <w:rStyle w:val="Hyperlink"/>
+          </w:rPr>
+          <w:t xml:space="preserve">https://doi.org/10.1038/s41524-025-01768-2</w:t>
+        </w:r>
+      </w:hyperlink>
+    </w:p>
+    <w:bookmarkEnd w:id="112"/>
+    <w:bookmarkStart w:id="114" w:name="ref-ghafarollahi2025atomagents"/>
+    <w:p>
+      <w:pPr>
+        <w:pStyle w:val="Bibliography"/>
+      </w:pPr>
+      <w:r>
+        <w:t xml:space="preserve">43.</w:t>
+      </w:r>
+      <w:r>
+        <w:t xml:space="preserve"> </w:t>
+      </w:r>
+      <w:r>
+        <w:t xml:space="preserve">	</w:t>
+      </w:r>
+      <w:r>
+        <w:t xml:space="preserve">A. Ghafarollahi and M.J. Buehler, Automating Alloy Design and Discovery with Physics-Aware Multimodal Multiagent</w:t>
+      </w:r>
+      <w:r>
+        <w:t xml:space="preserve"> </w:t>
+      </w:r>
+      <w:r>
+        <w:t xml:space="preserve">AI</w:t>
+      </w:r>
+      <w:r>
+        <w:t xml:space="preserve">,</w:t>
+      </w:r>
+      <w:r>
+        <w:t xml:space="preserve"> </w:t>
+      </w:r>
+      <w:r>
+        <w:rPr>
+          <w:i/>
+          <w:iCs/>
+        </w:rPr>
+        <w:t xml:space="preserve">Proc. Natl. Acad. Sci. U.S.A.</w:t>
+      </w:r>
+      <w:r>
+        <w:t xml:space="preserve">, 2025,</w:t>
+      </w:r>
+      <w:r>
+        <w:t xml:space="preserve"> </w:t>
+      </w:r>
+      <w:r>
+        <w:rPr>
+          <w:b/>
+          <w:bCs/>
+        </w:rPr>
+        <w:t xml:space="preserve">122</w:t>
+      </w:r>
+      <w:r>
+        <w:t xml:space="preserve">(4), p e2414074122.</w:t>
+      </w:r>
+      <w:r>
+        <w:t xml:space="preserve"> </w:t>
+      </w:r>
+      <w:hyperlink r:id="rId113">
+        <w:r>
+          <w:rPr>
+            <w:rStyle w:val="Hyperlink"/>
+          </w:rPr>
+          <w:t xml:space="preserve">https://doi.org/10.1073/pnas.2414074122</w:t>
+        </w:r>
+      </w:hyperlink>
+    </w:p>
+    <w:bookmarkEnd w:id="114"/>
+    <w:bookmarkStart w:id="116" w:name="ref-pak2026agentic"/>
+    <w:p>
+      <w:pPr>
+        <w:pStyle w:val="Bibliography"/>
+      </w:pPr>
+      <w:r>
+        <w:t xml:space="preserve">44.</w:t>
+      </w:r>
+      <w:r>
+        <w:t xml:space="preserve"> </w:t>
+      </w:r>
+      <w:r>
+        <w:t xml:space="preserve">	</w:t>
+      </w:r>
+      <w:r>
+        <w:t xml:space="preserve">P. Pak, A. Chandrasekhar, and A. Barati Farimani, Agentic Additive Manufacturing Alloy Evaluation,</w:t>
+      </w:r>
+      <w:r>
+        <w:t xml:space="preserve"> </w:t>
+      </w:r>
+      <w:r>
+        <w:rPr>
+          <w:i/>
+          <w:iCs/>
+        </w:rPr>
+        <w:t xml:space="preserve">Addit. Manuf. Lett.</w:t>
+      </w:r>
+      <w:r>
+        <w:t xml:space="preserve">, 2026,</w:t>
+      </w:r>
+      <w:r>
+        <w:t xml:space="preserve"> </w:t>
+      </w:r>
+      <w:r>
+        <w:rPr>
+          <w:b/>
+          <w:bCs/>
+        </w:rPr>
+        <w:t xml:space="preserve">17</w:t>
+      </w:r>
+      <w:r>
+        <w:t xml:space="preserve">, p 100355.</w:t>
+      </w:r>
+      <w:r>
+        <w:t xml:space="preserve"> </w:t>
+      </w:r>
+      <w:hyperlink r:id="rId115">
+        <w:r>
+          <w:rPr>
+            <w:rStyle w:val="Hyperlink"/>
+          </w:rPr>
+          <w:t xml:space="preserve">https://doi.org/10.1016/j.addlet.2026.100355</w:t>
+        </w:r>
+      </w:hyperlink>
+    </w:p>
+    <w:bookmarkEnd w:id="116"/>
+    <w:bookmarkStart w:id="118" w:name="ref-xue2016accelerated"/>
+    <w:p>
+      <w:pPr>
+        <w:pStyle w:val="Bibliography"/>
+      </w:pPr>
+      <w:r>
+        <w:t xml:space="preserve">45.</w:t>
+      </w:r>
+      <w:r>
+        <w:t xml:space="preserve"> </w:t>
+      </w:r>
+      <w:r>
+        <w:t xml:space="preserve">	</w:t>
+      </w:r>
+      <w:r>
+        <w:t xml:space="preserve">D. Xue, P.V. Balachandran, J. Hogden, J. Theiler, D. Xue, and T. Lookman, Accelerated Search for Materials with Targeted Properties by Adaptive Design,</w:t>
+      </w:r>
+      <w:r>
+        <w:t xml:space="preserve"> </w:t>
+      </w:r>
+      <w:r>
+        <w:rPr>
+          <w:i/>
+          <w:iCs/>
+        </w:rPr>
+        <w:t xml:space="preserve">Nat. Commun.</w:t>
+      </w:r>
+      <w:r>
+        <w:t xml:space="preserve">, 2016,</w:t>
+      </w:r>
+      <w:r>
+        <w:t xml:space="preserve"> </w:t>
+      </w:r>
+      <w:r>
+        <w:rPr>
+          <w:b/>
+          <w:bCs/>
+        </w:rPr>
+        <w:t xml:space="preserve">7</w:t>
+      </w:r>
+      <w:r>
+        <w:t xml:space="preserve">, p 11241.</w:t>
+      </w:r>
+      <w:r>
+        <w:t xml:space="preserve"> </w:t>
+      </w:r>
+      <w:hyperlink r:id="rId117">
+        <w:r>
+          <w:rPr>
+            <w:rStyle w:val="Hyperlink"/>
+          </w:rPr>
+          <w:t xml:space="preserve">https://doi.org/10.1038/ncomms11241</w:t>
+        </w:r>
+      </w:hyperlink>
+    </w:p>
+    <w:bookmarkEnd w:id="118"/>
+    <w:bookmarkStart w:id="120" w:name="ref-rao2022machine"/>
+    <w:p>
+      <w:pPr>
+        <w:pStyle w:val="Bibliography"/>
+      </w:pPr>
+      <w:r>
+        <w:t xml:space="preserve">46.</w:t>
+      </w:r>
+      <w:r>
+        <w:t xml:space="preserve"> </w:t>
+      </w:r>
+      <w:r>
+        <w:t xml:space="preserve">	</w:t>
+      </w:r>
+      <w:r>
+        <w:t xml:space="preserve">Z. Rao, P.-Y. Tung, R. Xie, Y. Wei, H. Zhang, A. Ferrari, T.P.C. Klaver, F. Körmann, P.T. Sukumar, A. Kwiatkowski da Silva, Y. Chen, Z. Li, D. Ponge, J. Neugebauer, O. Gutfleisch, S. Bauer, and D. Raabe, Machine Learning–Enabled High-Entropy Alloy Discovery,</w:t>
+      </w:r>
+      <w:r>
+        <w:t xml:space="preserve"> </w:t>
+      </w:r>
+      <w:r>
+        <w:rPr>
+          <w:i/>
+          <w:iCs/>
+        </w:rPr>
+        <w:t xml:space="preserve">Science</w:t>
+      </w:r>
+      <w:r>
+        <w:t xml:space="preserve">, 2022,</w:t>
+      </w:r>
+      <w:r>
+        <w:t xml:space="preserve"> </w:t>
+      </w:r>
+      <w:r>
+        <w:rPr>
+          <w:b/>
+          <w:bCs/>
+        </w:rPr>
+        <w:t xml:space="preserve">378</w:t>
+      </w:r>
+      <w:r>
+        <w:t xml:space="preserve">(6615), p 78–85.</w:t>
+      </w:r>
+      <w:r>
+        <w:t xml:space="preserve"> </w:t>
+      </w:r>
+      <w:hyperlink r:id="rId119">
+        <w:r>
+          <w:rPr>
+            <w:rStyle w:val="Hyperlink"/>
+          </w:rPr>
+          <w:t xml:space="preserve">https://doi.org/10.1126/science.abo4940</w:t>
+        </w:r>
+      </w:hyperlink>
+    </w:p>
+    <w:bookmarkEnd w:id="120"/>
+    <w:bookmarkEnd w:id="121"/>
+    <w:bookmarkEnd w:id="122"/>
+    <w:bookmarkStart w:id="123" w:name="figure-captions"/>
     <w:p>
       <w:pPr>
         <w:pStyle w:val="Heading1"/>
@@ -6534,8 +7076,8 @@
         <w:t xml:space="preserve">Cyclic tensile records of the LLM-alloy in the prolonged-anneal and cyclically heat-treated conditions, plotted from the raw load–extension exports, with stress from the measured diameter and strain from crosshead extension over the gauge length of that test, which differs between panels and is stated in each: (a) 0.36 mm wire, 1200 °C/40 min followed by the 200 °C/3 h age; (b) 0.36 mm wire, 1200 °C/80 min; (c) two ≈1.3 mm rod specimens after the two-cycle 1200 ↔ 900 °C schedule of Sec. 2.2; (d) ≈1.06 mm rod after the three-cycle schedule and the 200 °C/3 h age, 127 mm gauge; (e) a second specimen of the same condition tested on a 6.0 mm gauge; (f) 0.36 mm wire after the quartz-tube 1200 °C cycle, 25.4 mm gauge, shown to fracture at ≈26%. Loading followed the incremental protocol of Sec. 2.4. Strains on the 6.0 and 25.4 mm gauges are not comparable with those on the 127 mm gauge (Sec. 2.4).</w:t>
       </w:r>
     </w:p>
-    <w:bookmarkEnd w:id="109"/>
-    <w:bookmarkStart w:id="110" w:name="tables"/>
+    <w:bookmarkEnd w:id="123"/>
+    <w:bookmarkStart w:id="124" w:name="tables"/>
     <w:p>
       <w:pPr>
         <w:pStyle w:val="Heading1"/>
@@ -8034,8 +8576,8 @@
         </w:tc>
       </w:tr>
     </w:tbl>
-    <w:bookmarkEnd w:id="110"/>
-    <w:bookmarkStart w:id="141" w:name="Xa38481a04f06bf2d74bd01fa73f89bbe2092c54"/>
+    <w:bookmarkEnd w:id="124"/>
+    <w:bookmarkStart w:id="155" w:name="Xa38481a04f06bf2d74bd01fa73f89bbe2092c54"/>
     <w:p>
       <w:pPr>
         <w:pStyle w:val="Heading1"/>
@@ -8053,18 +8595,18 @@
           <wp:inline>
             <wp:extent cx="3642360" cy="2843784"/>
             <wp:effectExtent b="0" l="0" r="0" t="0"/>
-            <wp:docPr descr="" title="" id="112" name="Picture"/>
+            <wp:docPr descr="" title="" id="126" name="Picture"/>
             <a:graphic>
               <a:graphicData uri="http://schemas.openxmlformats.org/drawingml/2006/picture">
                 <pic:pic>
                   <pic:nvPicPr>
-                    <pic:cNvPr descr="figures/Figure_1.jpg" id="113" name="Picture"/>
+                    <pic:cNvPr descr="figures/Figure_1.jpg" id="127" name="Picture"/>
                     <pic:cNvPicPr>
                       <a:picLocks noChangeArrowheads="1" noChangeAspect="1"/>
                     </pic:cNvPicPr>
                   </pic:nvPicPr>
                   <pic:blipFill>
-                    <a:blip r:embed="rId111"/>
+                    <a:blip r:embed="rId125"/>
                     <a:stretch>
                       <a:fillRect/>
                     </a:stretch>
@@ -8100,18 +8642,18 @@
           <wp:inline>
             <wp:extent cx="5334000" cy="2667000"/>
             <wp:effectExtent b="0" l="0" r="0" t="0"/>
-            <wp:docPr descr="" title="" id="115" name="Picture"/>
+            <wp:docPr descr="" title="" id="129" name="Picture"/>
             <a:graphic>
               <a:graphicData uri="http://schemas.openxmlformats.org/drawingml/2006/picture">
                 <pic:pic>
                   <pic:nvPicPr>
-                    <pic:cNvPr descr="figures/Figure_2.png" id="116" name="Picture"/>
+                    <pic:cNvPr descr="figures/Figure_2.png" id="130" name="Picture"/>
                     <pic:cNvPicPr>
                       <a:picLocks noChangeArrowheads="1" noChangeAspect="1"/>
                     </pic:cNvPicPr>
                   </pic:nvPicPr>
                   <pic:blipFill>
-                    <a:blip r:embed="rId114"/>
+                    <a:blip r:embed="rId128"/>
                     <a:stretch>
                       <a:fillRect/>
                     </a:stretch>
@@ -8147,18 +8689,18 @@
           <wp:inline>
             <wp:extent cx="5334000" cy="2014968"/>
             <wp:effectExtent b="0" l="0" r="0" t="0"/>
-            <wp:docPr descr="" title="" id="118" name="Picture"/>
+            <wp:docPr descr="" title="" id="132" name="Picture"/>
             <a:graphic>
               <a:graphicData uri="http://schemas.openxmlformats.org/drawingml/2006/picture">
                 <pic:pic>
                   <pic:nvPicPr>
-                    <pic:cNvPr descr="figures/Figure_3.jpg" id="119" name="Picture"/>
+                    <pic:cNvPr descr="figures/Figure_3.jpg" id="133" name="Picture"/>
                     <pic:cNvPicPr>
                       <a:picLocks noChangeArrowheads="1" noChangeAspect="1"/>
                     </pic:cNvPicPr>
                   </pic:nvPicPr>
                   <pic:blipFill>
-                    <a:blip r:embed="rId117"/>
+                    <a:blip r:embed="rId131"/>
                     <a:stretch>
                       <a:fillRect/>
                     </a:stretch>
@@ -8194,18 +8736,18 @@
           <wp:inline>
             <wp:extent cx="5334000" cy="5207668"/>
             <wp:effectExtent b="0" l="0" r="0" t="0"/>
-            <wp:docPr descr="" title="" id="121" name="Picture"/>
+            <wp:docPr descr="" title="" id="135" name="Picture"/>
             <a:graphic>
               <a:graphicData uri="http://schemas.openxmlformats.org/drawingml/2006/picture">
                 <pic:pic>
                   <pic:nvPicPr>
-                    <pic:cNvPr descr="figures/Figure_4.jpg" id="122" name="Picture"/>
+                    <pic:cNvPr descr="figures/Figure_4.jpg" id="136" name="Picture"/>
                     <pic:cNvPicPr>
                       <a:picLocks noChangeArrowheads="1" noChangeAspect="1"/>
                     </pic:cNvPicPr>
                   </pic:nvPicPr>
                   <pic:blipFill>
-                    <a:blip r:embed="rId120"/>
+                    <a:blip r:embed="rId134"/>
                     <a:stretch>
                       <a:fillRect/>
                     </a:stretch>
@@ -8241,18 +8783,18 @@
           <wp:inline>
             <wp:extent cx="2993136" cy="4465320"/>
             <wp:effectExtent b="0" l="0" r="0" t="0"/>
-            <wp:docPr descr="" title="" id="124" name="Picture"/>
+            <wp:docPr descr="" title="" id="138" name="Picture"/>
             <a:graphic>
               <a:graphicData uri="http://schemas.openxmlformats.org/drawingml/2006/picture">
                 <pic:pic>
                   <pic:nvPicPr>
-                    <pic:cNvPr descr="figures/Figure_5.jpg" id="125" name="Picture"/>
+                    <pic:cNvPr descr="figures/Figure_5.jpg" id="139" name="Picture"/>
                     <pic:cNvPicPr>
                       <a:picLocks noChangeArrowheads="1" noChangeAspect="1"/>
                     </pic:cNvPicPr>
                   </pic:nvPicPr>
                   <pic:blipFill>
-                    <a:blip r:embed="rId123"/>
+                    <a:blip r:embed="rId137"/>
                     <a:stretch>
                       <a:fillRect/>
                     </a:stretch>
@@ -8288,18 +8830,18 @@
           <wp:inline>
             <wp:extent cx="5120640" cy="5943600"/>
             <wp:effectExtent b="0" l="0" r="0" t="0"/>
-            <wp:docPr descr="" title="" id="127" name="Picture"/>
+            <wp:docPr descr="" title="" id="141" name="Picture"/>
             <a:graphic>
               <a:graphicData uri="http://schemas.openxmlformats.org/drawingml/2006/picture">
                 <pic:pic>
                   <pic:nvPicPr>
-                    <pic:cNvPr descr="figures/Figure_6.jpg" id="128" name="Picture"/>
+                    <pic:cNvPr descr="figures/Figure_6.jpg" id="142" name="Picture"/>
                     <pic:cNvPicPr>
                       <a:picLocks noChangeArrowheads="1" noChangeAspect="1"/>
                     </pic:cNvPicPr>
                   </pic:nvPicPr>
                   <pic:blipFill>
-                    <a:blip r:embed="rId126"/>
+                    <a:blip r:embed="rId140"/>
                     <a:stretch>
                       <a:fillRect/>
                     </a:stretch>
@@ -8335,18 +8877,18 @@
           <wp:inline>
             <wp:extent cx="3404616" cy="1234440"/>
             <wp:effectExtent b="0" l="0" r="0" t="0"/>
-            <wp:docPr descr="" title="" id="130" name="Picture"/>
+            <wp:docPr descr="" title="" id="144" name="Picture"/>
             <a:graphic>
               <a:graphicData uri="http://schemas.openxmlformats.org/drawingml/2006/picture">
                 <pic:pic>
                   <pic:nvPicPr>
-                    <pic:cNvPr descr="figures/Figure_7.jpg" id="131" name="Picture"/>
+                    <pic:cNvPr descr="figures/Figure_7.jpg" id="145" name="Picture"/>
                     <pic:cNvPicPr>
                       <a:picLocks noChangeArrowheads="1" noChangeAspect="1"/>
                     </pic:cNvPicPr>
                   </pic:nvPicPr>
                   <pic:blipFill>
-                    <a:blip r:embed="rId129"/>
+                    <a:blip r:embed="rId143"/>
                     <a:stretch>
                       <a:fillRect/>
                     </a:stretch>
@@ -8382,18 +8924,18 @@
           <wp:inline>
             <wp:extent cx="3566160" cy="3410712"/>
             <wp:effectExtent b="0" l="0" r="0" t="0"/>
-            <wp:docPr descr="" title="" id="133" name="Picture"/>
+            <wp:docPr descr="" title="" id="147" name="Picture"/>
             <a:graphic>
               <a:graphicData uri="http://schemas.openxmlformats.org/drawingml/2006/picture">
                 <pic:pic>
                   <pic:nvPicPr>
-                    <pic:cNvPr descr="figures/Figure_8.jpg" id="134" name="Picture"/>
+                    <pic:cNvPr descr="figures/Figure_8.jpg" id="148" name="Picture"/>
                     <pic:cNvPicPr>
                       <a:picLocks noChangeArrowheads="1" noChangeAspect="1"/>
                     </pic:cNvPicPr>
                   </pic:nvPicPr>
                   <pic:blipFill>
-                    <a:blip r:embed="rId132"/>
+                    <a:blip r:embed="rId146"/>
                     <a:stretch>
                       <a:fillRect/>
                     </a:stretch>
@@ -8429,18 +8971,18 @@
           <wp:inline>
             <wp:extent cx="5334000" cy="1862666"/>
             <wp:effectExtent b="0" l="0" r="0" t="0"/>
-            <wp:docPr descr="" title="" id="136" name="Picture"/>
+            <wp:docPr descr="" title="" id="150" name="Picture"/>
             <a:graphic>
               <a:graphicData uri="http://schemas.openxmlformats.org/drawingml/2006/picture">
                 <pic:pic>
                   <pic:nvPicPr>
-                    <pic:cNvPr descr="figures/Figure_9.png" id="137" name="Picture"/>
+                    <pic:cNvPr descr="figures/Figure_9.png" id="151" name="Picture"/>
                     <pic:cNvPicPr>
                       <a:picLocks noChangeArrowheads="1" noChangeAspect="1"/>
                     </pic:cNvPicPr>
                   </pic:nvPicPr>
                   <pic:blipFill>
-                    <a:blip r:embed="rId135"/>
+                    <a:blip r:embed="rId149"/>
                     <a:stretch>
                       <a:fillRect/>
                     </a:stretch>
@@ -8476,18 +9018,18 @@
           <wp:inline>
             <wp:extent cx="5334000" cy="3087729"/>
             <wp:effectExtent b="0" l="0" r="0" t="0"/>
-            <wp:docPr descr="" title="" id="139" name="Picture"/>
+            <wp:docPr descr="" title="" id="153" name="Picture"/>
             <a:graphic>
               <a:graphicData uri="http://schemas.openxmlformats.org/drawingml/2006/picture">
                 <pic:pic>
                   <pic:nvPicPr>
-                    <pic:cNvPr descr="figures/Figure_10.png" id="140" name="Picture"/>
+                    <pic:cNvPr descr="figures/Figure_10.png" id="154" name="Picture"/>
                     <pic:cNvPicPr>
                       <a:picLocks noChangeArrowheads="1" noChangeAspect="1"/>
                     </pic:cNvPicPr>
                   </pic:nvPicPr>
                   <pic:blipFill>
-                    <a:blip r:embed="rId138"/>
+                    <a:blip r:embed="rId152"/>
                     <a:stretch>
                       <a:fillRect/>
                     </a:stretch>
@@ -8514,7 +9056,7 @@
         </w:drawing>
       </w:r>
     </w:p>
-    <w:bookmarkEnd w:id="141"/>
+    <w:bookmarkEnd w:id="155"/>
     <w:sectPr>
       <w:footerReference w:type="default" r:id="rId9"/>
       <w:footnotePr>

</xml_diff>

<commit_message>
JMEP R1: A2 decision rule (Frank's reasons), Figs. 5/6 described as updated, English revised throughout (invariant-checked), letter quotes re-synced; rebuild
</commit_message>
<xml_diff>
--- a/submissions/JMEP-R1/Cai_Fe-SMA_JMEP_R1_clean.docx
+++ b/submissions/JMEP-R1/Cai_Fe-SMA_JMEP_R1_clean.docx
@@ -122,7 +122,7 @@
         <w:pStyle w:val="FirstParagraph"/>
       </w:pPr>
       <w:r>
-        <w:t xml:space="preserve">Iron-based shape memory alloys (Fe-SMAs) offer a low-cost alternative to Nitinol, but their superelastic response is sensitive to composition and processing. Large language model (LLM) deep-research agents can propose alloy compositions in seconds, but whether such proposals work once synthesized is rarely tested. We synthesized and tested one Fe-Mn-Al-Ni-Si-C composition drawn from an LLM proposal, alongside an Fe-Mn-Al-Ni reference alloy of established superelastic composition processed in parallel. The LLM-hypothesized alloy showed no superelasticity where unloading was recorded and no shape-memory recovery on heating in the one condition tested, whereas the reference alloy recovered ≈0.5%. After a 1200 °C anneal, ex-situ synchrotron X-ray diffraction with semi-quantitative Rietveld refinement indicates a γ-majority FCC γ + BCC α structure with a minor ordered phase indexed as D0₃ Fe₃Al, unchanged after 10% strain. Equilibrium calculations in three CALPHAD databases find no single-phase α field below the alloy’s melting point; one opens when its 0.1 wt% carbon is removed, making carbon a plausible contributor rather than a demonstrated cause. The workflow omitted the phase-stability check its own report recommended. This single-composition case study does not rate LLM alloy design generally; proposed compositions should be screened for competing phase stability before synthesis.</w:t>
+        <w:t xml:space="preserve">Iron-based shape memory alloys (Fe-SMAs) offer a low-cost alternative to Nitinol, but their superelastic response is sensitive to composition and processing. Large language model (LLM) deep-research agents can propose alloy compositions in seconds, but whether such proposals work once synthesized is rarely tested. We synthesized and tested one Fe-Mn-Al-Ni-Si-C composition drawn from an LLM proposal, alongside an Fe-Mn-Al-Ni reference alloy of established superelastic composition, processed in parallel. The LLM-hypothesized alloy showed no superelasticity where unloading was recorded and no shape-memory recovery on heating in the one condition tested, whereas the reference alloy recovered ≈0.5%. After a 1200 °C anneal, ex-situ synchrotron X-ray diffraction with semi-quantitative Rietveld refinement indicates a γ-majority FCC γ + BCC α structure with a minor ordered phase indexed as D0₃ Fe₃Al, unchanged after 10% strain. Equilibrium calculations in three CALPHAD databases find no single-phase α field below the alloy’s melting point; one opens when its 0.1 wt% carbon is removed, making carbon a plausible contributor rather than a demonstrated cause. The workflow omitted the phase-stability check its own report recommended. This single-composition case study does not evaluate LLM alloy design in general; proposed compositions should be screened for competing-phase stability before synthesis.</w:t>
       </w:r>
     </w:p>
     <w:p>
@@ -165,7 +165,7 @@
         <w:pStyle w:val="FirstParagraph"/>
       </w:pPr>
       <w:r>
-        <w:t xml:space="preserve">Materials discovery has been advanced by deep-learning models trained on first-principles thermodynamics. For example, DeepMind’s GNoME predicted more than 2.2 million previously unreported crystal structures with high precision against DFT validation</w:t>
+        <w:t xml:space="preserve">Deep-learning models trained on first-principles thermodynamics have advanced materials discovery. For example, DeepMind’s GNoME predicted more than 2.2 million previously unreported crystal structures with high precision against DFT validation</w:t>
       </w:r>
       <w:r>
         <w:t xml:space="preserve"> </w:t>
@@ -174,7 +174,7 @@
         <w:t xml:space="preserve">(Ref 1)</w:t>
       </w:r>
       <w:r>
-        <w:t xml:space="preserve">, and agentic large language models with deep-research capabilities can ingest decades of metallurgical literature and propose compositions in seconds</w:t>
+        <w:t xml:space="preserve">. In addition, agentic large language models (LLMs) with deep-research capabilities can ingest decades of metallurgical literature and propose compositions in seconds</w:t>
       </w:r>
       <w:r>
         <w:t xml:space="preserve"> </w:t>
@@ -183,7 +183,7 @@
         <w:t xml:space="preserve">(Ref 2,3)</w:t>
       </w:r>
       <w:r>
-        <w:t xml:space="preserve">. Together these tools raise the possibility of alloy design that supplements intuition-guided iteration with machine-proposed candidates — some screened against first-principles thermodynamics, as GNoME’s are against DFT, and some, like the LLM proposal examined here, screened by no calculation at all (Sec. 2.1). Recent studies have begun applying such AI methods specifically to shape memory alloys, including data-driven composition screening</w:t>
+        <w:t xml:space="preserve">. Together, these tools raise the possibility of alloy design that supplements intuition-guided iteration with machine-proposed candidates: some screened against first-principles thermodynamics, as GNoME’s are against DFT, and others, like the LLM proposal examined here, screened by no calculation at all (Sec. 2.1). Recent studies have begun applying such AI methods specifically to shape memory alloys (SMAs), including data-driven composition screening</w:t>
       </w:r>
       <w:r>
         <w:t xml:space="preserve"> </w:t>
@@ -210,7 +210,7 @@
         <w:t xml:space="preserve">(Ref 6)</w:t>
       </w:r>
       <w:r>
-        <w:t xml:space="preserve">. However, experimental tests of such proposals, and of LLM-generated ones in particular, remain few. Current generative materials models typically optimize for thermodynamic stability (formation energy, convex-hull distance) but may not, in general, explicitly consider the kinetic barriers governing microstructure evolution during processing</w:t>
+        <w:t xml:space="preserve">. However, experimental tests of such proposals, and of LLM-generated ones in particular, remain few. Current generative materials models typically optimize for thermodynamic stability (formation energy, convex-hull distance) but may not, in general, explicitly consider the kinetic barriers that govern microstructure evolution during processing</w:t>
       </w:r>
       <w:r>
         <w:t xml:space="preserve"> </w:t>
@@ -219,7 +219,7 @@
         <w:t xml:space="preserve">(Ref 1)</w:t>
       </w:r>
       <w:r>
-        <w:t xml:space="preserve">. A composition whose target phase lies on the DFT convex hull might still be difficult to realize in practice. It is our interest to examine a large language model (LLM)-hypothesized shape memory alloy (SMA). To the best of our knowledge, experimentally validated studies on this topic remain very rare.</w:t>
+        <w:t xml:space="preserve">. A composition whose target phase lies on the DFT convex hull might still be difficult to realize in practice. This study examines an LLM-hypothesized SMA. To the best of our knowledge, experimental validation of such alloys remains very rare.</w:t>
       </w:r>
     </w:p>
     <w:p>
@@ -236,7 +236,7 @@
         <w:t xml:space="preserve">(Ref 7,8)</w:t>
       </w:r>
       <w:r>
-        <w:t xml:space="preserve">. As the dominant commercial SMA, Nitinol, a near 50Ni-50Ti alloy, offers large recoverable strains of 6–8%, excellent cyclic stability, and biocompatibility, which make it widely used in medical devices, aerospace actuators, and damping applications</w:t>
+        <w:t xml:space="preserve">. As the dominant commercial SMA, Nitinol (a near 50Ni-50Ti alloy) offers large recoverable strains of 6–8%, excellent cyclic stability, and biocompatibility, properties that have led to its wide use in medical devices, aerospace actuators, and damping applications</w:t>
       </w:r>
       <w:r>
         <w:t xml:space="preserve"> </w:t>
@@ -245,7 +245,7 @@
         <w:t xml:space="preserve">(Ref 9,10)</w:t>
       </w:r>
       <w:r>
-        <w:t xml:space="preserve">. However, due to its relatively high manufacturing cost, the application of Nitinol in structural engineering such as prestressing tendons for concrete and seismic dampers remains very limited.</w:t>
+        <w:t xml:space="preserve">. However, because of its relatively high manufacturing cost, the use of Nitinol in structural engineering applications, such as prestressing tendons for concrete and seismic dampers, remains very limited.</w:t>
       </w:r>
     </w:p>
     <w:p>
@@ -253,7 +253,7 @@
         <w:pStyle w:val="BodyText"/>
       </w:pPr>
       <w:r>
-        <w:t xml:space="preserve">Fe-based shape memory alloys offer a path to lower cost</w:t>
+        <w:t xml:space="preserve">Fe-based SMAs offer a path to lower cost</w:t>
       </w:r>
       <w:r>
         <w:t xml:space="preserve"> </w:t>
@@ -262,7 +262,7 @@
         <w:t xml:space="preserve">(Ref 11)</w:t>
       </w:r>
       <w:r>
-        <w:t xml:space="preserve">. The work of Omori</w:t>
+        <w:t xml:space="preserve">. Omori</w:t>
       </w:r>
       <w:r>
         <w:t xml:space="preserve"> </w:t>
@@ -287,7 +287,7 @@
         <w:t xml:space="preserve">(Ref 12)</w:t>
       </w:r>
       <w:r>
-        <w:t xml:space="preserve">, where a bamboo-like grain structure, or single-crystal-diameter grains spanning the wire cross-section, is produced by cyclic heat treatments across the FCC γ ↔ BCC α phase boundary. Subsequent studies have associated such large grains with reduced inter-granular constraint and improved transformation reversibility in the BCC α / FCC γ system</w:t>
+        <w:t xml:space="preserve">, in which cyclic heat treatments across the FCC γ ↔ BCC α phase boundary produce a bamboo-like grain structure, with individual grains spanning the whole wire cross-section. Subsequent studies have associated such large grains with reduced intergranular constraint and improved transformation reversibility in the BCC α / FCC γ system</w:t>
       </w:r>
       <w:r>
         <w:t xml:space="preserve"> </w:t>
@@ -296,7 +296,7 @@
         <w:t xml:space="preserve">(Ref 13,14)</w:t>
       </w:r>
       <w:r>
-        <w:t xml:space="preserve">. However, achieving a bamboo-like grain structure poses significant challenges, especially at industrial scale. In this study, we adopted this alloy system and asked an LLM deep-research agent, which retrieves and reads published and web sources at query time rather than being trained on a curated corpus, for lower-cost alternatives with the potential to exhibit superelasticity; its report draws on 76 sources (Sec. 2.1). We processed one of the LLM-hypothesized compositions alongside the alloy reported by Omori</w:t>
+        <w:t xml:space="preserve">. However, achieving a bamboo-like grain structure poses significant challenges, especially at industrial scale. In this study, we took this alloy system as the starting point and asked an LLM deep-research agent for lower-cost alternatives with the potential to exhibit superelasticity. The agent retrieves and reads published and web sources at query time rather than being trained on a curated corpus; its report draws on 76 sources (Sec. 2.1). We processed one of the LLM-hypothesized compositions alongside the alloy reported by Omori</w:t>
       </w:r>
       <w:r>
         <w:t xml:space="preserve"> </w:t>
@@ -324,7 +324,7 @@
         <w:t xml:space="preserve">(Ref 15)</w:t>
       </w:r>
       <w:r>
-        <w:t xml:space="preserve">. Both alloys were put through the same nominal processing route. Identical nominal parameters do not guarantee identical recrystallization, grain size, texture or precipitation in two different compositions, so what follows compares how each alloy responds to a common route rather than isolating composition as the only variable (Sec. 4.1). The work is an exploratory case study of one LLM-assisted hypothesis, not an evaluation of LLM alloy design as a class.</w:t>
+        <w:t xml:space="preserve">. Both alloys followed the same nominal processing route. Identical nominal parameters do not guarantee identical recrystallization, grain size, texture or precipitation in two different compositions, so what follows compares how each alloy responds to a common route rather than isolating composition as the only variable (Sec. 4.1). This work is an exploratory case study of one LLM-assisted hypothesis, not an evaluation of LLM alloy design as a class.</w:t>
       </w:r>
     </w:p>
     <w:p>
@@ -367,7 +367,7 @@
         <w:t xml:space="preserve">(Ref 2)</w:t>
       </w:r>
       <w:r>
-        <w:t xml:space="preserve">, in which the agent searches for and reads sources at query time; no model was trained or fine-tuned for this work. The agent was asked for iron-based compositions that might approach Nitinol-like pseudoelasticity at substantially lower cost, reasoning from the Fe-Mn-Al-Ni family established by Omori and co-workers</w:t>
+        <w:t xml:space="preserve">, in which the agent searched for and read sources at query time; no model was trained or fine-tuned for this work. The agent was asked for iron-based compositions that might approach Nitinol-like pseudoelasticity at substantially lower cost, reasoning from the Fe-Mn-Al-Ni family established by Omori and co-workers</w:t>
       </w:r>
       <w:r>
         <w:t xml:space="preserve"> </w:t>
@@ -395,7 +395,7 @@
         <w:t xml:space="preserve"> </w:t>
       </w:r>
       <w:r>
-        <w:t xml:space="preserve">(41 pages drawing on 76 sources, all accessed 19 May 2025, exported 4 June 2025), is supplied unedited as Online Resource 1. The verbatim prompt was not preserved and the report does not embed it, so the report is the complete surviving record of the session. The agent ran no thermodynamic or first-principles calculation; its report recommends CALPHAD and DFT calculations as future steps (Sec. 4.3). The report proposes six candidate families and ranks them for experimental priority: three Fe-Mn-Al-(Ni) variants, two Fe-Mn-Si-Cr variants, and one Fe-Al-Cr-Mn interstitial alloy.</w:t>
+        <w:t xml:space="preserve">(41 pages drawing on 76 sources, all accessed on 19 May 2025; exported on 4 June 2025), is supplied unedited as Online Resource 1. The verbatim prompt was not preserved, and the report does not include it; the report is therefore the complete surviving record of the session. The agent ran no thermodynamic or first-principles calculation; its report recommends CALPHAD and DFT calculations as future steps (Sec. 4.3). The report proposes six candidate families and ranks them by experimental priority: three Fe-Mn-Al-(Ni) variants, two Fe-Mn-Si-Cr variants, and one Fe-Al-Cr-Mn interstitial alloy.</w:t>
       </w:r>
     </w:p>
     <w:p>
@@ -403,7 +403,16 @@
         <w:pStyle w:val="BodyText"/>
       </w:pPr>
       <w:r>
-        <w:t xml:space="preserve">The composition made here was drawn from Hypothesis A2, Fe-Mn-Al-Si-Ni-(B/C), which the report ranked joint second of the six; its first-ranked candidate, an Fe-Mn-Si-Cr-V-C alloy, was not synthesized. A2’s proposed range is Fe (bal.), Mn 20–30, Al 8–12, Si 1–4, Ni 3–6, and either B 0.005–0.05 or C 0.1–0.3, all in wt%. From it we selected a composition specified in atomic percent, 50Fe-30Mn-12Al-4Ni-4Si (at%) with an additional 1000 ppm C, equivalently 54.5Fe-32.3Mn-6.4Al-4.6Ni-2.2Si-0.1C (wt%), taking A2’s carbon option rather than its boron one. This composition lies inside A2 in silicon, nickel and carbon but outside it in manganese (32.3 wt% against a ceiling of 30) and aluminum (6.4 wt% against a floor of 8). Both deviations lie in the austenite-forming direction, toward the outcome actually observed. The experiments therefore test the composition that was made and not Hypothesis A2 as a whole; the A2 range is examined only by calculation (Sec. 3.4).</w:t>
+        <w:t xml:space="preserve">The composition made here was drawn from Hypothesis A2, Fe-Mn-Al-Si-Ni-(B/C), which the report ranks tied for second of the six with Hypothesis A1, Fe-Mn-Al-(low Ni)-Cr-(C/V). The first-ranked candidate, Hypothesis B1, is an Fe-Mn-Si-Cr-V-C alloy that relies on a different transformation, from FCC austenite to HCP ε martensite; it was not synthesized. We chose A2 because it builds on the Fe-Mn-Al-Ni system, for which a substantial body of earlier work exists</w:t>
+      </w:r>
+      <w:r>
+        <w:t xml:space="preserve"> </w:t>
+      </w:r>
+      <w:r>
+        <w:t xml:space="preserve">(Ref 12,16)</w:t>
+      </w:r>
+      <w:r>
+        <w:t xml:space="preserve">. An alloy of established composition from that system could therefore be processed alongside it as a reference, and the results could be compared directly with the published record. Of the two Fe-Mn-Al-Ni-based hypotheses, A2 adds no chromium, contains more nickel than A1 (3–6 against 2–5 wt%), and has the highest recoverable-strain target of the six. A2’s proposed range is Fe (bal.), Mn 20–30, Al 8–12, Si 1–4, Ni 3–6, and either B 0.005–0.05 or C 0.1–0.3, all in wt%. We specified the composition in atomic percent, the basis on which the Fe-Mn-Al-Ni alloys of that earlier work are reported, and took A2’s carbon option rather than its boron one: 50Fe-30Mn-12Al-4Ni-4Si (at%) with an additional 1000 ppm C, equivalent to 54.5Fe-32.3Mn-6.4Al-4.6Ni-2.2Si-0.1C (wt%). The manganese, aluminum and silicon values are the upper limits of A2’s ranges, and the nickel value lies within its range, but these values were applied as atomic rather than weight percentages. The composition therefore lies within A2 for silicon, nickel and carbon but outside it for manganese (32.3 wt% against a ceiling of 30) and aluminum (6.4 wt% against a floor of 8). Both deviations lie in the austenite-forming direction, toward the outcome actually observed. The experiments thus test the composition that was made, not Hypothesis A2 as a whole; the A2 range is examined only by calculation (Sec. 3.4).</w:t>
       </w:r>
     </w:p>
     <w:p>
@@ -411,7 +420,7 @@
         <w:pStyle w:val="BodyText"/>
       </w:pPr>
       <w:r>
-        <w:t xml:space="preserve">In the report’s rationale for A2, Fe, Mn, Al, and Ni are intended to form a BCC parent phase and β (NiAl-type) precipitates, with Ni kept moderate to lower cost. Si is added to strengthen the parent BCC matrix through solid-solution strengthening; Si is also known to increase resistance to slip in ferritic structures and could potentially modify the stability or morphology of β precipitates, or influence stacking-fault energy. C is added for interstitial strengthening of the parent phase and possible formation of very fine, dispersed carbides. The report’s stated performance target for A2 was 5–8% recoverable strain at a transformation stress of 400–700 MPa. For direct comparison, a second alloy of composition 43.5Fe-34Mn-15Al-7.5Ni (at%), based on the work of Omori</w:t>
+        <w:t xml:space="preserve">In the report’s rationale for A2, Fe, Mn, Al, and Ni are intended to form a BCC parent phase and β (NiAl-type) precipitates, with Ni kept moderate to lower cost. Si is added for solid-solution strengthening of the parent BCC matrix; it is also known to increase slip resistance in ferritic structures and could potentially modify the stability or morphology of β precipitates or influence the stacking-fault energy. C is added for interstitial strengthening of the parent phase and for the possible formation of very fine, dispersed carbides. The report’s stated performance target for A2 is 5–8% recoverable strain at a transformation stress of 400–700 MPa. For direct comparison, a second alloy of composition 43.5Fe-34Mn-15Al-7.5Ni (at%), based on the work of Omori</w:t>
       </w:r>
       <w:r>
         <w:t xml:space="preserve"> </w:t>
@@ -430,7 +439,7 @@
         <w:t xml:space="preserve">(Ref 12)</w:t>
       </w:r>
       <w:r>
-        <w:t xml:space="preserve">, was synthesized and processed in parallel. These alloys are hereafter named the LLM alloy and the Omori alloy, respectively. The Omori alloy serves as a reference composition processed in parallel, not as a superelastic control whose treatment was optimized: it received the same nominal route as the LLM alloy and is compared in the 1200 °C/1 min condition used throughout the anneal series, not after the abnormal-grain-growth and aging route by which this composition reaches its superelasticity</w:t>
+        <w:t xml:space="preserve">, was synthesized and processed in parallel. These alloys are hereafter referred to as the LLM alloy and the Omori alloy, respectively. The Omori alloy serves as a reference composition processed in parallel, not as an optimally treated superelastic control. It received the same nominal route as the LLM alloy and is compared in the 1200 °C/1 min condition used throughout the anneal series, not after the abnormal-grain-growth and aging route by which this composition attains its superelasticity</w:t>
       </w:r>
       <w:r>
         <w:t xml:space="preserve"> </w:t>
@@ -447,7 +456,7 @@
         <w:pStyle w:val="BodyText"/>
       </w:pPr>
       <w:r>
-        <w:t xml:space="preserve">Using high-purity raw elements, about 2 kg of each alloy was melted in a vacuum induction furnace and cast into ø50 mm ingots. Alloy chemistries, measured by inductively coupled plasma atomic emission spectroscopy (ICP-AES) with carbon by ASTM E1019, are listed in</w:t>
+        <w:t xml:space="preserve">About 2 kg of each alloy was melted from high-purity raw elements in a vacuum induction furnace and cast into ø50 mm ingots. The alloy chemistries, measured by inductively coupled plasma atomic emission spectroscopy (ICP-AES), with carbon determined by ASTM E1019, are listed in wt% and at% in</w:t>
       </w:r>
       <w:r>
         <w:t xml:space="preserve"> </w:t>
@@ -460,10 +469,7 @@
         <w:t xml:space="preserve">Table 1</w:t>
       </w:r>
       <w:r>
-        <w:t xml:space="preserve"> </w:t>
-      </w:r>
-      <w:r>
-        <w:t xml:space="preserve">in wt% and at%. The Omori alloy came out close to its nominal composition (42.7Fe-34.1Mn-15.2Al-7.8Ni at% measured). In the LLM alloy, silicon was recovered at only about half the intended level, 1.11 wt% against 2.2 wt% (2.04 against 4.0 at%), a shortfall consistent with oxidation loss during vacuum induction melting; its effect on phase stability is examined by calculation in Sec. 3.4. The measured LLM alloy is therefore 51.5Fe-29.8Mn-11.9Al-4.2Ni-2.0Si-0.45C (at%), and this measured composition is used in all calculations. Each heat was analyzed once, on one sample (Table S1, Online Resource 2), so chemical homogeneity within a heat was not checked. The Omori alloy also contains 0.06 wt% (≈0.10 at%) phosphorus of unknown origin, most plausibly a residual from the melting stock. Phosphorus can segregate to grain boundaries and embrittle them; its effect on the Omori alloy was not examined, but any such effect could only have degraded the reference behavior, and the Omori alloy still showed a stress-induced transformation (Sec. 3.2). Several ø13 mm rods were cut from the cast ingots by electrical discharge machining (EDM). These rods were homogenized at 1000 °C for 16 hours in argon atmosphere, then hot-rolled at 850 °C in multiple passes to reduce thickness, and subsequently cold-drawn to wire, 0.36 mm in diameter for the LLM alloy and 0.64 mm for the Omori alloy (the heating-test specimen of the Omori alloy measured 0.54 mm in its test record). Severe work hardening during cold drawing necessitated intermediate annealing at 1000 °C under argon to restore ductility between draw passes. The amount of cold drawing was ≈85% area reduction after the last process anneal.</w:t>
+        <w:t xml:space="preserve">. The measured composition of the Omori alloy, 42.7Fe-34.1Mn-15.2Al-7.8Ni (at%), was close to nominal. In the LLM alloy, only about half the intended silicon was recovered, 1.11 wt% against 2.2 wt% (2.04 against 4.0 at%), a shortfall consistent with oxidation loss during vacuum induction melting. The effect of this shortfall on phase stability is examined by calculation in Sec. 3.4. The measured composition of the LLM alloy is therefore 51.5Fe-29.8Mn-11.9Al-4.2Ni-2.0Si-0.45C (at%), and this composition was used in all calculations. Each heat was analyzed once, on one sample (Table S1, Online Resource 2), so chemical homogeneity within a heat was not checked. The Omori alloy also contains 0.06 wt% (≈0.10 at%) phosphorus of unknown origin, most plausibly a residual from the melting stock. Phosphorus can segregate to grain boundaries and embrittle them. Its effect on the Omori alloy was not examined, but any such effect could only have degraded the reference behavior, and the Omori alloy still showed a stress-induced transformation (Sec. 3.2). Several ø13 mm rods were cut from the cast ingots by electrical discharge machining (EDM). The rods were homogenized at 1000 °C for 16 hours in an argon atmosphere, hot-rolled at 850 °C in multiple passes to reduce their thickness, and then cold-drawn to wire 0.36 mm in diameter for the LLM alloy and 0.64 mm for the Omori alloy (the test record of the Omori alloy’s heating-test specimen gives a diameter of 0.54 mm). Severe work hardening during cold drawing necessitated intermediate annealing at 1000 °C under argon between drawing passes to restore ductility. The cold-drawing reduction after the last process anneal was ≈85% in area.</w:t>
       </w:r>
     </w:p>
     <w:bookmarkEnd w:id="11"/>
@@ -481,7 +487,7 @@
         <w:pStyle w:val="FirstParagraph"/>
       </w:pPr>
       <w:r>
-        <w:t xml:space="preserve">To test the effect of heat-treating temperature on mechanical properties, cold-drawn 0.36 mm LLM-alloy wires were heat treated in a strand furnace filled with argon at temperatures between 600 and 1200 °C for a nominal dwell of 1 minute, followed by fast cooling to room temperature; the cooling rate on leaving the furnace was not measured. The 1-minute treatments were strand passes through the hot zone, at 4 ft min⁻¹ for the specimens whose records give the pass speed; the remaining specimens of Table 2 are recorded as given the same 1-minute treatment (Table S1).</w:t>
+        <w:t xml:space="preserve">To test the effect of heat-treatment temperature on mechanical properties, cold-drawn 0.36 mm LLM-alloy wires were heat treated in an argon-filled strand furnace at temperatures between 600 and 1200 °C for a nominal dwell of 1 minute and then cooled rapidly to room temperature; the cooling rate on leaving the furnace was not measured. The 1-minute treatments were strand passes through the hot zone, made at 4 ft min⁻¹ for the specimens whose records give the pass speed; the remaining specimens in Table 2 are recorded as having received the same 1-minute treatment (Table S1).</w:t>
       </w:r>
       <w:r>
         <w:t xml:space="preserve"> </w:t>
@@ -493,7 +499,7 @@
         <w:t xml:space="preserve"> </w:t>
       </w:r>
       <w:r>
-        <w:t xml:space="preserve">is the nominal dwell, the time at temperature set by the pass speed and the hot-zone length not having been measured separately. The Omori alloy wire used in Figs. 3, 4 and 6 received the same 1200 °C/1 min treatment. Static holds of 40 and 80 minutes at 1200 °C were also applied to the LLM-alloy wire. The aged condition of</w:t>
+        <w:t xml:space="preserve">is the nominal dwell: the time at temperature, which is set by the pass speed and the hot-zone length, was not measured separately. The Omori alloy wire used in Figs. 3, 4 and 6 received the same 1200 °C/1 min treatment. Static holds of 40 and 80 minutes at 1200 °C were also applied to the LLM-alloy wire. The aged condition of</w:t>
       </w:r>
       <w:r>
         <w:t xml:space="preserve"> </w:t>
@@ -509,7 +515,7 @@
         <w:t xml:space="preserve"> </w:t>
       </w:r>
       <w:r>
-        <w:t xml:space="preserve">was produced by aging the 1200 °C/1 min wire at 200 °C for 3 hours. Heat treatment above 1200 °C (static holds at 1250 °C and a cyclic exposure at 1300 °C) caused severe oxidation or furnace contamination, and those conditions are not reported further; 1200 °C was therefore the practical upper limit of the processing window. Surface oxidation and decarburization during the treatments at or below 1200 °C were not measured.</w:t>
+        <w:t xml:space="preserve">was produced by aging the 1200 °C/1 min wire at 200 °C for 3 hours. Heat treatments above 1200 °C (static holds at 1250 °C and a cyclic exposure at 1300 °C) caused severe oxidation or furnace contamination and are not reported further; 1200 °C was therefore the practical upper limit of the processing window. Surface oxidation and decarburization during the treatments at or below 1200 °C were not measured.</w:t>
       </w:r>
     </w:p>
     <w:p>
@@ -529,7 +535,7 @@
         <w:t xml:space="preserve"> </w:t>
       </w:r>
       <w:r>
-        <w:t xml:space="preserve">were also applied to the LLM alloy. Rod of ≈1–1.3 mm diameter was held at 1200 °C for 30 minutes, water quenched, and re-heated to 900 °C for 15 minutes; this cycle was applied twice, followed by a final 1200 °C/30 min hold and water quench, or three times, followed by a final 1200 °C/60 min hold and water quench, and the three-cycle specimens tested mechanically also received the 200 °C/3 h age. In a separate run, 0.36 mm wire sealed in a quartz tube under argon was given four 30-minute holds at 1200 °C, each of the first three followed by 10 minutes in the cold zone of the furnace and the fourth by a water quench.</w:t>
+        <w:t xml:space="preserve">were also applied to the LLM alloy. Rod ≈1–1.3 mm in diameter was held at 1200 °C for 30 minutes, water quenched, and reheated to 900 °C for 15 minutes. This cycle was applied twice, followed by a final 1200 °C/30 min hold and water quench, or three times, followed by a final 1200 °C/60 min hold and water quench; the three-cycle specimens that were tested mechanically also received the 200 °C/3 h age. In a separate run, 0.36 mm wire sealed in a quartz tube under argon was given four 30-minute holds at 1200 °C, each of the first three followed by 10 minutes in the cold zone of the furnace and the fourth by a water quench.</w:t>
       </w:r>
     </w:p>
     <w:bookmarkEnd w:id="12"/>
@@ -547,7 +553,7 @@
         <w:pStyle w:val="FirstParagraph"/>
       </w:pPr>
       <w:r>
-        <w:t xml:space="preserve">Wire cross-sections were embedded in cold-mount epoxy and ground sequentially with silicon-carbide papers from 180 grit through 800 grit. Final polishing used a 0.25 µm OP-S aluminum-oxide suspension on an automated polishing wheel until a scratch-free mirror finish was achieved. Polished cross-sections were imaged on a Clemex Vision PE optical microscope under bright-field illumination at magnifications between 100× and 1000×. In addition, scanning electron microscopy (SEM) and energy-dispersive spectroscopy (EDS) were used to study microstructure and local chemistry; EDS was used qualitatively (Sec. 3.1).</w:t>
+        <w:t xml:space="preserve">Wire cross-sections were embedded in cold-mount epoxy and ground sequentially with silicon-carbide papers from 180 to 800 grit. Final polishing used a 0.25 µm OP-S aluminum-oxide suspension on an automated polishing wheel until a scratch-free mirror finish was achieved. Polished cross-sections were imaged on a Clemex Vision PE optical microscope under bright-field illumination at magnifications between 100× and 1000×. In addition, scanning electron microscopy (SEM) and energy-dispersive X-ray spectroscopy (EDS) were used to study the microstructure and local chemistry; EDS was used qualitatively (Sec. 3.1).</w:t>
       </w:r>
     </w:p>
     <w:bookmarkEnd w:id="13"/>
@@ -565,7 +571,7 @@
         <w:pStyle w:val="FirstParagraph"/>
       </w:pPr>
       <w:r>
-        <w:t xml:space="preserve">Room-temperature cyclic tensile testing was performed on an Instron in displacement control. Each specimen was loaded in successive increments of nominally 1% strain, with an unloading after each, up to ≈8–12% strain or earlier fracture, and then loaded to fracture. Specimen handling and the monotonic-tension elements of the procedure broadly follow ASTM E8/E8M; the cyclic protocol itself is not a standardized test but a purpose-designed method for evaluating reversible transformation and strain recovery in fine superelastic wire, used in our previous work</w:t>
+        <w:t xml:space="preserve">Room-temperature cyclic tensile tests were performed on an Instron testing machine in displacement control. Each specimen was loaded in successive increments of nominally 1% strain and unloaded after each increment until ≈8–12% strain was reached, unless it fractured earlier, and was then loaded to fracture. Specimen handling and the monotonic-tension elements of the procedure broadly followed ASTM E8/E8M. The cyclic protocol itself is not a standardized test but a purpose-designed method, used in our previous work</w:t>
       </w:r>
       <w:r>
         <w:t xml:space="preserve"> </w:t>
@@ -574,7 +580,7 @@
         <w:t xml:space="preserve">(Ref 18)</w:t>
       </w:r>
       <w:r>
-        <w:t xml:space="preserve">. Unless stated otherwise, the gauge length was 127 mm (5.000 in), and the crosshead speed, where the record states it (Table S1), was 0.25 in min⁻¹, a nominal strain rate of 8.3 × 10⁻⁴ s⁻¹. Engineering stress was computed from the specimen diameter entered in the instrument record, and engineering strain is crosshead extension divided by the gauge length, without extensometry. No correction for load-train compliance or grip slip was applied, so the elastic portion of each curve carries the compliance of the load train and the moduli in</w:t>
+        <w:t xml:space="preserve">, for evaluating reversible transformation and strain recovery in fine superelastic wire. Unless stated otherwise, the gauge length was 127 mm (5.000 in), and the crosshead speed, where recorded (Table S1), was 0.25 in min⁻¹, corresponding to a nominal strain rate of 8.3 × 10⁻⁴ s⁻¹. Engineering stress was computed from the specimen diameter entered in the instrument record, and engineering strain was taken as the crosshead extension divided by the gauge length, without extensometry. No correction for load-train compliance or grip slip was applied; the elastic portion of each curve therefore includes the load-train compliance, and the moduli in</w:t>
       </w:r>
       <w:r>
         <w:t xml:space="preserve"> </w:t>
@@ -590,7 +596,7 @@
         <w:t xml:space="preserve"> </w:t>
       </w:r>
       <w:r>
-        <w:t xml:space="preserve">are apparent rather than true. The protocol is designed to reveal superelasticity, which appears as strain recovered on unloading beyond the elastic springback. Three specimens were tested for each condition of</w:t>
+        <w:t xml:space="preserve">are apparent rather than true. The protocol is designed to reveal superelasticity, which appears as strain recovered on unloading beyond the elastic springback. Three specimens were tested for each condition in</w:t>
       </w:r>
       <w:r>
         <w:t xml:space="preserve"> </w:t>
@@ -603,7 +609,7 @@
         <w:t xml:space="preserve">Table 2</w:t>
       </w:r>
       <w:r>
-        <w:t xml:space="preserve">; every value there is the mean of the three, and the quoted uncertainty is one standard deviation. These properties were read from the incrementally cycled specimens rather than from separate monotonic tests, so they depend on the protocol. The aged condition (</w:t>
+        <w:t xml:space="preserve">; every value in the table is the mean of the three, and the quoted uncertainty is one standard deviation. These properties were determined from the incrementally cycled specimens rather than from separate monotonic tests and therefore depend on the protocol. The aged condition (</w:t>
       </w:r>
       <w:r>
         <w:rPr>
@@ -613,7 +619,7 @@
         <w:t xml:space="preserve">Fig. 2f</w:t>
       </w:r>
       <w:r>
-        <w:t xml:space="preserve">) was tested on a single specimen, and each prolonged-anneal and cyclically treated condition on one or two specimens (Table S1).</w:t>
+        <w:t xml:space="preserve">) was tested on a single specimen, and each prolonged-anneal and cyclically treated condition was tested on one or two specimens (Table S1).</w:t>
       </w:r>
     </w:p>
     <w:p>
@@ -621,7 +627,7 @@
         <w:pStyle w:val="BodyText"/>
       </w:pPr>
       <w:r>
-        <w:t xml:space="preserve">The strain rate is quasi-static. Superelastic alloys are rate-sensitive chiefly because the latent heat of transformation warms the specimen when it cannot be conducted away fast enough, raising the stress needed to continue the transformation</w:t>
+        <w:t xml:space="preserve">This strain rate is quasi-static. Superelastic alloys are rate-sensitive chiefly because the latent heat of transformation, when it cannot be conducted away fast enough, warms the specimen and raises the stress needed to continue the transformation</w:t>
       </w:r>
       <w:r>
         <w:t xml:space="preserve"> </w:t>
@@ -630,7 +636,7 @@
         <w:t xml:space="preserve">(Ref 19)</w:t>
       </w:r>
       <w:r>
-        <w:t xml:space="preserve">; this alters the stress–strain response of an alloy that transforms rather than suppressing the transformation, and it is expected to be weaker in Fe-Mn-Al-Ni, whose transformation stress depends only weakly on temperature (0.53 MPa °C⁻¹</w:t>
+        <w:t xml:space="preserve">. This self-heating effect alters the stress–strain response of a transforming alloy rather than suppressing the transformation, and it is expected to be weaker in Fe-Mn-Al-Ni, whose transformation stress depends only weakly on temperature (0.53 MPa °C⁻¹</w:t>
       </w:r>
       <w:r>
         <w:t xml:space="preserve"> </w:t>
@@ -647,7 +653,7 @@
         <w:pStyle w:val="BodyText"/>
       </w:pPr>
       <w:r>
-        <w:t xml:space="preserve">A special loading–unloading–heating test was also conducted to evaluate any potential shape-memory response, on one specimen of each alloy in the 1200 °C/1 min condition. The specimen was loaded to 3% strain and unloaded to zero stress, after which the crosshead was returned to its starting position (nominal zero strain). At the same time, the specimen was heated to ≈200 °C at ≈50 °C s⁻¹ and held for ≈10 s to trigger any potential reversal of martensite to austenite, and it was then reloaded. Any shape-memory effect would be revealed during the heating stage, which causes the reloading stress to rise at a strain lower than the residual strain after unloading.</w:t>
+        <w:t xml:space="preserve">A dedicated loading–unloading–heating test was also conducted on one specimen of each alloy in the 1200 °C/1 min condition to evaluate any shape-memory response. Each specimen was loaded to 3% strain and unloaded to zero stress, after which the crosshead was returned to its starting position (nominal zero strain). At the same time, the specimen was heated to ≈200 °C at ≈50 °C s⁻¹ and held for ≈10 s to trigger any reverse transformation of martensite to austenite; it was then reloaded. Any shape-memory effect would be revealed during the heating stage: it would cause the stress on reloading to rise at a strain lower than the residual strain after unloading.</w:t>
       </w:r>
     </w:p>
     <w:bookmarkEnd w:id="14"/>
@@ -665,7 +671,7 @@
         <w:pStyle w:val="FirstParagraph"/>
       </w:pPr>
       <w:r>
-        <w:t xml:space="preserve">To identify phase constitution and potential phase change, synchrotron XRD measurements were performed at the ultra-hard X-ray multifunctional application beamline BL12SW of the Shanghai Synchrotron Radiation Facility (SSRF)</w:t>
+        <w:t xml:space="preserve">To identify the phase constitution and any phase change, synchrotron X-ray diffraction (XRD) measurements were performed at the ultra-hard X-ray multifunctional application beamline BL12SW of the Shanghai Synchrotron Radiation Facility (SSRF)</w:t>
       </w:r>
       <w:r>
         <w:t xml:space="preserve"> </w:t>
@@ -674,7 +680,7 @@
         <w:t xml:space="preserve">(Ref 20,21)</w:t>
       </w:r>
       <w:r>
-        <w:t xml:space="preserve">. The incident wavelength was λ = 0.12587 Å with a beam size of 0.5 × 0.5 mm². Patterns were recorded in transmission on a 4288 × 4288-pixel area detector with 100 µm pixels, ≈1.83 m from the specimen; the beam center and the distance were fitted from the Debye–Scherrer rings themselves, consistent to better than 0.1% across six indexed rings, and a CeO₂ calibrant frame gives the same beam center. Two-dimensional Debye–Scherrer patterns, one or two frames per specimen, were collected from separate specimens of each alloy before and after tensile deformation (10% strain for the LLM alloy, 8% for the Omori alloy), the deformed specimens being measured after unloading, at zero load, and from the cyclically treated LLM-alloy rod (Sec. 3.3); one specimen was measured per alloy and condition (Table S1). These 2D images were processed using FIT2D</w:t>
+        <w:t xml:space="preserve">. The incident wavelength was λ = 0.12587 Å, and the beam size was 0.5 × 0.5 mm². Patterns were recorded in transmission on a 4288 × 4288-pixel area detector (100 µm pixels) located ≈1.83 m from the specimen. The beam center and the sample-to-detector distance were fitted from the Debye–Scherrer rings themselves and were consistent to better than 0.1% across six indexed rings; a CeO₂ calibrant frame gave the same beam center. Two-dimensional Debye–Scherrer patterns, one or two frames per specimen, were collected from separate specimens of each alloy before and after tensile deformation (10% strain for the LLM alloy, 8% for the Omori alloy) and from the cyclically treated LLM-alloy rod (Sec. 3.3). The deformed specimens were measured after unloading, at zero load. One specimen was measured per alloy and condition (Table S1). The 2D images were processed in FIT2D</w:t>
       </w:r>
       <w:r>
         <w:t xml:space="preserve"> </w:t>
@@ -683,7 +689,7 @@
         <w:t xml:space="preserve">(Ref 22)</w:t>
       </w:r>
       <w:r>
-        <w:t xml:space="preserve">, where diffraction data were sliced at 5-degree intervals along the 360-degree azimuth and integrated to generate 72 diffraction spectra, which were then fitted by Rietveld refinement</w:t>
+        <w:t xml:space="preserve">: the diffraction data were sliced at 5° intervals around the 360° azimuth and integrated to give 72 diffraction spectra, which were then fitted by Rietveld refinement</w:t>
       </w:r>
       <w:r>
         <w:t xml:space="preserve"> </w:t>
@@ -712,7 +718,7 @@
         <w:pStyle w:val="BodyText"/>
       </w:pPr>
       <w:r>
-        <w:t xml:space="preserve">All 72 spectra of each LLM-alloy pattern, undeformed and after 10% strain, were refined simultaneously against a three-phase model — γ (Fm-3m), α (Im-3m) and D0₃ Fe₃Al (Fm-3m) — with lattice parameters fixed at a = 3.6366, 2.8865 and 5.7734 Å, respectively (5.7801 Å for D0₃ in the refinement of the deformed specimen). Crystallographic texture, which is strong in the cold-drawn wire, was treated with the E-WIMV orientation-distribution algorithm rather than by a preferred-orientation correction, so the azimuthal dimension was retained in the fit; its resolution was 2° for the undeformed pattern and 5° for the deformed one. Peak profiles were pseudo-Voigt, with the instrumental contribution described by a d-dependent Caglioti function and the specimen contribution by Popa’s anisotropic crystallite-size model; the background of each spectrum was described by interpolated points, with a sixth-order polynomial also refined for the deformed specimen. In the final refinement of the undeformed pattern the refined variables were the incident-intensity scale, seven detector-geometry terms (among them the sample-to-detector distance, refined to 1827.4 mm) and four crystallite-size terms; in that of the deformed pattern they were the seven background coefficients and four crystallite-size terms. The crystallite-size terms serve only to describe peak shape and are not interpreted. The phase fractions were not varied in either final refinement: those of the undeformed pattern were held at 0.62, 0.34 and 0.04, the values of an earlier refinement stage, and those of the deformed pattern at 0.608, 0.351 and 0.041, so neither set carries a least-squares uncertainty, and the second is not an independent measurement of the deformed specimen. Refinement proved feasible for the LLM alloy only; the reason is given in Sec. 3.3.</w:t>
+        <w:t xml:space="preserve">For each LLM-alloy pattern, undeformed and after 10% strain, all 72 spectra were refined simultaneously against a three-phase model of γ (Fm-3m), α (Im-3m) and D0₃ Fe₃Al (Fm-3m), with lattice parameters fixed at a = 3.6366, 2.8865 and 5.7734 Å, respectively (5.7801 Å for D0₃ in the refinement of the deformed specimen). Crystallographic texture, which is strong in the cold-drawn wire, was modeled with the E-WIMV orientation-distribution algorithm rather than with a preferred-orientation correction, so the azimuthal dimension was retained in the fit; the E-WIMV resolution was 2° for the undeformed pattern and 5° for the deformed one. Peak profiles were modeled as pseudo-Voigt functions, with the instrumental contribution described by a d-dependent Caglioti function and the specimen contribution by Popa’s anisotropic crystallite-size model. The background of each spectrum was described by interpolated points, and a sixth-order polynomial was also refined for the deformed specimen. In the final refinement of the undeformed pattern, the refined variables were the incident-intensity scale, seven detector-geometry terms (including the sample-to-detector distance, refined to 1827.4 mm) and four crystallite-size terms; in the final refinement of the deformed pattern, they were the seven background coefficients and four crystallite-size terms. The crystallite-size terms serve only to describe peak shape and are not interpreted. The phase fractions were not varied in either final refinement. Those of the undeformed pattern were held at 0.62, 0.34 and 0.04, the values obtained at an earlier refinement stage, and those of the deformed pattern at 0.608, 0.351 and 0.041. Consequently, neither set carries a least-squares uncertainty, and the second set is not an independent measurement of the deformed specimen. Refinement proved feasible for the LLM alloy only; the reason is given in Sec. 3.3.</w:t>
       </w:r>
     </w:p>
     <w:bookmarkEnd w:id="15"/>
@@ -751,7 +757,10 @@
         <w:t xml:space="preserve">(Ref 26)</w:t>
       </w:r>
       <w:r>
-        <w:t xml:space="preserve">, at 1 atm over 400–1400 °C (temperature grids in Table S2), on the measured chemistries of</w:t>
+        <w:t xml:space="preserve"> </w:t>
+      </w:r>
+      <w:r>
+        <w:t xml:space="preserve">at 1 atm over 400–1400 °C (temperature grids in Table S2). The inputs were the measured chemistries of</w:t>
       </w:r>
       <w:r>
         <w:t xml:space="preserve"> </w:t>
@@ -794,7 +803,7 @@
         <w:t xml:space="preserve">(Ref 30)</w:t>
       </w:r>
       <w:r>
-        <w:t xml:space="preserve">, which carries all six elements and P. Where a database does not assess an element present in the alloy, that element was omitted and the remainder renormalized. Omitting Si, a ferrite stabilizer, biases mpea-02b toward γ; both Si-bearing databases return less α at 1200 °C than mpea-02b does (Table 3), so the calculated two-phase constitution is not an artifact of that omission. PrecHiMn-04 is assessed for high-Mn steels at far lower Al than here and returns an unphysical β-Mn-dominated result below ≈600 °C, so its low-temperature results are used only with that caveat. Results shared by the databases able to evaluate them are distinguished in Sec. 3.4 from results that rest on one database. To separate the roles of the alloying elements, the calculations were repeated for the measured LLM-alloy chemistry with carbon removed and every other element held fixed, with nickel raised stepwise to the Omori alloy’s 7.8 at%, and for the nominal composition, the nominal composition with aluminum raised stepwise to the A2 ceiling of 12 wt%, and three points of the A2 range. Settings and phase lists are given in Table S2 (Online Resource 2). The calculations describe equilibrium, whereas the wires were annealed briefly and cooled; they indicate which phases are stable at the treatment temperature, not the as-quenched state.</w:t>
+        <w:t xml:space="preserve">, which carries all six elements and P. Where a database did not assess an element present in the alloy, that element was omitted and the remaining composition renormalized. Omitting Si, a ferrite stabilizer, biases mpea-02b toward γ. However, both Si-bearing databases return less α at 1200 °C than mpea-02b does (Table 3), so the calculated two-phase constitution is not an artifact of that omission. PrecHiMn-04 was assessed for high-Mn steels at Al contents far lower than those of the present alloys and returns an unphysical β-Mn-dominated result below ≈600 °C; its low-temperature results are therefore used only with that caveat. Results shared by the databases able to evaluate them are distinguished in Sec. 3.4 from those that rest on one database. To separate the roles of the alloying elements, the calculations were repeated for the measured LLM-alloy chemistry with carbon removed and every other element held fixed; for the measured chemistry with nickel raised stepwise to the Omori alloy’s 7.8 at%; for the nominal composition; for the nominal composition with aluminum raised stepwise to the A2 ceiling of 12 wt%; and for three points of the A2 range. Settings and phase lists are given in Table S2 (Online Resource 2). The calculations describe equilibrium, whereas the wires were annealed briefly and cooled; they indicate which phases are stable at the treatment temperature, not the as-quenched state.</w:t>
       </w:r>
     </w:p>
     <w:p>
@@ -806,13 +815,13 @@
     </w:p>
     <w:bookmarkEnd w:id="16"/>
     <w:bookmarkEnd w:id="17"/>
-    <w:bookmarkStart w:id="22" w:name="experiment-results"/>
+    <w:bookmarkStart w:id="22" w:name="experimental-results"/>
     <w:p>
       <w:pPr>
         <w:pStyle w:val="Heading1"/>
       </w:pPr>
       <w:r>
-        <w:t xml:space="preserve">3. Experiment Results</w:t>
+        <w:t xml:space="preserve">3. Experimental Results</w:t>
       </w:r>
     </w:p>
     <w:bookmarkStart w:id="18" w:name="microstructure"/>
@@ -839,7 +848,7 @@
         <w:t xml:space="preserve"> </w:t>
       </w:r>
       <w:r>
-        <w:t xml:space="preserve">shows the microstructure of the LLM alloy after heat treatment at 1200 °C for 1 minute. The material exhibits a fine-grained equiaxed microstructure with grain diameters well under 20 µm; this and the other grain sizes quoted here are visual estimates from the micrographs, not stereological measurements. Scanning electron microscopy (</w:t>
+        <w:t xml:space="preserve">shows the microstructure of the LLM alloy after heat treatment at 1200 °C for 1 minute. The alloy has a fine-grained, equiaxed microstructure with grain diameters well under 20 µm; this and the other grain sizes quoted here are visual estimates from the micrographs, not stereological measurements. Scanning electron microscopy (</w:t>
       </w:r>
       <w:r>
         <w:rPr>
@@ -849,7 +858,7 @@
         <w:t xml:space="preserve">Fig. 1b</w:t>
       </w:r>
       <w:r>
-        <w:t xml:space="preserve">) resolves this morphology as an intimately interlocked mixture of a darker gray constituent and brighter, blocky islands. EDS detected higher Al in the darker constituent and higher Mn in the brighter one, consistent with a dual-phase structure in which the Al-rich areas are BCC α-phase and the Mn-rich areas are FCC γ-phase. EDS was used qualitatively: it cannot quantify carbon, and chemistry alone does not identify a crystal structure, so the assignment of the two constituents to α and γ rests jointly on this partitioning, on the diffraction of Sec. 3.3 and on the calculated partitioning of Sec. 3.4. Prolonging the anneal to 40 minutes at the same temperature (</w:t>
+        <w:t xml:space="preserve">) resolves this morphology into an intimately interlocked mixture of a darker gray constituent and brighter, blocky islands. EDS detected a higher Al content in the darker constituent and a higher Mn content in the brighter one, consistent with a dual-phase structure in which the Al-rich regions are BCC α-phase and the Mn-rich regions are FCC γ-phase. EDS was used qualitatively: it cannot quantify carbon, and chemistry alone does not identify a crystal structure, so the assignment of the two constituents to α and γ rests jointly on this partitioning, on the diffraction results of Sec. 3.3 and on the calculated partitioning of Sec. 3.4. Extending the anneal to 40 minutes at the same temperature (</w:t>
       </w:r>
       <w:r>
         <w:rPr>
@@ -859,7 +868,7 @@
         <w:t xml:space="preserve">Fig. 1c</w:t>
       </w:r>
       <w:r>
-        <w:t xml:space="preserve">) produces severe coarsening: the initial fine structure is replaced by a coarse one with individual grains exceeding 100 µm in width, in which two constituents remain visible. The 0.36 mm wire after the quartz-tube cyclic treatment of Sec. 2.2 (</w:t>
+        <w:t xml:space="preserve">) caused severe coarsening: the initial fine structure was replaced by a coarse one with individual grains exceeding 100 µm in width, in which two constituents remain visible. After the quartz-tube cyclic treatment of Sec. 2.2, the 0.36 mm wire (</w:t>
       </w:r>
       <w:r>
         <w:rPr>
@@ -869,7 +878,7 @@
         <w:t xml:space="preserve">Fig. 1d</w:t>
       </w:r>
       <w:r>
-        <w:t xml:space="preserve">) retains a fine, banded two-constituent structure across the whole section, and no grain approaches the wire diameter, so no bamboo structure formed. Its lath-like appearance may reflect products of a transformation on quenching rather than true grains; electron backscatter diffraction would be needed to tell them apart.</w:t>
+        <w:t xml:space="preserve">) retains a fine, banded two-constituent structure across its whole cross-section; no grain approaches the wire diameter, so no bamboo structure formed. The lath-like appearance of this structure may reflect transformation products formed on quenching rather than true grains; electron backscatter diffraction would be needed to distinguish between the two.</w:t>
       </w:r>
     </w:p>
     <w:bookmarkEnd w:id="18"/>
@@ -887,12 +896,6 @@
         <w:pStyle w:val="FirstParagraph"/>
       </w:pPr>
       <w:r>
-        <w:t xml:space="preserve">Cyclic tensile stress–strain curves for the LLM alloy after heat treatment at different temperatures are shown in</w:t>
-      </w:r>
-      <w:r>
-        <w:t xml:space="preserve"> </w:t>
-      </w:r>
-      <w:r>
         <w:rPr>
           <w:b/>
           <w:bCs/>
@@ -900,7 +903,10 @@
         <w:t xml:space="preserve">Fig. 2</w:t>
       </w:r>
       <w:r>
-        <w:t xml:space="preserve">, and the corresponding data are listed in</w:t>
+        <w:t xml:space="preserve"> </w:t>
+      </w:r>
+      <w:r>
+        <w:t xml:space="preserve">shows cyclic tensile stress–strain curves of the LLM alloy after heat treatment at different temperatures, and</w:t>
       </w:r>
       <w:r>
         <w:t xml:space="preserve"> </w:t>
@@ -913,7 +919,10 @@
         <w:t xml:space="preserve">Table 2</w:t>
       </w:r>
       <w:r>
-        <w:t xml:space="preserve">. This information reveals a broad picture of how heat treatment governs the alloy’s mechanical properties. The response is strongly anneal-dependent: low strand-anneal temperatures (600–700 °C) leave the wire with high strength but little ductility (tensile strengths of ≈1876–2254 MPa and yield strengths of ≈1635–1908 MPa, but elongation of only ≈2%), consistent with incomplete recrystallization of the cold-drawn wire, whereas annealing at 800–1200 °C progressively softens the wire and restores ductility, with elongation peaking near 33% at 1000 °C. The apparent elastic modulus, E, stays in the ≈150–162 GPa range across the annealed conditions. In the recrystallized conditions (800–1200 °C,</w:t>
+        <w:t xml:space="preserve"> </w:t>
+      </w:r>
+      <w:r>
+        <w:t xml:space="preserve">lists the corresponding data. Together, they give a broad picture of how heat treatment governs the mechanical properties of the alloy. The response depends strongly on the annealing temperature: low strand-anneal temperatures (600–700 °C) left the wire with high strength but little ductility (tensile strengths of ≈1876–2254 MPa and yield strengths of ≈1635–1908 MPa, with elongation of only ≈2%), consistent with incomplete recrystallization of the cold-drawn wire. Annealing at 800–1200 °C, by contrast, progressively softened the wire and restored ductility, with elongation peaking near 33% at 1000 °C. The apparent elastic modulus, E, remained within ≈150–162 GPa across the annealed conditions. In the recrystallized conditions (800–1200 °C,</w:t>
       </w:r>
       <w:r>
         <w:t xml:space="preserve"> </w:t>
@@ -926,7 +935,7 @@
         <w:t xml:space="preserve">Fig. 2c–e</w:t>
       </w:r>
       <w:r>
-        <w:t xml:space="preserve">) the unloading segments are straight and parallel to the initial loading line and return no strain beyond the elastic strain (σ/E) expected at the unload stress: the strain recovery is consistent with elastic springback alone, with no pseudoelastic contribution resolvable at the scale of</w:t>
+        <w:t xml:space="preserve">), the unloading segments are straight and parallel to the initial loading line, and they return no strain beyond the elastic strain (σ/E) expected at the unloading stress: the strain recovery is consistent with elastic springback alone, with no pseudoelastic contribution resolvable at the scale of</w:t>
       </w:r>
       <w:r>
         <w:t xml:space="preserve"> </w:t>
@@ -939,7 +948,7 @@
         <w:t xml:space="preserve">Fig. 2</w:t>
       </w:r>
       <w:r>
-        <w:t xml:space="preserve">. The flat flow stress that follows yielding at 800 °C (</w:t>
+        <w:t xml:space="preserve">. The flat part of the curve that follows yielding at 800 °C (</w:t>
       </w:r>
       <w:r>
         <w:rPr>
@@ -962,7 +971,7 @@
         <w:t xml:space="preserve">Fig. 2a, b</w:t>
       </w:r>
       <w:r>
-        <w:t xml:space="preserve">), loading is non-linear and the unloading line from the highest load is less steep than the initial loading line, so that it returns up to ≈0.3% more strain than σ/E, with a narrow unloading–reloading loop and no plateau; this small non-linearity of the heavily cold-worked wire is reported but not interpreted here, and these conditions fracture at ≈2% strain. Because E is an apparent crosshead modulus (Sec. 2.4), these are statements about the shape of the unloading curves rather than measured recovery limits. It has been reported that aging at 200 °C can improve the pseudoelasticity of Fe-Mn-Al-Ni alloys</w:t>
+        <w:t xml:space="preserve">), loading is non-linear, and the unloading line from the highest load is less steep than the initial loading line, so it returns up to ≈0.3% more strain than σ/E; the unloading–reloading loop is narrow, and there is no plateau. This small non-linearity of the heavily cold-worked wire is reported but not interpreted here; these conditions fractured at ≈2% strain. Because E is an apparent crosshead modulus (Sec. 2.4), these observations describe the shape of the unloading curves rather than measured recovery limits. It has been reported that aging at 200 °C can improve the pseudoelasticity of Fe-Mn-Al-Ni alloys</w:t>
       </w:r>
       <w:r>
         <w:t xml:space="preserve"> </w:t>
@@ -999,7 +1008,7 @@
         <w:t xml:space="preserve"> </w:t>
       </w:r>
       <w:r>
-        <w:t xml:space="preserve">compares the stress–strain behavior of the LLM and Omori alloys during the loading–unloading–heating test. In this test, any residual stress-induced martensite present at zero stress should transform back to austenite upon heating, causing the reloading stress to rise at a strain lower than the last unloading strain. This is what happened in the Omori alloy, in the single test made on it:</w:t>
+        <w:t xml:space="preserve">compares the stress–strain behavior of the LLM and Omori alloys in the loading–unloading–heating test. In this test, any stress-induced martensite remaining at zero stress should transform back to austenite on heating, causing the reloading stress to rise at a strain lower than the residual strain after unloading. This occurred in the Omori alloy in the single test performed on it:</w:t>
       </w:r>
       <w:r>
         <w:t xml:space="preserve"> </w:t>
@@ -1015,7 +1024,7 @@
         <w:t xml:space="preserve"> </w:t>
       </w:r>
       <w:r>
-        <w:t xml:space="preserve">shows that its residual strain after unloading from 3% deformation is ≈2.2%, and upon reloading, stress rises at a strain of ≈1.7%. This 0.5% heating-induced (shape-memory) recovery, a single observation, is evidence of stress-induced martensite in the Omori alloy that was stable enough to survive unloading but transformed back to austenite upon heating. By contrast,</w:t>
+        <w:t xml:space="preserve">shows that its residual strain after unloading from 3% strain is ≈2.2%, and that on reloading the stress rises at a strain of ≈1.7%. This 0.5% heating-induced (shape-memory) recovery, a single observation, is evidence of stress-induced martensite in the Omori alloy that was stable enough to survive unloading but transformed back to austenite upon heating. By contrast,</w:t>
       </w:r>
       <w:r>
         <w:t xml:space="preserve"> </w:t>
@@ -1031,7 +1040,7 @@
         <w:t xml:space="preserve"> </w:t>
       </w:r>
       <w:r>
-        <w:t xml:space="preserve">shows no strain recovery of the LLM alloy in this test. The test was made on one specimen in the 1200 °C/1 min condition, and what it shows is confined to that state: no stress-induced martensite stable enough to survive unloading was present to revert on heating. The unloading evidence is broader, since no condition of</w:t>
+        <w:t xml:space="preserve">shows no strain recovery for the LLM alloy in this test. The test was performed on one specimen in the 1200 °C/1 min condition, and its result is confined to that state: no stress-induced martensite stable enough to survive unloading was present to revert on heating. The unloading evidence is broader: apart from the small non-linearity of the unrecrystallized wire noted above, no condition in</w:t>
       </w:r>
       <w:r>
         <w:t xml:space="preserve"> </w:t>
@@ -1047,7 +1056,7 @@
         <w:t xml:space="preserve"> </w:t>
       </w:r>
       <w:r>
-        <w:t xml:space="preserve">shows a transformation plateau or recovery beyond σ/E, apart from the small non-linearity of the unrecrystallized wire noted above. Within the conditions reported here, no stress-induced phase transformation was detected in the LLM alloy.</w:t>
+        <w:t xml:space="preserve">shows a transformation plateau or recovery beyond σ/E. Within the conditions reported here, no stress-induced phase transformation was detected in the LLM alloy.</w:t>
       </w:r>
     </w:p>
     <w:p>
@@ -1055,10 +1064,7 @@
         <w:pStyle w:val="BodyText"/>
       </w:pPr>
       <w:r>
-        <w:t xml:space="preserve">The longer and cyclic treatments of Sec. 2.2 did not change this result, and the coarsened conditions were brittle. After the 40-minute hold at 1200 °C of</w:t>
-      </w:r>
-      <w:r>
-        <w:t xml:space="preserve"> </w:t>
+        <w:t xml:space="preserve">The longer and cyclic treatments of Sec. 2.2 did not change this result, and the coarsened conditions were brittle. After the 40-minute hold at 1200 °C (</w:t>
       </w:r>
       <w:r>
         <w:rPr>
@@ -1068,7 +1074,7 @@
         <w:t xml:space="preserve">Fig. 1c</w:t>
       </w:r>
       <w:r>
-        <w:t xml:space="preserve">, followed by the 200 °C/3 h age, the wire failed at 0.8% elongation, and after 80 minutes at 1200 °C the wire failed at 0.5%, in both cases within the first loading segment, before any unloading. The two-cycle rod specimens failed after 1.0% elongation and the three-cycle rod specimen tested on the 127 mm gauge after 0.5%. Every unloading segment recorded on the cyclically treated material — one in each two-cycle rod specimen, eight in a three-cycle rod specimen tested on a 6.0 mm gauge, and eight in the quartz-tube wire of</w:t>
+        <w:t xml:space="preserve">) followed by the 200 °C/3 h aging treatment, the wire failed at 0.8% elongation; after 80 minutes at 1200 °C, it failed at 0.5%. In both cases, failure occurred within the first loading segment, before any unloading. The two-cycle rod specimens failed at 1.0% elongation, and the three-cycle rod specimen tested on the 127 mm gauge failed at 0.5%. On the cyclically treated material, one unloading segment was recorded in each two-cycle rod specimen, eight in a three-cycle rod specimen tested on a 6.0 mm gauge, and eight in the quartz-tube wire of</w:t>
       </w:r>
       <w:r>
         <w:t xml:space="preserve"> </w:t>
@@ -1081,7 +1087,7 @@
         <w:t xml:space="preserve">Fig. 1d</w:t>
       </w:r>
       <w:r>
-        <w:t xml:space="preserve">, tested on a 25.4 mm gauge — is straight and returns no strain beyond σ/E (Table S1; records not shown). On the 6.0 mm gauge, crosshead strain is dominated by load-train and grip compliance, so the strains of that specimen are not compared with those on the 127 mm gauge. No loading–unloading–heating test is reported on cyclically treated material: the rod specimens tested on the 127 mm gauge fractured at 0.5–1.0%, below the 3% strain of that protocol, and the quartz-tube wire was not given that test.</w:t>
+        <w:t xml:space="preserve">, tested on a 25.4 mm gauge. Every recorded segment is straight and returns no strain beyond σ/E (Table S1; records not shown). On the 6.0 mm gauge, the crosshead strain is dominated by load-train and grip compliance, so the strains of that specimen are not compared with those measured on the 127 mm gauge. No loading–unloading–heating test is reported for the cyclically treated material: the rod specimens tested on the 127 mm gauge fractured at 0.5–1.0%, below the 3% strain that protocol requires, and the quartz-tube wire was not given that test.</w:t>
       </w:r>
     </w:p>
     <w:bookmarkEnd w:id="19"/>
@@ -1099,12 +1105,6 @@
         <w:pStyle w:val="FirstParagraph"/>
       </w:pPr>
       <w:r>
-        <w:t xml:space="preserve">Synchrotron XRD of samples before and after deformation is shown in</w:t>
-      </w:r>
-      <w:r>
-        <w:t xml:space="preserve"> </w:t>
-      </w:r>
-      <w:r>
         <w:rPr>
           <w:b/>
           <w:bCs/>
@@ -1112,126 +1112,283 @@
         <w:t xml:space="preserve">Fig. 4</w:t>
       </w:r>
       <w:r>
+        <w:t xml:space="preserve"> </w:t>
+      </w:r>
+      <w:r>
+        <w:t xml:space="preserve">shows synchrotron XRD patterns of samples before and after deformation.</w:t>
+      </w:r>
+      <w:r>
+        <w:t xml:space="preserve"> </w:t>
+      </w:r>
+      <w:r>
+        <w:rPr>
+          <w:b/>
+          <w:bCs/>
+        </w:rPr>
+        <w:t xml:space="preserve">Fig. 5</w:t>
+      </w:r>
+      <w:r>
+        <w:t xml:space="preserve"> </w:t>
+      </w:r>
+      <w:r>
+        <w:t xml:space="preserve">compares the experimental data (lower half of each panel) with the results of Rietveld refinement (upper half) for the LLM alloy before deformation (</w:t>
+      </w:r>
+      <w:r>
+        <w:rPr>
+          <w:b/>
+          <w:bCs/>
+        </w:rPr>
+        <w:t xml:space="preserve">Fig. 5a</w:t>
+      </w:r>
+      <w:r>
+        <w:t xml:space="preserve">, R_wp = 21.4%, R_p = 8.7%) and after unloading from 10% strain (</w:t>
+      </w:r>
+      <w:r>
+        <w:rPr>
+          <w:b/>
+          <w:bCs/>
+        </w:rPr>
+        <w:t xml:space="preserve">Fig. 5b</w:t>
+      </w:r>
+      <w:r>
+        <w:t xml:space="preserve">, R_wp = 12.5%, R_p = 5.9%). The fit is better for the deformed specimen, for a reason visible in the patterns: the undeformed wire gives a beaded, spotty ring pattern in which relatively few grains satisfy each Bragg condition, whereas deformation subdivides those grains and produces the more continuous rings on which powder averaging depends. The refinement of the undeformed pattern is therefore limited by grain statistics as well as by the strong drawing texture. The orientation distribution obtained from the refinement shows this texture along the wire axis: {111} and {100} fiber components in γ and a {110} fiber component in α, the components characteristic of cold-drawn FCC and BCC metals</w:t>
+      </w:r>
+      <w:r>
+        <w:t xml:space="preserve"> </w:t>
+      </w:r>
+      <w:r>
+        <w:t xml:space="preserve">(Ref 33)</w:t>
+      </w:r>
+      <w:r>
+        <w:t xml:space="preserve">. Subject to these limitations, the volume fractions of the LLM alloy estimated from the undeformed pattern (</w:t>
+      </w:r>
+      <w:r>
+        <w:rPr>
+          <w:b/>
+          <w:bCs/>
+        </w:rPr>
+        <w:t xml:space="preserve">Fig. 5a</w:t>
+      </w:r>
+      <w:r>
+        <w:t xml:space="preserve">) are ≈62% FCC γ-phase, ≈34% BCC α-phase and ≈4% of an ordered phase indexed as D0₃ Fe₃Al; these fractions are semi-quantitative, were held fixed in the final refinement (Sec. 2.5) and carry no uncertainty. The fractions were also held fixed in the refinement of the deformed pattern (</w:t>
+      </w:r>
+      <w:r>
+        <w:rPr>
+          <w:b/>
+          <w:bCs/>
+        </w:rPr>
+        <w:t xml:space="preserve">Fig. 5b</w:t>
+      </w:r>
+      <w:r>
+        <w:t xml:space="preserve">), so no fraction is reported as a measurement for that specimen. The diffraction patterns of the LLM alloy before and after deformation are essentially the same (</w:t>
+      </w:r>
+      <w:r>
+        <w:rPr>
+          <w:b/>
+          <w:bCs/>
+        </w:rPr>
+        <w:t xml:space="preserve">Fig. 4a, b</w:t>
+      </w:r>
+      <w:r>
+        <w:t xml:space="preserve">), and the relative peak intensities (</w:t>
+      </w:r>
+      <w:r>
+        <w:rPr>
+          <w:b/>
+          <w:bCs/>
+        </w:rPr>
+        <w:t xml:space="preserve">Fig. 6a</w:t>
+      </w:r>
+      <w:r>
+        <w:t xml:space="preserve">) are essentially unchanged: no new diffraction peaks appear, and none disappear.</w:t>
+      </w:r>
+    </w:p>
+    <w:p>
+      <w:pPr>
+        <w:pStyle w:val="BodyText"/>
+      </w:pPr>
+      <w:r>
+        <w:t xml:space="preserve">An ex-situ measurement made after unloading cannot, on its own, exclude a fully reversible transformation that reverts as the load is removed; the diffraction data are therefore not the primary evidence here. A transformation reversible enough to leave no diffraction signature after unloading would still have had to produce recoverable strain during that unloading, and the unloading segments of the 1200 °C/1 min condition (</w:t>
+      </w:r>
+      <w:r>
+        <w:rPr>
+          <w:b/>
+          <w:bCs/>
+        </w:rPr>
+        <w:t xml:space="preserve">Fig. 2e</w:t>
+      </w:r>
+      <w:r>
+        <w:t xml:space="preserve">), the condition of the diffraction specimens, return no strain beyond σ/E. The heating test of</w:t>
+      </w:r>
+      <w:r>
+        <w:t xml:space="preserve"> </w:t>
+      </w:r>
+      <w:r>
+        <w:rPr>
+          <w:b/>
+          <w:bCs/>
+        </w:rPr>
+        <w:t xml:space="preserve">Fig. 3a</w:t>
+      </w:r>
+      <w:r>
+        <w:t xml:space="preserve"> </w:t>
+      </w:r>
+      <w:r>
+        <w:t xml:space="preserve">narrows the remaining route in that state, since stress-induced martensite retained after unloading and able to revert on heating to ≈200 °C would have appeared as strain recovery. The unchanged pattern corroborates this mechanical evidence and describes the state retained after unloading; a loading-stage or in-situ measurement would be the direct test for a transient transformation (Sec. 4.3). The change from sharp, discrete spots in the undeformed state (</w:t>
+      </w:r>
+      <w:r>
+        <w:rPr>
+          <w:b/>
+          <w:bCs/>
+        </w:rPr>
+        <w:t xml:space="preserve">Fig. 4a</w:t>
+      </w:r>
+      <w:r>
+        <w:t xml:space="preserve">) to broader, partially arced rings after deformation (</w:t>
+      </w:r>
+      <w:r>
+        <w:rPr>
+          <w:b/>
+          <w:bCs/>
+        </w:rPr>
+        <w:t xml:space="preserve">Fig. 4b</w:t>
+      </w:r>
+      <w:r>
+        <w:t xml:space="preserve">) is consistent with dislocation activity, which broadens peaks and can form sub-grains. This change was not quantified by line-profile analysis, and texture evolution and the illumination of different grains in a separate specimen may also contribute.</w:t>
+      </w:r>
+    </w:p>
+    <w:p>
+      <w:pPr>
+        <w:pStyle w:val="BodyText"/>
+      </w:pPr>
+      <w:r>
+        <w:t xml:space="preserve">In comparison, the undeformed Omori alloy gives a pattern dominated by BCC α, with FCC γ reflections and a B2 superlattice reflection (</w:t>
+      </w:r>
+      <w:r>
+        <w:rPr>
+          <w:b/>
+          <w:bCs/>
+        </w:rPr>
+        <w:t xml:space="preserve">Fig. 4c</w:t>
+      </w:r>
+      <w:r>
+        <w:t xml:space="preserve">); the B2 reflection is attributed to β-NiAl-type ordering whose spatial scale was not examined. After 8% applied strain, the {111}γ reflection intensifies and the overlapping {200}α reflection redistributes in intensity (</w:t>
+      </w:r>
+      <w:r>
+        <w:rPr>
+          <w:b/>
+          <w:bCs/>
+        </w:rPr>
+        <w:t xml:space="preserve">Fig. 4d</w:t>
+      </w:r>
+      <w:r>
+        <w:t xml:space="preserve">), consistent with stress-induced γ formation and partial variant activation.</w:t>
+      </w:r>
+      <w:r>
+        <w:t xml:space="preserve"> </w:t>
+      </w:r>
+      <w:r>
+        <w:rPr>
+          <w:b/>
+          <w:bCs/>
+        </w:rPr>
+        <w:t xml:space="preserve">Fig. 6b</w:t>
+      </w:r>
+      <w:r>
+        <w:t xml:space="preserve"> </w:t>
+      </w:r>
+      <w:r>
+        <w:t xml:space="preserve">also shows the change in peak intensity of the Omori alloy after deformation. Unlike the LLM alloy, which retains grains well under 20 µm after the 1200 °C/1 min anneal (</w:t>
+      </w:r>
+      <w:r>
+        <w:rPr>
+          <w:b/>
+          <w:bCs/>
+        </w:rPr>
+        <w:t xml:space="preserve">Fig. 1a</w:t>
+      </w:r>
+      <w:r>
+        <w:t xml:space="preserve">), the Omori alloy coarsens at this temperature: its rings break up into a small number of discrete, intense spots (</w:t>
+      </w:r>
+      <w:r>
+        <w:rPr>
+          <w:b/>
+          <w:bCs/>
+        </w:rPr>
+        <w:t xml:space="preserve">Fig. 4c, d</w:t>
+      </w:r>
+      <w:r>
+        <w:t xml:space="preserve">), too few grains contribute to each reflection, and no Rietveld model could be brought into satisfactory agreement with its patterns. Phase fractions are therefore reported for the LLM alloy only, and the intensity changes of</w:t>
+      </w:r>
+      <w:r>
+        <w:t xml:space="preserve"> </w:t>
+      </w:r>
+      <w:r>
+        <w:rPr>
+          <w:b/>
+          <w:bCs/>
+        </w:rPr>
+        <w:t xml:space="preserve">Fig. 6b</w:t>
+      </w:r>
+      <w:r>
+        <w:t xml:space="preserve"> </w:t>
+      </w:r>
+      <w:r>
+        <w:t xml:space="preserve">are read qualitatively. No micrograph of the Omori alloy in the 1200 °C/1 min condition is available, so its grain size relative to the wire diameter, its grain morphology and its orientation are known only from these coarse, spotty diffraction patterns. The Omori alloy received no aging treatment. That the Omori alloy transformed under this route therefore rests on three observations, each limited on its own: the intensity changes of</w:t>
+      </w:r>
+      <w:r>
+        <w:t xml:space="preserve"> </w:t>
+      </w:r>
+      <w:r>
+        <w:rPr>
+          <w:b/>
+          <w:bCs/>
+        </w:rPr>
+        <w:t xml:space="preserve">Fig. 6b</w:t>
+      </w:r>
+      <w:r>
+        <w:t xml:space="preserve">, the single 0.5% heating recovery of</w:t>
+      </w:r>
+      <w:r>
+        <w:t xml:space="preserve"> </w:t>
+      </w:r>
+      <w:r>
+        <w:rPr>
+          <w:b/>
+          <w:bCs/>
+        </w:rPr>
+        <w:t xml:space="preserve">Fig. 3b</w:t>
+      </w:r>
+      <w:r>
+        <w:t xml:space="preserve">, and the established transformation behavior of this composition</w:t>
+      </w:r>
+      <w:r>
+        <w:t xml:space="preserve"> </w:t>
+      </w:r>
+      <w:r>
+        <w:t xml:space="preserve">(Ref 12–14)</w:t>
+      </w:r>
+      <w:r>
         <w:t xml:space="preserve">.</w:t>
       </w:r>
-      <w:r>
-        <w:t xml:space="preserve"> </w:t>
-      </w:r>
-      <w:r>
-        <w:rPr>
-          <w:b/>
-          <w:bCs/>
-        </w:rPr>
-        <w:t xml:space="preserve">Fig. 5</w:t>
-      </w:r>
-      <w:r>
-        <w:t xml:space="preserve"> </w:t>
-      </w:r>
-      <w:r>
-        <w:t xml:space="preserve">compares the experimental data (lower half of each panel) with the results of Rietveld refinement (upper half) for the LLM alloy before deformation (</w:t>
-      </w:r>
-      <w:r>
-        <w:rPr>
-          <w:b/>
-          <w:bCs/>
-        </w:rPr>
-        <w:t xml:space="preserve">Fig. 5a</w:t>
-      </w:r>
-      <w:r>
-        <w:t xml:space="preserve">, R_wp = 21.4%, R_p = 8.7%) and after unloading from 10% strain (</w:t>
-      </w:r>
-      <w:r>
-        <w:rPr>
-          <w:b/>
-          <w:bCs/>
-        </w:rPr>
-        <w:t xml:space="preserve">Fig. 5b</w:t>
-      </w:r>
-      <w:r>
-        <w:t xml:space="preserve">, R_wp = 12.5%, R_p = 5.9%). The fit is better for the deformed specimen, and the reason is visible in the patterns: the undeformed wire gives a beaded, spotty ring pattern in which relatively few grains satisfy each Bragg condition, whereas deformation subdivides those grains and gives the more continuous rings on which powder averaging depends. The refinement of the undeformed pattern is therefore limited by grain statistics as well as by the strong drawing texture. The orientation distribution from the refinement shows that texture along the wire axis: {111} and {100} fiber components in γ and a {110} fiber component in α, the components characteristic of cold-drawn FCC and BCC metals</w:t>
-      </w:r>
-      <w:r>
-        <w:t xml:space="preserve"> </w:t>
-      </w:r>
-      <w:r>
-        <w:t xml:space="preserve">(Ref 33)</w:t>
-      </w:r>
-      <w:r>
-        <w:t xml:space="preserve">. With that limitation, the LLM alloy is estimated from the undeformed pattern (</w:t>
-      </w:r>
-      <w:r>
-        <w:rPr>
-          <w:b/>
-          <w:bCs/>
-        </w:rPr>
-        <w:t xml:space="preserve">Fig. 5a</w:t>
-      </w:r>
-      <w:r>
-        <w:t xml:space="preserve">) to consist of ≈62% FCC γ-phase, ≈34% BCC α-phase, and ≈4% of an ordered phase indexed as D0₃ Fe₃Al, by volume; these fractions are semi-quantitative, were held fixed in the final refinement (Sec. 2.5) and carry no uncertainty. The fractions were also held fixed in the refinement of the deformed pattern (</w:t>
-      </w:r>
-      <w:r>
-        <w:rPr>
-          <w:b/>
-          <w:bCs/>
-        </w:rPr>
-        <w:t xml:space="preserve">Fig. 5b</w:t>
-      </w:r>
-      <w:r>
-        <w:t xml:space="preserve">), so no fraction is reported as a measurement for that specimen. Its diffraction patterns before and after deformation are essentially the same (</w:t>
-      </w:r>
-      <w:r>
-        <w:rPr>
-          <w:b/>
-          <w:bCs/>
-        </w:rPr>
-        <w:t xml:space="preserve">Fig. 4a, b</w:t>
-      </w:r>
-      <w:r>
-        <w:t xml:space="preserve">), and relative peak intensities (</w:t>
-      </w:r>
-      <w:r>
-        <w:rPr>
-          <w:b/>
-          <w:bCs/>
-        </w:rPr>
-        <w:t xml:space="preserve">Fig. 6a</w:t>
-      </w:r>
-      <w:r>
-        <w:t xml:space="preserve">) are essentially unchanged: no new diffraction peaks appear and none disappear.</w:t>
-      </w:r>
     </w:p>
     <w:p>
       <w:pPr>
         <w:pStyle w:val="BodyText"/>
       </w:pPr>
       <w:r>
-        <w:t xml:space="preserve">An ex-situ measurement made after unloading cannot, on its own, exclude a fully reversible transformation that reverts as the load is removed, and the diffraction data are therefore not the primary evidence here. A transformation reversible enough to leave no diffraction signature after unloading would still have had to produce recoverable strain during that unloading, and the unloading segments of the 1200 °C/1 min condition (</w:t>
-      </w:r>
-      <w:r>
-        <w:rPr>
-          <w:b/>
-          <w:bCs/>
-        </w:rPr>
-        <w:t xml:space="preserve">Fig. 2e</w:t>
-      </w:r>
-      <w:r>
-        <w:t xml:space="preserve">), the condition of the diffraction specimens, return no strain beyond σ/E. The heating test of</w:t>
-      </w:r>
-      <w:r>
-        <w:t xml:space="preserve"> </w:t>
-      </w:r>
-      <w:r>
-        <w:rPr>
-          <w:b/>
-          <w:bCs/>
-        </w:rPr>
-        <w:t xml:space="preserve">Fig. 3a</w:t>
-      </w:r>
-      <w:r>
-        <w:t xml:space="preserve"> </w:t>
-      </w:r>
-      <w:r>
-        <w:t xml:space="preserve">narrows the remaining route in that state, since stress-induced martensite retained after unloading and able to revert on heating to ≈200 °C would have appeared as strain recovery. The unchanged pattern corroborates this mechanical evidence and describes the state retained after unloading; a loading-stage or in-situ measurement would be the direct test for a transient transformation (Sec. 4.3). The shift from sharp, discrete spotty patterns in the undeformed state (</w:t>
+        <w:t xml:space="preserve">No B2 superlattice reflection was resolved in the LLM alloy above the detection limit of the present measurement. At the B2-allowed {200} superlattice position, the LLM alloy shows 0.50–1.06% of the maximum intensity, compared with 3.83–7.17% in the Omori alloy, and the LLM-alloy intensity is accounted for by D0₃, which produces the same reflection. The discriminating reflection is the D0₃-only {111} reflection. It is present in the LLM alloy at 0.49–1.02% of the maximum intensity, with a signal-to-noise ratio of 16–27 across four patterns (the 1200 °C/1 min wire before and after deformation, and two frames of the cyclically treated rod), and absent from the Omori alloy (0.19–0.28%, signal-to-noise ratio 2.3–2.9). The assignment of the ordered phase in the LLM alloy to D0₃ rests on these intensities. The spatial scale of this phase is not established: whether it is a coarse constituent, an intragranular precipitate or long-range order within the α itself cannot be decided from these patterns and would require transmission electron microscopy or atom-probe tomography. Nor can a B2 dispersion finer or more dilute than the detection limit be excluded. κ-carbide was not included in an alternative refinement model, so its presence at a small fraction is not excluded.</w:t>
+      </w:r>
+    </w:p>
+    <w:p>
+      <w:pPr>
+        <w:pStyle w:val="BodyText"/>
+      </w:pPr>
+      <w:r>
+        <w:t xml:space="preserve">After the three-cycle treatment of Sec. 2.2, the ≈1 mm LLM-alloy rod gave a pattern (not shown; Table S1) with the same γ, α and D0₃ reflections as</w:t>
+      </w:r>
+      <w:r>
+        <w:t xml:space="preserve"> </w:t>
       </w:r>
       <w:r>
         <w:rPr>
@@ -1241,158 +1398,7 @@
         <w:t xml:space="preserve">Fig. 4a</w:t>
       </w:r>
       <w:r>
-        <w:t xml:space="preserve">) to broader, partially arced rings after deformation (</w:t>
-      </w:r>
-      <w:r>
-        <w:rPr>
-          <w:b/>
-          <w:bCs/>
-        </w:rPr>
-        <w:t xml:space="preserve">Fig. 4b</w:t>
-      </w:r>
-      <w:r>
-        <w:t xml:space="preserve">) is consistent with dislocation activity, which broadens peaks and can form sub-grains; it was not quantified by line-profile analysis, and texture evolution and the different grains illuminated in a separate specimen may also contribute.</w:t>
-      </w:r>
-    </w:p>
-    <w:p>
-      <w:pPr>
-        <w:pStyle w:val="BodyText"/>
-      </w:pPr>
-      <w:r>
-        <w:t xml:space="preserve">In comparison, the Omori alloy presents a BCC α-dominated pattern with FCC γ reflections and a B2 superlattice reflection, attributed to β-NiAl-type ordering whose spatial scale was not examined, in the undeformed state (</w:t>
-      </w:r>
-      <w:r>
-        <w:rPr>
-          <w:b/>
-          <w:bCs/>
-        </w:rPr>
-        <w:t xml:space="preserve">Fig. 4c</w:t>
-      </w:r>
-      <w:r>
-        <w:t xml:space="preserve">); after 8% applied strain, the {111}γ reflection intensifies and the overlapping {200}α redistributes in intensity (</w:t>
-      </w:r>
-      <w:r>
-        <w:rPr>
-          <w:b/>
-          <w:bCs/>
-        </w:rPr>
-        <w:t xml:space="preserve">Fig. 4d</w:t>
-      </w:r>
-      <w:r>
-        <w:t xml:space="preserve">), consistent with stress-induced γ formation and partial variant activation. The change in peak intensity after deformation of the Omori alloy is also shown in</w:t>
-      </w:r>
-      <w:r>
-        <w:t xml:space="preserve"> </w:t>
-      </w:r>
-      <w:r>
-        <w:rPr>
-          <w:b/>
-          <w:bCs/>
-        </w:rPr>
-        <w:t xml:space="preserve">Fig. 6b</w:t>
-      </w:r>
-      <w:r>
-        <w:t xml:space="preserve">. Unlike the LLM alloy, which retains grains well under 20 µm after the 1200 °C/1 min anneal (</w:t>
-      </w:r>
-      <w:r>
-        <w:rPr>
-          <w:b/>
-          <w:bCs/>
-        </w:rPr>
-        <w:t xml:space="preserve">Fig. 1a</w:t>
-      </w:r>
-      <w:r>
-        <w:t xml:space="preserve">), the Omori alloy coarsens at this temperature: its rings break up into a small number of discrete, intense spots (</w:t>
-      </w:r>
-      <w:r>
-        <w:rPr>
-          <w:b/>
-          <w:bCs/>
-        </w:rPr>
-        <w:t xml:space="preserve">Fig. 4c, d</w:t>
-      </w:r>
-      <w:r>
-        <w:t xml:space="preserve">), too few grains contribute to each reflection, and no Rietveld model could be brought into satisfactory agreement with its patterns. Phase fractions are therefore reported for the LLM alloy only, and the intensity changes of</w:t>
-      </w:r>
-      <w:r>
-        <w:t xml:space="preserve"> </w:t>
-      </w:r>
-      <w:r>
-        <w:rPr>
-          <w:b/>
-          <w:bCs/>
-        </w:rPr>
-        <w:t xml:space="preserve">Fig. 6b</w:t>
-      </w:r>
-      <w:r>
-        <w:t xml:space="preserve"> </w:t>
-      </w:r>
-      <w:r>
-        <w:t xml:space="preserve">are read qualitatively. No micrograph of the Omori alloy in the 1200 °C/1 min condition is available, so its grain size relative to the wire diameter, its grain morphology and its orientation are known only from this coarse, spotty diffraction; it received no aging treatment. That the Omori alloy transformed under this route therefore rests on three observations, each limited on its own: the intensity changes of</w:t>
-      </w:r>
-      <w:r>
-        <w:t xml:space="preserve"> </w:t>
-      </w:r>
-      <w:r>
-        <w:rPr>
-          <w:b/>
-          <w:bCs/>
-        </w:rPr>
-        <w:t xml:space="preserve">Fig. 6b</w:t>
-      </w:r>
-      <w:r>
-        <w:t xml:space="preserve">, the single 0.5% heating recovery of</w:t>
-      </w:r>
-      <w:r>
-        <w:t xml:space="preserve"> </w:t>
-      </w:r>
-      <w:r>
-        <w:rPr>
-          <w:b/>
-          <w:bCs/>
-        </w:rPr>
-        <w:t xml:space="preserve">Fig. 3b</w:t>
-      </w:r>
-      <w:r>
-        <w:t xml:space="preserve">, and the established transformation behavior of this composition</w:t>
-      </w:r>
-      <w:r>
-        <w:t xml:space="preserve"> </w:t>
-      </w:r>
-      <w:r>
-        <w:t xml:space="preserve">(Ref 12–14)</w:t>
-      </w:r>
-      <w:r>
-        <w:t xml:space="preserve">.</w:t>
-      </w:r>
-    </w:p>
-    <w:p>
-      <w:pPr>
-        <w:pStyle w:val="BodyText"/>
-      </w:pPr>
-      <w:r>
-        <w:t xml:space="preserve">No B2 superlattice reflection was resolved in the LLM alloy above the detection limit of the present measurement. At the B2-allowed {200} superlattice position the LLM alloy carries 0.50–1.06% of maximum intensity, against 3.83–7.17% in the Omori alloy, and that intensity is accounted for by D0₃, which produces the same reflection. The discriminating reflection is the D0₃-only {111}, present in the LLM alloy at 0.49–1.02% of maximum with a signal-to-noise ratio of 16–27 across four patterns (the 1200 °C/1 min wire before and after deformation, and two frames of the cyclically treated rod), and absent from the Omori alloy (0.19–0.28%, signal-to-noise ratio 2.3–2.9). The assignment of the ordered phase in the LLM alloy to D0₃ rests on these intensities. Its spatial scale is not established: whether it is a coarse constituent, an intragranular precipitate or long-range order within the α itself cannot be decided from these patterns, and transmission electron microscopy or atom-probe tomography would be required. Nor can a B2 dispersion finer or more dilute than the detection limit be excluded. κ-carbide was not included in an alternative refinement model, so it is not excluded at a small fraction.</w:t>
-      </w:r>
-    </w:p>
-    <w:p>
-      <w:pPr>
-        <w:pStyle w:val="BodyText"/>
-      </w:pPr>
-      <w:r>
-        <w:t xml:space="preserve">The ≈1 mm LLM-alloy rod after the three-cycle treatment of Sec. 2.2 gave a pattern (not shown; Table S1) containing the same γ, α and D0₃ reflections as</w:t>
-      </w:r>
-      <w:r>
-        <w:t xml:space="preserve"> </w:t>
-      </w:r>
-      <w:r>
-        <w:rPr>
-          <w:b/>
-          <w:bCs/>
-        </w:rPr>
-        <w:t xml:space="preserve">Fig. 4a</w:t>
-      </w:r>
-      <w:r>
-        <w:t xml:space="preserve">, with the ring intensity resolved into more discrete spots. The dual-phase constitution is therefore retained at room temperature after that treatment as after the single anneal; whether it is also the constitution at 1200 °C cannot be established from room-temperature diffraction and is taken up in Sec. 4.1.</w:t>
+        <w:t xml:space="preserve">, but with the ring intensity broken up into more discrete spots. The dual-phase constitution is therefore retained at room temperature after this treatment, as it is after the single anneal; whether it is also the constitution at 1200 °C cannot be established from room-temperature diffraction and is discussed in Sec. 4.1.</w:t>
       </w:r>
     </w:p>
     <w:bookmarkEnd w:id="20"/>
@@ -1420,7 +1426,7 @@
         <w:t xml:space="preserve"> </w:t>
       </w:r>
       <w:r>
-        <w:t xml:space="preserve">gives the calculated equilibrium constitution at 1200 °C, the solution-treatment temperature. The Omori alloy is calculated to be single-phase α at that temperature in both databases able to carry it, inside a single-phase α field that extends from ≈1140 °C to the onset of melting in mpea-02b (≈950–1360 °C in mc_fe), and its α orders to B2 on cooling below ≈1090 °C. This reproduces, without fitting, the single-phase solution treatment and B2 ordering on which this composition’s processing route is built</w:t>
+        <w:t xml:space="preserve">gives the calculated equilibrium constitution at 1200 °C, the solution-treatment temperature. The Omori alloy is calculated to be single-phase α at that temperature in both databases able to evaluate it, within a single-phase α field that extends from ≈1140 °C to the onset of melting in mpea-02b (≈950–1360 °C in mc_fe). On cooling below ≈1090 °C, its α orders to B2. This result reproduces, without fitting, the single-phase solution treatment and B2 ordering on which the processing route of this composition is built</w:t>
       </w:r>
       <w:r>
         <w:t xml:space="preserve"> </w:t>
@@ -1429,7 +1435,7 @@
         <w:t xml:space="preserve">(Ref 17,34)</w:t>
       </w:r>
       <w:r>
-        <w:t xml:space="preserve">, and it is the control for applying the same databases to the LLM alloy.</w:t>
+        <w:t xml:space="preserve">, and it serves as the control for applying the same databases to the LLM alloy.</w:t>
       </w:r>
     </w:p>
     <w:p>
@@ -1437,7 +1443,7 @@
         <w:pStyle w:val="BodyText"/>
       </w:pPr>
       <w:r>
-        <w:t xml:space="preserve">The LLM alloy is calculated to be a two-phase α + γ mixture at 1200 °C in all three databases (62–71% α), and in none of them does a single-phase α field open before melting begins (≈1240 °C in mc_fe, ≈1295 °C in mpea-02b and PrecHiMn-04). On the calculation, no solution temperature in the solid state brings this composition to single-phase α, independently of the 1200 °C limit of the process. Removing carbon from the measured chemistry, with every other element held fixed, opens a single-phase α field at ≈1130–1160 °C and gives 100% α at 1200 °C in all three databases. The other elements were varied in the same way. Raising nickel stepwise to the Omori alloy’s 7.8 at% does not open the field while carbon is present (mpea-02b, with the endpoints confirmed in mc_fe). Silicon at its measured level does not obstruct the field: with carbon removed, both databases that carry silicon return 100% α at 1200 °C. Whether the intended silicon would have opened the field with carbon present cannot be answered from these calculations, because mc_fe, the only database in which the nominal composition was evaluated with its silicon, places it partly molten at 1200 °C (27.9% liquid). Raising aluminum alone to the A2 ceiling of 12 wt% raises the α fraction at 1200 °C from 76.0 to 97.3% without making the alloy single-phase there (mpea-02b). None of the three carbon-bearing points sampled inside the A2 range (its midpoint and its most ferrite- and austenite-favoring corners) reaches disordered single-phase α at 1200 °C in either database able to evaluate them; the two databases disagree on the constitution of these silicon-rich compositions (mc_fe places the midpoint and the ferrite-favoring corner partly molten at 1200 °C and the austenite-favoring corner fully austenitic), and inside the range mc_fe does not make carbon the controlling element (Table S2). These calculations identify carbon as the element whose removal restores the α field for the measured chemistry; they do not show that the missing field is the cause of the absence of transformation (Sec. 4.1).</w:t>
+        <w:t xml:space="preserve">The LLM alloy is calculated to be a two-phase α + γ mixture at 1200 °C in all three databases (62–71% α), and in none of them does a single-phase α field open before melting begins (≈1240 °C in mc_fe, ≈1295 °C in mpea-02b and PrecHiMn-04). According to these calculations, no solution temperature in the solid state brings this composition to single-phase α, irrespective of the 1200 °C limit of the process. Removing carbon from the measured chemistry, with every other element held fixed, opens a single-phase α field at ≈1130–1160 °C and gives 100% α at 1200 °C in all three databases. The other elements were varied in the same way. Raising nickel stepwise to the Omori alloy’s 7.8 at% does not open the field while carbon is present (mpea-02b, with the endpoints confirmed in mc_fe). Silicon at its measured level does not obstruct the field: with carbon removed, both databases that carry silicon return 100% α at 1200 °C. Whether the intended silicon content would have opened the field with carbon present cannot be answered from these calculations, because mc_fe, the only database in which the nominal composition was evaluated with its silicon, predicts it to be partly molten at 1200 °C (27.9% liquid). Increasing aluminum alone to the A2 ceiling of 12 wt% raises the α fraction at 1200 °C from 76.0 to 97.3% without making the alloy single-phase at that temperature (mpea-02b). None of the three carbon-bearing points sampled inside the A2 range (its midpoint and its most ferrite- and austenite-favoring corners) reaches disordered single-phase α at 1200 °C in either database able to evaluate them. The two databases disagree on the constitution of these silicon-rich compositions (mc_fe predicts the midpoint and the ferrite-favoring corner to be partly molten at 1200 °C and the austenite-favoring corner to be fully austenitic), and inside the range carbon is not the controlling element in mc_fe (Table S2). These calculations identify carbon as the element whose removal opens the α field for the measured chemistry; they do not show that the missing field caused the absence of transformation (Sec. 4.1).</w:t>
       </w:r>
     </w:p>
     <w:p>
@@ -1445,7 +1451,7 @@
         <w:pStyle w:val="BodyText"/>
       </w:pPr>
       <w:r>
-        <w:t xml:space="preserve">Carbide phases are calculated to be stable only well below the processing range: M₂₃C₆ only below ≈420 °C (mpea-02b) and κ-(Fe,Mn)₃AlC, at no more than 2.4%, only below ≈590 °C (PrecHiMn-04 and mc_fe). At 1200 °C both silicon and carbon are therefore in solid solution, and both are calculated to concentrate in γ: carbon strongly, at 1.0–1.3 at% in γ against ≈0.1 at% in α in all three databases, and silicon mildly, at 2.6–2.7 against 1.7–1.8 at% in the two databases that carry it. Aluminum is calculated to partition to α (13.0–13.8 against 9.9–10.0 at%) and manganese to γ (31.5–33.3 against 28.8–29.9 at%), the direction of the EDS contrast of</w:t>
+        <w:t xml:space="preserve">Carbide phases are calculated to be stable only well below the processing range: M₂₃C₆ only below ≈420 °C (mpea-02b) and κ-(Fe,Mn)₃AlC, at no more than 2.4%, only below ≈590 °C (PrecHiMn-04 and mc_fe). At 1200 °C, both silicon and carbon are therefore in solid solution, and both are calculated to concentrate in γ: carbon strongly (1.0–1.3 at% in γ versus ≈0.1 at% in α in all three databases) and silicon mildly (2.6–2.7 versus 1.7–1.8 at% in the two databases that carry it). Aluminum is calculated to partition to α (13.0–13.8 versus 9.9–10.0 at%) and manganese to γ (31.5–33.3 versus 28.8–29.9 at%), in the same direction as the EDS contrast in</w:t>
       </w:r>
       <w:r>
         <w:t xml:space="preserve"> </w:t>
@@ -1458,7 +1464,7 @@
         <w:t xml:space="preserve">Fig. 1b</w:t>
       </w:r>
       <w:r>
-        <w:t xml:space="preserve">. These are equilibrium values at the solution-treatment temperature; the partitioning was not measured, and carbon in particular may redistribute during cooling. Finally, the ordered bcc of PrecHiMn-04, the only description here able to return D0₃, refines to disordered A2 at every temperature calculated for the Ni-free composition that database can evaluate; given its limitations below ≈600 °C (Sec. 2.6), this does not establish whether the D0₃ observed in Sec. 3.3 is an equilibrium phase.</w:t>
+        <w:t xml:space="preserve">. These are equilibrium values at the solution-treatment temperature; the partitioning was not measured, and carbon in particular may redistribute during cooling. Finally, the ordered BCC phase of PrecHiMn-04, the only description here able to return D0₃, reduces to disordered BCC at every temperature calculated for the Ni-free composition that this database can evaluate; given the limitations of this database below ≈600 °C (Sec. 2.6), this result does not establish whether the D0₃ observed in Sec. 3.3 is an equilibrium phase.</w:t>
       </w:r>
     </w:p>
     <w:p>
@@ -1493,7 +1499,7 @@
         <w:pStyle w:val="FirstParagraph"/>
       </w:pPr>
       <w:r>
-        <w:t xml:space="preserve">What was measured is that the LLM alloy showed no transformation plateau and no recovery beyond elastic springback on unloading in any condition in which unloading was recorded, apart from a non-linearity of at most ≈0.3% in the unrecrystallized wire (Sec. 3.2), and none on heating in the one condition given the heating test (</w:t>
+        <w:t xml:space="preserve">The measured results are as follows. On unloading, the LLM alloy showed no transformation plateau and no recovery beyond elastic springback in any condition in which unloading was recorded, apart from a non-linearity of at most ≈0.3% in the unrecrystallized wire (Sec. 3.2). On heating, the LLM alloy showed no recovery in the one condition given the heating test (</w:t>
       </w:r>
       <w:r>
         <w:rPr>
@@ -1503,7 +1509,7 @@
         <w:t xml:space="preserve">Fig. 3a</w:t>
       </w:r>
       <w:r>
-        <w:t xml:space="preserve">), whereas the Omori alloy given the same anneal recovered ≈0.5% on heating (</w:t>
+        <w:t xml:space="preserve">), whereas the Omori alloy given the same anneal recovered ≈0.5% (</w:t>
       </w:r>
       <w:r>
         <w:rPr>
@@ -1513,7 +1519,7 @@
         <w:t xml:space="preserve">Fig. 3b</w:t>
       </w:r>
       <w:r>
-        <w:t xml:space="preserve">); and that its diffraction pattern after the 1200 °C/1 min anneal, γ-majority after cooling, was essentially unchanged by 10% strain. What is not claimed is that the composition is incapable of superelasticity under any processing. Identical nominal processing does not guarantee identical microstructures in two compositions, and the route used here was the Omori alloy’s rather than one optimized for the LLM alloy, so the processing may have contributed to the result. Two observations bound that possibility without removing it. First, the LLM alloy was given a wider range of treatments than the Omori alloy (Secs. 2.2 and 3.2), including the 200 °C/3 h age reported to develop pseudoelasticity in this family</w:t>
+        <w:t xml:space="preserve">). The diffraction pattern of the LLM alloy after the 1200 °C/1 min anneal (γ-majority after cooling) was essentially unchanged by 10% strain. We do not claim that the composition is incapable of superelasticity under any processing. Identical nominal processing does not guarantee identical microstructures in two different compositions, and the route used here was the Omori alloy’s rather than one optimized for the LLM alloy, so the processing may have contributed to the result. Two observations constrain that possibility without removing it. First, the LLM alloy was given a wider range of treatments than the Omori alloy (Secs. 2.2 and 3.2), and none produced recovery; these included the 200 °C/3 h age reported to develop pseudoelasticity in this alloy family</w:t>
       </w:r>
       <w:r>
         <w:t xml:space="preserve"> </w:t>
@@ -1538,7 +1544,7 @@
         <w:t xml:space="preserve"> </w:t>
       </w:r>
       <w:r>
-        <w:t xml:space="preserve">did not receive, and none produced recovery. Second, the calculations of Sec. 3.4 find no temperature in the solid state at which the composition is single-phase α, so no choice of solution temperature reproduces the starting state of the Omori alloy’s route. A solution-and-aging window optimized for this composition remains untested (Sec. 4.3).</w:t>
+        <w:t xml:space="preserve">did not receive. Second, the calculations of Sec. 3.4 find no temperature in the solid state at which the composition is single-phase α, so no choice of solution temperature reproduces the starting state of the Omori alloy’s route. A solution-and-aging window optimized for this composition remains untested (Sec. 4.3).</w:t>
       </w:r>
     </w:p>
     <w:p>
@@ -1546,7 +1552,7 @@
         <w:pStyle w:val="BodyText"/>
       </w:pPr>
       <w:r>
-        <w:t xml:space="preserve">The absence of superelasticity and of a shape-memory response in the LLM alloy (measured composition 51.5Fe-29.8Mn-11.9Al-4.2Ni-2.0Si-0.45C at%) is interpreted here in terms of a misalignment between its phase stability and its active deformation mechanisms. In Fe-Mn-Al-Ni shape-memory systems, superelastic behavior is contingent upon a reversible, stress-induced martensitic transformation from a BCC α parent phase to FCC γ martensite. However, semi-quantitative Rietveld refinement of the synchrotron XRD data indicates that the LLM alloy, as cooled from 1200 °C, is dominated by the γ-phase (≈62%), whereas the α-phase accounts for only ≈34% of the volume, with a further ≈4% indexed as ordered D0₃ (Sec. 3.3). Compared to the Omori alloy (43.5Fe-34Mn-15Al-7.5Ni at%), the LLM alloy has less Mn, Al, and Ni, but higher Fe, Si, and C. Element by element these changes pull in opposite directions — Fe, Si, and Al are conventionally ferrite stabilizers, and Mn, Ni, and C austenite stabilizers</w:t>
+        <w:t xml:space="preserve">The absence of superelasticity and of a shape-memory response in the LLM alloy (measured composition 51.5Fe-29.8Mn-11.9Al-4.2Ni-2.0Si-0.45C at%) is interpreted here in terms of a misalignment between its phase stability and its active deformation mechanisms. In Fe-Mn-Al-Ni shape-memory systems, superelastic behavior requires a reversible, stress-induced martensitic transformation from a BCC α parent phase to FCC γ martensite. However, semi-quantitative Rietveld refinement of the synchrotron XRD data indicates that the LLM alloy, as cooled from 1200 °C, is dominated by the γ phase (≈62% by volume), whereas the α phase accounts for only ≈34%, and a further ≈4% is indexed as ordered D0₃ (Sec. 3.3). Compared with the Omori alloy (43.5Fe-34Mn-15Al-7.5Ni at%), the LLM alloy contains less Mn, Al, and Ni but more Fe, Si, and C. Taken element by element, these changes pull in opposite directions: Fe, Si, and Al are conventionally ferrite stabilizers, and Mn, Ni, and C austenite stabilizers</w:t>
       </w:r>
       <w:r>
         <w:t xml:space="preserve"> </w:t>
@@ -1555,10 +1561,7 @@
         <w:t xml:space="preserve">(Ref 35)</w:t>
       </w:r>
       <w:r>
-        <w:t xml:space="preserve"> </w:t>
-      </w:r>
-      <w:r>
-        <w:t xml:space="preserve">— so such rules cannot decide the balance in a six-element alloy. The hypothesis in the agent’s report (Sec. 2.1) was that these chemistry changes would not alter the phase constitution or stability, and that the additional C could also increase material strength to impede dislocation slip and promote stress-induced phase transformation. The multicomponent calculations of Sec. 3.4, made on the measured chemistry, find instead that the alloy is two-phase α + γ at the solution-treatment temperature and has no single-phase α field below its melting point, and that removing its carbon restores that field at 1200 °C, whereas restoring the Omori alloy’s nickel or raising aluminum to the top of the proposed range does not, and silicon at its measured level does not obstruct it. Carbon is therefore one plausible contributor to the outcome. It is not a demonstrated cause: the five alloying additions change together between the two heats, the calculation describes equilibrium rather than the cooled wire, and casting a carbon-free heat of this composition is the direct test.</w:t>
+        <w:t xml:space="preserve">. Such rules therefore cannot decide the balance in a six-element alloy. The agent’s report (Sec. 2.1) hypothesized that these changes in chemistry would not alter the phase constitution or stability, and that the added C could also strengthen the material, impeding dislocation slip and promoting stress-induced phase transformation. The multicomponent calculations of Sec. 3.4, made on the measured chemistry, find instead that the alloy is two-phase α + γ at the solution-treatment temperature and has no single-phase α field below its melting point. They also find that removing its carbon opens that field at 1200 °C, whereas restoring the Omori alloy’s nickel or raising aluminum to the top of the proposed range does not, and that silicon at its measured level does not obstruct it. Carbon is therefore one plausible contributor to the outcome. It is not a demonstrated cause: the five alloying additions differ simultaneously between the two heats, the calculation describes equilibrium rather than the cooled wire, and casting a carbon-free heat of this composition is the direct test.</w:t>
       </w:r>
     </w:p>
     <w:p>
@@ -1566,7 +1569,7 @@
         <w:pStyle w:val="BodyText"/>
       </w:pPr>
       <w:r>
-        <w:t xml:space="preserve">The calculation and the measurement agree that the alloy is dual-phase but not on which phase dominates: α is calculated to be the majority at 1200 °C (62–71%,</w:t>
+        <w:t xml:space="preserve">The calculation and the measurement agree that the alloy is dual-phase but disagree on which phase dominates: α is calculated to be the majority at 1200 °C (62–71%,</w:t>
       </w:r>
       <w:r>
         <w:t xml:space="preserve"> </w:t>
@@ -1579,7 +1582,7 @@
         <w:t xml:space="preserve">Table 3</w:t>
       </w:r>
       <w:r>
-        <w:t xml:space="preserve">), whereas the refinement of the cooled wire places γ in the majority (≈62%; the calculated fractions are molar and the refined ones by volume). Room-temperature diffraction does not establish the constitution at 1200 °C, and two readings are open. In the first, γ was present at 1200 °C in more than the calculated amount, because the databases overestimate α or because the 1-minute anneal did not bring the cold-drawn wire to equilibrium. In the second, part of the α present at temperature transformed to γ on cooling, which would place a transformation temperature above room temperature. The present data do not decide between them: no transformation temperatures were measured for these conditions, and the qualitative EDS partitioning of</w:t>
+        <w:t xml:space="preserve">), whereas the refinement of the cooled wire places γ in the majority (≈62%; the calculated fractions are molar and the refined ones by volume). Because room-temperature diffraction does not establish the constitution at 1200 °C, two readings remain open. In the first, more γ was present at 1200 °C than calculated, because the databases overestimate α or because the 1-minute anneal did not bring the cold-drawn wire to equilibrium. In the second, part of the α present at temperature transformed to γ on cooling, which would place a transformation temperature above room temperature. The present data do not distinguish between them: no transformation temperatures were measured for these conditions, and the qualitative EDS partitioning of</w:t>
       </w:r>
       <w:r>
         <w:t xml:space="preserve"> </w:t>
@@ -1595,7 +1598,7 @@
         <w:t xml:space="preserve"> </w:t>
       </w:r>
       <w:r>
-        <w:t xml:space="preserve">is expected under either reading. Differential scanning calorimetry of the strand-annealed wire, with the Omori alloy as the control, or a phase map combined with composition on the same area (EBSD with EDS) would discriminate. Attributing the absence of transformation to the missing single-phase parent state is therefore an interpretation consistent with both readings, not a demonstrated mechanism.</w:t>
+        <w:t xml:space="preserve">is expected under either reading. Differential scanning calorimetry of the strand-annealed wire, with the Omori alloy as the control, or combined phase and composition mapping of the same area (EBSD with EDS) would discriminate between the two readings. Attributing the absence of transformation to the missing single-phase parent state is therefore an interpretation consistent with both readings, not a demonstrated mechanism.</w:t>
       </w:r>
     </w:p>
     <w:p>
@@ -1603,7 +1606,7 @@
         <w:pStyle w:val="BodyText"/>
       </w:pPr>
       <w:r>
-        <w:t xml:space="preserve">Mechanical and structural analyses further indicate that the LLM alloy accommodates macroscopic deformation via irreversible dislocation slip rather than phase transformation. Coherent, ordered β-NiAl (B2) precipitates within the BCC parent contribute to the transformation reversibility of the Omori alloy</w:t>
+        <w:t xml:space="preserve">The mechanical and structural results further indicate that the LLM alloy accommodates macroscopic deformation by irreversible dislocation slip rather than by phase transformation. In the Omori alloy, coherent, ordered β-NiAl (B2) precipitates within the BCC parent contribute to the reversibility of the transformation</w:t>
       </w:r>
       <w:r>
         <w:t xml:space="preserve"> </w:t>
@@ -1612,7 +1615,7 @@
         <w:t xml:space="preserve">(Ref 34)</w:t>
       </w:r>
       <w:r>
-        <w:t xml:space="preserve">, alongside parent-phase stability, transformation temperature, grain size, crystallographic orientation, and the balance between transformation stress and yield stress. In the LLM alloy the ordered phase observed is D0₃ Fe₃Al, ≈4% and of unknown spatial scale (Sec. 3.3), which is not predicted by the one database able to model it (Sec. 3.4) and may be a metastable ordering product formed on cooling; there is no evidence that it raises the resistance to plastic flow in the way that B2 does in the Omori alloy. The post-deformation synchrotron patterns are consistent with this interpretation: the change from sharp, discrete spots to broader, partially arced rings is what dislocation multiplication and sub-grain formation would produce, although it was not quantified and texture evolution could contribute to it. Thus, as processed here, the dual-phase LLM alloy is interpreted to deform by dislocation slip rather than by stress-induced martensitic transformation.</w:t>
+        <w:t xml:space="preserve">, together with parent-phase stability, transformation temperature, grain size, crystallographic orientation, and the balance between transformation stress and yield stress. In the LLM alloy, the ordered phase observed is D0₃ Fe₃Al (≈4%, of unknown spatial scale; Sec. 3.3). It is not predicted by the one database able to model it (Sec. 3.4) and may be a metastable ordering product formed on cooling; there is no evidence that it raises the resistance to plastic flow as B2 does in the Omori alloy. The post-deformation synchrotron patterns are consistent with this interpretation: the change from sharp, discrete spots to broader, partially arced rings is what dislocation multiplication and sub-grain formation would produce, although this change was not quantified and texture evolution could also contribute to it. Thus, as processed here, the dual-phase LLM alloy is interpreted to deform by dislocation slip rather than by stress-induced martensitic transformation.</w:t>
       </w:r>
     </w:p>
     <w:bookmarkEnd w:id="23"/>
@@ -1630,7 +1633,7 @@
         <w:pStyle w:val="FirstParagraph"/>
       </w:pPr>
       <w:r>
-        <w:t xml:space="preserve">Although the LLM alloy did not show superelastic behavior, its tensile properties vary strongly with annealing temperature, and the trends are consistent with those expected for a cold-drawn wire passing through recovery, recrystallization, and grain growth. Microstructures were examined only after the 1200 °C anneals (Sec. 3.1), so the regimes below are interpretations of the mechanical trends rather than observed microstructural stages; and because the values of</w:t>
+        <w:t xml:space="preserve">Although the LLM alloy did not show superelastic behavior, its tensile properties varied strongly with annealing temperature, and the trends are consistent with those expected for a cold-drawn wire passing through recovery, recrystallization, and grain growth. Microstructures were examined only after the 1200 °C anneals (Sec. 3.1), so the regimes described below are interpretations of the mechanical trends rather than observed microstructural stages. In addition, because the values in</w:t>
       </w:r>
       <w:r>
         <w:t xml:space="preserve"> </w:t>
@@ -1646,7 +1649,7 @@
         <w:t xml:space="preserve"> </w:t>
       </w:r>
       <w:r>
-        <w:t xml:space="preserve">come from incrementally cycled specimens with crosshead strain (Sec. 2.4), they are compared with monotonic data only with that qualification. Reading these as an exploratory survey rather than a designed experiment, three regimes emerge.</w:t>
+        <w:t xml:space="preserve">come from incrementally cycled specimens, with strain taken from crosshead extension (Sec. 2.4), they are compared with monotonic data only with that qualification. Read as an exploratory survey rather than as a designed experiment, the data fall into three regimes.</w:t>
       </w:r>
     </w:p>
     <w:p>
@@ -1654,7 +1657,7 @@
         <w:pStyle w:val="BodyText"/>
       </w:pPr>
       <w:r>
-        <w:t xml:space="preserve">At the lowest temperatures (600–700 °C) the wire is very strong but essentially brittle: tensile strengths of ≈1876–2254 MPa and yield strengths of ≈1635–1908 MPa, but elongation of only ≈2%. These temperatures are interpreted as lying below the recrystallization range of the heavily cold-drawn wire, so that annealing here drives only recovery (relief of residual drawing stresses and partial rearrangement of the dislocation substructure) without nucleating new strain-free grains. On that reading, the high dislocation density retained from cold drawing sustains the high strength, and the small ductility gains in this window reflect stress relief rather than any genuine restoration of formability; the wire still fractures soon after yield.</w:t>
+        <w:t xml:space="preserve">At the lowest temperatures (600–700 °C), the wire was very strong but essentially brittle, with tensile strengths of ≈1876–2254 MPa and yield strengths of ≈1635–1908 MPa but an elongation of only ≈2%. These temperatures are interpreted as lying below the recrystallization range of the heavily cold-drawn wire, so that annealing there drives only recovery (relief of residual drawing stresses and partial rearrangement of the dislocation substructure) without nucleating new strain-free grains. On that reading, the high dislocation density retained from cold drawing sustains the high strength, and the small ductility gains in this window reflect stress relief rather than any genuine restoration of formability; the wire still fractured soon after yielding.</w:t>
       </w:r>
     </w:p>
     <w:p>
@@ -1662,7 +1665,7 @@
         <w:pStyle w:val="BodyText"/>
       </w:pPr>
       <w:r>
-        <w:t xml:space="preserve">The abrupt change near 800 °C is consistent with the onset of recrystallization. Elongation jumps from 2.2% at 700 °C to 26.1% at 800 °C, while tensile strength falls from 1876 to 1209 MPa and yield strength from 1635 to 1151 MPa. A discontinuity of this kind, rather than a smooth softening, is characteristic of recrystallization, in which new equiaxed, strain-free grains nucleate and consume the deformed matrix, removing most of the stored dislocation content and abruptly restoring ductility. The onset of recrystallization is inferred from the mechanical response rather than observed, since micrographs were not taken at every anneal temperature.</w:t>
+        <w:t xml:space="preserve">The abrupt change near 800 °C is consistent with the onset of recrystallization. Elongation jumped from 2.2% at 700 °C to 26.1% at 800 °C, while tensile strength fell from 1876 to 1209 MPa and yield strength from 1635 to 1151 MPa. A discontinuity of this kind, rather than smooth softening, is characteristic of recrystallization, in which new equiaxed, strain-free grains nucleate and consume the deformed matrix, removing most of the stored dislocation content and abruptly restoring ductility. The onset of recrystallization is inferred from the mechanical response rather than observed, since micrographs were not taken at every anneal temperature.</w:t>
       </w:r>
     </w:p>
     <w:p>
@@ -1670,7 +1673,7 @@
         <w:pStyle w:val="BodyText"/>
       </w:pPr>
       <w:r>
-        <w:t xml:space="preserve">From 800 to 1200 °C the behavior is consistent with a recrystallized wire in which grain growth dominates. Yield strength falls at each successive anneal temperature (1151 → 519 MPa), which we interpret as grain growth, and elongation rises to a peak of ≈33% near 1000 °C. Between 800 and 1000 °C strength and ductility therefore trade against each other in the way expected when flow stress is controlled by grain size. In this dual-phase wire, however, the phase fractions, ordering and drawing texture may also change across the series (they were measured only after the 1200 °C anneal), and the residual effect of the prior cold work is not separated, so grain size need not be the only variable. Above 1000 °C, elongation decreases (29.1% at 1100 °C, 25.6% at 1200 °C), by more than the specimen-to-specimen scatter of</w:t>
+        <w:t xml:space="preserve">From 800 to 1200 °C, the behavior is consistent with a recrystallized wire in which grain growth dominates. Yield strength fell at each successive anneal temperature (1151 → 519 MPa), which we interpret as reflecting grain growth, and elongation rose to a peak of ≈33% near 1000 °C. Between 800 and 1000 °C, strength and ductility therefore traded off against each other, as expected when flow stress is controlled by grain size. In this dual-phase wire, however, the phase fractions, ordering and drawing texture may also have changed across the series (they were measured only after the 1200 °C anneal), and the residual effect of the prior cold work was not separated, so grain size need not be the only variable. Above 1000 °C, elongation decreased (29.1% at 1100 °C, 25.6% at 1200 °C) by more than the specimen-to-specimen scatter in</w:t>
       </w:r>
       <w:r>
         <w:t xml:space="preserve"> </w:t>
@@ -1686,7 +1689,7 @@
         <w:t xml:space="preserve"> </w:t>
       </w:r>
       <w:r>
-        <w:t xml:space="preserve">(one standard deviation ≤1.2% at these temperatures). The present data do not identify the cause: coarsening, surface oxidation or decarburization of the 0.36 mm wire at the higher temperatures, quench effects, grain-boundary phases, and changes in phase fractions are all possible, and none was measured across the series. Throughout the sweep, the apparent modulus stays within ≈150–162 GPa; because it is measured from crosshead strain (Sec. 2.4), it is not used to infer any change of structure.</w:t>
+        <w:t xml:space="preserve">(one standard deviation ≤1.2% at these temperatures). The present data do not identify the cause: coarsening, surface oxidation or decarburization of the 0.36 mm wire at the higher temperatures, quench effects, grain-boundary phases, and changes in phase fractions are all possible, and none was measured across the series. Throughout the sweep, the apparent modulus stayed within ≈150–162 GPa; because it was measured from crosshead strain (Sec. 2.4), it is not used to infer any structural change.</w:t>
       </w:r>
     </w:p>
     <w:bookmarkEnd w:id="24"/>
@@ -1704,7 +1707,7 @@
         <w:pStyle w:val="FirstParagraph"/>
       </w:pPr>
       <w:r>
-        <w:t xml:space="preserve">The workflow that produced this alloy should be stated before its outcome is interpreted, because the outcome belongs to that workflow and not to AI-assisted design in general. A deep-research agent was asked for lower-cost Fe-based compositions with the potential for superelasticity; it returned six ranked candidate families, each with a stated rationale and a performance target (Sec. 2.1); one family was chosen and a composition drawn from it, outside its stated range in manganese and aluminum, was melted; and between the report and the melt no calculation of phase stability was made. In this study the LLM-hypothesized alloy developed a multiphase microstructure consisting mainly of FCC γ and BCC α phases, and neither mechanical testing nor synchrotron diffraction provided evidence of stress-induced martensitic transformation in the conditions reported; deformation was instead accommodated largely by dislocation slip. The composition appeared reasonable from a strengthening and literature perspective. What its rationale did not contain, and what nothing later in the workflow supplied, was a check that the parent phase it specified could be produced by any treatment within the 1200 °C limit of the process.</w:t>
+        <w:t xml:space="preserve">The workflow that produced this alloy should be described before its outcome is interpreted, because the outcome is attributable to that workflow and not to AI-assisted design in general. A deep-research agent was asked for lower-cost Fe-based compositions with the potential for superelasticity, and it returned six ranked candidate families, each with a stated rationale and a performance target (Sec. 2.1). One family was chosen, and a composition drawn from it, outside its stated range in manganese and aluminum, was melted. No calculation of phase stability was made between the report and the melt. In this study, the LLM alloy developed a multiphase microstructure consisting mainly of FCC γ and BCC α phases, and neither mechanical testing nor synchrotron diffraction provided evidence of stress-induced martensitic transformation in the conditions reported; instead, deformation is interpreted to have been accommodated largely by dislocation slip. The composition appeared reasonable from the standpoint of strengthening and of the literature. What its rationale did not contain, and what nothing later in the workflow supplied, was a check that the parent phase it specified could be produced by any treatment within the 1200 °C limit of the process.</w:t>
       </w:r>
     </w:p>
     <w:p>
@@ -1712,7 +1715,7 @@
         <w:pStyle w:val="BodyText"/>
       </w:pPr>
       <w:r>
-        <w:t xml:space="preserve">The failure chain can be followed link by link, and the links do not carry equal weight. The first is the proposal itself: the carbon-bearing compositions sampled inside A2’s range reach no single-phase disordered α at 1200 °C in either database able to evaluate them (Sec. 3.4), so on the calculation the obstacle is not peculiar to the point that was melted (A2’s boron option was not evaluated). The second is the human down-selection: the composition melted lies outside A2 in manganese and aluminum, on the austenite-favoring side (Sec. 2.1); raising aluminum alone to the top of the range raises the calculated α fraction at 1200 °C but does not make the alloy single-phase α there (Sec. 3.4), and the manganese deviation was not evaluated separately, so the down-selection moved the alloy in the direction observed without, on the calculation, deciding the outcome. The third is synthesis: silicon was recovered at half its intended level (Sec. 2.1), but at its measured level silicon does not obstruct the α field once carbon is removed, and the calculations cannot say whether the intended silicon would have opened it with carbon present (Sec. 3.4). The fourth is processing: the route was the Omori alloy’s rather than one optimized for this composition, and whether another solution or aging treatment could produce a transforming state is untested. What can be attributed to the language model is therefore the first link, a proposed range whose sampled carbon-bearing compositions cannot, on the calculation, be solution-treated to the parent phase the proposal itself specified. The check that would have exposed it was omitted by the workflow rather than by the model, which recommended it: the report calls for</w:t>
+        <w:t xml:space="preserve">The failure chain can be followed link by link, and the links do not carry equal weight. The first is the proposal itself: the carbon-bearing compositions sampled inside A2’s range reach no single-phase disordered α at 1200 °C in either database able to evaluate them (Sec. 3.4), so according to the calculations the obstacle is not peculiar to the composition that was melted (A2’s boron option was not evaluated). The second is the human down-selection: the composition melted lies outside A2 in manganese and aluminum, on the austenite-favoring side (Sec. 2.1). Raising aluminum alone to the top of the range raises the calculated α fraction at 1200 °C but does not make the alloy single-phase α there (Sec. 3.4), and the manganese deviation was not evaluated separately; the down-selection therefore moved the alloy in the direction observed but, according to the calculations, did not decide the outcome. The third is synthesis: silicon was recovered at half its intended level (Sec. 2.1), but at its measured level it does not obstruct the α field once carbon is removed, and the calculations cannot say whether silicon at its intended level would have opened the field with carbon present (Sec. 3.4). The fourth is processing: the route was the Omori alloy’s rather than one optimized for this composition, and whether another solution or aging treatment could produce a transforming state is untested. What can be attributed to the language model is therefore the first link: a proposed range whose sampled carbon-bearing compositions cannot, according to the calculations, be solution-treated to the parent phase that the proposal itself specified. The check that would have exposed this obstacle was omitted by the workflow rather than by the model, which recommended it: the report calls for</w:t>
       </w:r>
       <w:r>
         <w:t xml:space="preserve"> </w:t>
@@ -1741,7 +1744,7 @@
         <w:pStyle w:val="BodyText"/>
       </w:pPr>
       <w:r>
-        <w:t xml:space="preserve">The workflow examined here sits at one end of a range of AI-assisted alloy-design approaches. Domain-trained language models learn composition–property relationships from explicit datasets and report quantitative test-set errors, as AlloyBERT does for elastic modulus and yield strength</w:t>
+        <w:t xml:space="preserve">The workflow examined here sits at one end of a range of AI-assisted alloy-design approaches. Domain-trained language models learn composition–property relationships from explicit datasets and report quantitative test-set errors: AlloyBERT does so for elastic modulus and yield strength</w:t>
       </w:r>
       <w:r>
         <w:t xml:space="preserve"> </w:t>
@@ -1750,10 +1753,7 @@
         <w:t xml:space="preserve">(Ref 36)</w:t>
       </w:r>
       <w:r>
-        <w:t xml:space="preserve"> </w:t>
-      </w:r>
-      <w:r>
-        <w:t xml:space="preserve">and as AlloyGPT, trained on CALPHAD-generated records of Al-based alloys for additive manufacturing, does for forward prediction and inverse design</w:t>
+        <w:t xml:space="preserve">, and AlloyGPT, trained on CALPHAD-generated records of Al-based alloys for additive manufacturing, does so for forward prediction and inverse design</w:t>
       </w:r>
       <w:r>
         <w:t xml:space="preserve"> </w:t>
@@ -1762,7 +1762,7 @@
         <w:t xml:space="preserve">(Ref 37)</w:t>
       </w:r>
       <w:r>
-        <w:t xml:space="preserve">; neither reports new experiments. LLM agents have also been given physics tools: in AtomAgents the agents call atomistic simulations while designing alloys</w:t>
+        <w:t xml:space="preserve">. Neither reports new experiments. LLM agents have also been given physics-based tools: in AtomAgents, the agents call atomistic simulations while designing alloys</w:t>
       </w:r>
       <w:r>
         <w:t xml:space="preserve"> </w:t>
@@ -1771,7 +1771,7 @@
         <w:t xml:space="preserve">(Ref 38)</w:t>
       </w:r>
       <w:r>
-        <w:t xml:space="preserve">, and a multi-agent system evaluates proposed additive-manufacturing alloys with thermophysical properties calculated in Thermo-Calc</w:t>
+        <w:t xml:space="preserve">, and in another multi-agent system, proposed alloys for additive manufacturing are evaluated with thermophysical properties calculated in Thermo-Calc</w:t>
       </w:r>
       <w:r>
         <w:t xml:space="preserve"> </w:t>
@@ -1780,7 +1780,7 @@
         <w:t xml:space="preserve">(Ref 39)</w:t>
       </w:r>
       <w:r>
-        <w:t xml:space="preserve">. Adaptive and active-learning loops close on experiment: Xue</w:t>
+        <w:t xml:space="preserve">. Adaptive and active-learning loops are closed by experiment: Xue</w:t>
       </w:r>
       <w:r>
         <w:t xml:space="preserve"> </w:t>
@@ -1830,7 +1830,7 @@
         <w:t xml:space="preserve">(Ref 41)</w:t>
       </w:r>
       <w:r>
-        <w:t xml:space="preserve">; the AIMS framework of Sec. 1 selected a NiTiCu shape memory alloy together with its processing and confirmed it experimentally</w:t>
+        <w:t xml:space="preserve">. The AIMS framework of Sec. 1 selected a NiTiCu shape-memory alloy together with its processing and confirmed it experimentally</w:t>
       </w:r>
       <w:r>
         <w:t xml:space="preserve"> </w:t>
@@ -1839,7 +1839,7 @@
         <w:t xml:space="preserve">(Ref 4)</w:t>
       </w:r>
       <w:r>
-        <w:t xml:space="preserve">. In the agent and loop workflows, a calculation or an experiment stands between a proposed composition and the decision to pursue it. The single-shot, tool-free workflow tested here had no such step: the equilibrium check that its own report recommended was not run before melting.</w:t>
+        <w:t xml:space="preserve">. In the agent-based and closed-loop workflows, a calculation or an experiment stands between a proposed composition and the decision to pursue it. The single-shot, tool-free workflow tested here had no such step: the equilibrium check that its own report recommended was not run before melting.</w:t>
       </w:r>
     </w:p>
     <w:p>
@@ -1847,7 +1847,7 @@
         <w:pStyle w:val="BodyText"/>
       </w:pPr>
       <w:r>
-        <w:t xml:space="preserve">The scope of what this study supports should be stated plainly. One composition, drawn from one agent’s proposal in one session and processed by one route, is a case study of that composition. It is not an experimental test of Hypothesis A2 as a whole, and still less an evaluation of AI-assisted alloy design as a practice. Run-to-run variation in the agent’s output was not tested, so nothing here establishes a failure rate, and a different prompt, agent or processing window might have produced a different outcome. Four tests remain open: a solution-and-aging treatment optimized for this composition; an in-situ or loading-stage diffraction measurement, which would observe the material under load instead of after unloading; differential scanning calorimetry, which would show whether a transformation occurs on cooling (Sec. 4.1); and a cast carbon-free heat, the experimental form of the calculated control of Sec. 3.4. What generalizes is narrower and, we think, more useful. The screening step that would have flagged this composition is a single equilibrium step diagram, evaluated not for the existence of the desired phase but for whether the phase field required by the intended processing route lies within the temperatures at which that route can be run. It requires no proprietary software and no measurement on the candidate itself. A generated composition should be treated as a hypothesis to be screened, not as a result.</w:t>
+        <w:t xml:space="preserve">The scope of what this study supports should be stated plainly. One composition, drawn from one agent’s proposal in one session and processed by one route, is a case study of that composition. It is not an experimental test of Hypothesis A2 as a whole, and still less an evaluation of AI-assisted alloy design as a practice. Run-to-run variation in the agent’s output was not tested, so nothing here establishes a failure rate; a different prompt, agent or processing window might have produced a different outcome. Four tests remain open: a solution-and-aging treatment optimized for this composition; an in-situ or loading-stage diffraction measurement, which would observe the material under load rather than after unloading; differential scanning calorimetry, which would show whether a transformation occurs on cooling (Sec. 4.1); and a cast carbon-free heat, the experimental form of the calculated control of Sec. 3.4. What generalizes is narrower and, we think, more useful. The screening step that would have flagged this composition is a single equilibrium step diagram, evaluated not for whether the desired phase exists but for whether the phase field required by the intended processing route lies within the temperatures at which that route can be run. It requires no proprietary software and no measurement on the candidate itself. A generated composition should be treated as a hypothesis to be screened, not as a result.</w:t>
       </w:r>
     </w:p>
     <w:p>
@@ -1855,7 +1855,7 @@
         <w:pStyle w:val="BodyText"/>
       </w:pPr>
       <w:r>
-        <w:t xml:space="preserve">Nevertheless, AI-assisted alloy design is likely to become increasingly successful. As larger experimental databases become available and models begin to incorporate processing history, microstructural evolution, kinetic simulations, and deformation mechanisms alongside thermodynamic calculations, AI will be able to make more physically informed predictions. Future materials-design frameworks that integrate first-principles calculations, phase-field modeling, CALPHAD databases, high-throughput experiments, and machine learning may better capture the conditions required for martensitic transformations and functional properties. Rather than replacing metallurgical expertise, AI is expected to serve as a powerful tool for rapidly narrowing the compositional search space, generating testable hypotheses, and accelerating discovery. The present study should therefore be read not as a failure of AI itself, nor as a measure of what current models can or cannot capture, but as a documented instance of a design workflow that stopped one calculation short of the check its own output recommended.</w:t>
+        <w:t xml:space="preserve">Nevertheless, AI-assisted alloy design is likely to become increasingly successful. As larger experimental databases become available and models begin to incorporate processing history, microstructural evolution, kinetic simulations, and deformation mechanisms alongside thermodynamic calculations, AI will be able to make more physically informed predictions. Future materials-design frameworks that integrate first-principles calculations, phase-field modeling, CALPHAD databases, high-throughput experiments, and machine learning may better capture the conditions required for martensitic transformations and functional properties. Rather than replacing metallurgical expertise, AI is expected to serve as a powerful tool for rapidly narrowing the compositional search space, generating testable hypotheses, and accelerating discovery. The present study should therefore be read neither as a failure of AI itself nor as a measure of what current models can or cannot capture, but as a documented instance of a design workflow that stopped one calculation short of the check that its own output recommended.</w:t>
       </w:r>
     </w:p>
     <w:p>
@@ -1894,7 +1894,7 @@
         <w:t xml:space="preserve">et al.</w:t>
       </w:r>
       <w:r>
-        <w:t xml:space="preserve">, a reference composition processed in parallel under the same nominal route. After the 1200 °C/1 min anneal, the LLM alloy had a γ-majority dual-phase FCC/BCC microstructure (semi-quantitative Rietveld refinement) with a minor ordered phase indexed as D0₃, and in the conditions tested it is interpreted to deform by dislocation slip rather than stress-induced martensitic transformation. Superelasticity was not observed in any condition in which unloading was recorded, nor shape-memory recovery on heating in the one condition tested, whereas the reference alloy recovered ≈0.5% on heating in a single test. The diffraction is ex situ, so a transformation reversing on unloading is bounded by the unloading curves, which show no transformation plateau and no recovery beyond elastic springback in the recrystallized conditions, rather than by diffraction.</w:t>
+        <w:t xml:space="preserve">, a reference composition processed in parallel by the same nominal route. After the 1200 °C/1 min anneal, the LLM alloy had a γ-majority, dual-phase FCC/BCC microstructure (by semi-quantitative Rietveld refinement) with a minor ordered phase indexed as D0₃. In the conditions tested, it is interpreted to deform by dislocation slip rather than by stress-induced martensitic transformation. Superelasticity was not observed in any condition in which unloading was recorded, and no shape-memory recovery on heating was observed in the one condition given the heating test, whereas the reference alloy recovered ≈0.5% on heating in a single test. Because the diffraction was ex situ, a transformation that reverses on unloading is bounded by the unloading curves rather than by diffraction; in the recrystallized conditions, these curves show no transformation plateau and no recovery beyond elastic springback.</w:t>
       </w:r>
     </w:p>
     <w:p>
@@ -1902,7 +1902,7 @@
         <w:pStyle w:val="BodyText"/>
       </w:pPr>
       <w:r>
-        <w:t xml:space="preserve">Equilibrium calculations in three independent open databases, two of which reproduce the reference alloy’s single-phase α field without fitting, find the LLM alloy two-phase α + γ at the 1200 °C solution-treatment temperature, with no single-phase α field below its melting point; removing its ≈0.10 wt% carbon in the calculation restores that field at 1200 °C, whereas restoring the reference alloy’s nickel or raising aluminum to the top of the proposed range does not. Carbon is therefore one plausible contributor to the outcome, not a demonstrated cause, and whether the missing single-phase parent state is the operative reason for the absence of transformation remains open, because the calculated and measured constitutions disagree on which phase dominates.</w:t>
+        <w:t xml:space="preserve">Equilibrium calculations with three independent open databases, two of which reproduce the reference alloy’s single-phase α field without fitting, find the LLM alloy to be two-phase α + γ at the 1200 °C solution-treatment temperature, with no single-phase α field below its melting point. In the calculations, removing its ≈0.10 wt% carbon opens that field at 1200 °C, whereas restoring the reference alloy’s nickel or raising aluminum to the top of the proposed range does not. Carbon is therefore one plausible contributor to the outcome, not a demonstrated cause. Whether the missing single-phase parent state is the operative reason for the absence of transformation remains open, because the calculated and measured constitutions disagree on which phase dominates.</w:t>
       </w:r>
     </w:p>
     <w:p>
@@ -1910,7 +1910,7 @@
         <w:pStyle w:val="BodyText"/>
       </w:pPr>
       <w:r>
-        <w:t xml:space="preserve">These results document a limitation of the workflow as it was run, not a demonstrated limit on what an LLM can propose: the agent’s report recommended a CALPHAD check, and the melt proceeded without one. This single-composition case study cannot establish how often such workflows fail. Its experimental conclusions are confined to the conditions reported and remain valid if another processing route is later found to produce superelasticity in this composition, while the calculated absence of a single-phase α field is a property of the composition rather than of the route. Nevertheless, this work demonstrates the value of experimentally validating AI-generated hypotheses, and of screening them for phase stability against the intended processing route before synthesis, and suggests that future models incorporating kinetic effects, phase transformations, and processing history may become powerful tools for accelerated alloy discovery.</w:t>
+        <w:t xml:space="preserve">These results document a limitation of the workflow as it was run, not a demonstrated limit on what an LLM can propose: the agent’s report recommended a CALPHAD check, and the melt proceeded without one. This single-composition case study cannot establish how often such workflows fail. Its experimental conclusions are confined to the conditions reported and remain valid even if another processing route is later found to produce superelasticity in this composition; the calculated absence of a single-phase α field, in contrast, is a property of the composition rather than of the route. Nevertheless, this work demonstrates the value of validating AI-generated hypotheses experimentally and of screening them for phase stability against the intended processing route before synthesis. It also suggests that future models incorporating kinetic effects, phase transformations, and processing history may become powerful tools for accelerating alloy discovery.</w:t>
       </w:r>
     </w:p>
     <w:p>
@@ -4503,7 +4503,7 @@
         <w:t xml:space="preserve"> </w:t>
       </w:r>
       <w:r>
-        <w:t xml:space="preserve">Cyclic stress–strain curves of the LLM alloy (a) as drawn and after annealing for 1 minute at (b) 600, (c) 800, (d) 1000 and (e) 1200 °C, and (f) after the 1200 °C anneal followed by aging at 200 °C for 3 hours. Wire diameter is 0.36 mm (nominal); strain is crosshead extension over the 127 mm gauge (Sec. 2.4). Each panel shows a single specimen; Table 2 gives the means of three specimens per anneal condition.</w:t>
+        <w:t xml:space="preserve">Cyclic stress–strain curves of the LLM alloy (a) as drawn and after annealing for 1 minute at (b) 600, (c) 800, (d) 1000 and (e) 1200 °C, and (f) after the 1200 °C anneal followed by aging at 200 °C for 3 hours. The wire diameter is 0.36 mm (nominal); strain is crosshead extension over the 127 mm gauge (Sec. 2.4). Each panel shows a single specimen; Table 2 gives the means of three specimens per annealing condition.</w:t>
       </w:r>
     </w:p>
     <w:p>
@@ -4521,7 +4521,7 @@
         <w:t xml:space="preserve"> </w:t>
       </w:r>
       <w:r>
-        <w:t xml:space="preserve">Loading–unloading–heating tests of (a) the LLM alloy and (b) the Omori alloy, both heat treated at 1200 °C for 1 minute. Wire diameters 0.35 mm (a) and 0.54 mm (b); strain is crosshead extension over the 127 mm gauge (Sec. 2.4). Black arrows show the deformation path: 1, unloading from 3% strain; 2, return of the crosshead at zero stress while the specimen is heated; 3, reloading. The red arrow highlights the strain recovery caused by heating.</w:t>
+        <w:t xml:space="preserve">Loading–unloading–heating tests of (a) the LLM alloy and (b) the Omori alloy, both heat treated at 1200 °C for 1 minute. The wire diameters are 0.35 mm (a) and 0.54 mm (b); strain is crosshead extension over the 127 mm gauge (Sec. 2.4). Black arrows show the deformation path: 1, unloading from 3% strain; 2, return of the crosshead at zero stress while the specimen is heated; 3, reloading. The red arrow highlights the strain recovery caused by heating.</w:t>
       </w:r>
     </w:p>
     <w:p>
@@ -4539,7 +4539,7 @@
         <w:t xml:space="preserve"> </w:t>
       </w:r>
       <w:r>
-        <w:t xml:space="preserve">2D synchrotron X-ray diffraction images of (a) LLM alloy annealed at 1200 °C for 1 min, (b) annealed LLM alloy after 10% tensile strain, (c) Omori alloy annealed at 1200 °C for 1 min, and (d) annealed Omori alloy after 8% tensile strain. Each image is from a single specimen; (a) and (b), and (c) and (d), are separate specimens.</w:t>
+        <w:t xml:space="preserve">2D synchrotron X-ray diffraction images of (a) the LLM alloy annealed at 1200 °C for 1 min, (b) the annealed LLM alloy after 10% tensile strain, (c) the Omori alloy annealed at 1200 °C for 1 min, and (d) the annealed Omori alloy after 8% tensile strain. Each image is from a single specimen; (a) and (b) are from separate specimens, as are (c) and (d).</w:t>
       </w:r>
     </w:p>
     <w:p>
@@ -4557,7 +4557,7 @@
         <w:t xml:space="preserve"> </w:t>
       </w:r>
       <w:r>
-        <w:t xml:space="preserve">Comparison between synchrotron X-ray diffraction data (lower half of each panel) and results of Rietveld refinement (upper half of each panel) for the LLM alloy: (a) heat treated at 1200 °C for 1 minute (R_wp = 21.4%, R_p = 8.7%), and (b) after unloading from 10% strain (R_wp = 12.5%, R_p = 5.9%). Both refinements used the three-phase model of Sec. 2.5, with lattice parameters fixed at a = 3.6366 Å (γ) and 2.8865 Å (α), and for D0₃ at 5.7734 Å in (a) and 5.7801 Å in (b).</w:t>
+        <w:t xml:space="preserve">Comparison of synchrotron X-ray diffraction data (lower half of each panel) with Rietveld refinement results (upper half of each panel) for the LLM alloy: (a) heat treated at 1200 °C for 1 minute (R_wp = 21.4%, R_p = 8.7%) and (b) after unloading from 10% strain (R_wp = 12.5%, R_p = 5.9%). Both refinements used the three-phase model of Sec. 2.5, with lattice parameters fixed at a = 3.6366 Å (γ) and 2.8865 Å (α), and for D0₃ at 5.7734 Å in (a) and 5.7801 Å in (b).</w:t>
       </w:r>
     </w:p>
     <w:p>
@@ -4575,7 +4575,7 @@
         <w:t xml:space="preserve"> </w:t>
       </w:r>
       <w:r>
-        <w:t xml:space="preserve">Azimuthally integrated X-ray diffraction spectra of (a) the LLM alloy and (b) the Omori alloy before and after deformation to 10% (a) and 8% (b) strain. Samples were heat treated at 1200 °C for 1 minute before deformation. In (b) the spectrum after deformation is divided by 1.625 (= 2.6/1.6), the exposure normalization recorded with the data; the other three spectra are shown as integrated, without offset.</w:t>
+        <w:t xml:space="preserve">Azimuthally integrated X-ray diffraction spectra of (a) the LLM alloy and (b) the Omori alloy before and after deformation to 10% (a) and 8% (b) strain. Samples were heat treated at 1200 °C for 1 minute before deformation. In (b), the spectrum after deformation is divided by 1.625 (= 2.6/1.6), the exposure normalization factor recorded with the data; the other three spectra are shown as integrated, without offset.</w:t>
       </w:r>
     </w:p>
     <w:bookmarkEnd w:id="111"/>
@@ -4603,7 +4603,7 @@
         <w:t xml:space="preserve"> </w:t>
       </w:r>
       <w:r>
-        <w:t xml:space="preserve">Chemistries of the two alloys (LLM alloy analyzed on the finished wire, Omori alloy as cast), in wt% with at% in parentheses, measured by inductively coupled plasma atomic emission spectroscopy (ICP-AES); carbon by ASTM E1019. Atomic percentages are converted from the weight percentages shown and normalized to the elements listed. Each actual value is a single analysis of one sample per heat (Table S1), and no analytical uncertainty is reported. For the Omori alloy, Fe is by difference and further residual elements, each below 0.01 wt%, are not listed; the ICP-AES analysis of the LLM alloy covered only Al, Fe, Mn, Ni and Si, so a dash in its actual column means not determined.</w:t>
+        <w:t xml:space="preserve">Chemical compositions of the two alloys (LLM alloy analyzed on the finished wire, Omori alloy as cast) in wt%, with at% in parentheses, measured by inductively coupled plasma atomic emission spectroscopy (ICP-AES); carbon was determined by ASTM E1019. Atomic percentages are converted from the weight percentages shown and normalized to the elements listed. Each actual value is from a single analysis of one sample per heat (Table S1), and no analytical uncertainty is reported. For the Omori alloy, Fe is given by difference, and other residual elements, each below 0.01 wt%, are not listed. The ICP-AES analysis of the LLM alloy covered only Al, Fe, Mn, Ni and Si, so a dash in its actual column means that the element was not determined.</w:t>
       </w:r>
     </w:p>
     <w:tbl>
@@ -5644,7 +5644,7 @@
         <w:t xml:space="preserve"> </w:t>
       </w:r>
       <w:r>
-        <w:t xml:space="preserve">Calculated equilibrium phase fractions (mol%) at 1200 °C, the solution-treatment temperature. The Omori alloy cannot be evaluated in PrecHiMn-04, which contains no Ni. Settings in Table S2.</w:t>
+        <w:t xml:space="preserve">Calculated equilibrium phase fractions (mol%) at 1200 °C, the solution-treatment temperature. The Omori alloy cannot be evaluated in PrecHiMn-04, which contains no Ni. Calculation settings are given in Table S2.</w:t>
       </w:r>
     </w:p>
     <w:tbl>

</xml_diff>

<commit_message>
JMEP R1: all response-letter markers filled from the records or stated as not documented (Frank: fill now); matching Sec. 2.1-2.5/3.1 sentences; rebuild
</commit_message>
<xml_diff>
--- a/submissions/JMEP-R1/Cai_Fe-SMA_JMEP_R1_clean.docx
+++ b/submissions/JMEP-R1/Cai_Fe-SMA_JMEP_R1_clean.docx
@@ -469,7 +469,7 @@
         <w:t xml:space="preserve">Table 1</w:t>
       </w:r>
       <w:r>
-        <w:t xml:space="preserve">. The measured composition of the Omori alloy, 42.7Fe-34.1Mn-15.2Al-7.8Ni (at%), was close to nominal. In the LLM alloy, only about half the intended silicon was recovered, 1.11 wt% against 2.2 wt% (2.04 against 4.0 at%), a shortfall consistent with oxidation loss during vacuum induction melting. The effect of this shortfall on phase stability is examined by calculation in Sec. 3.4. The measured composition of the LLM alloy is therefore 51.5Fe-29.8Mn-11.9Al-4.2Ni-2.0Si-0.45C (at%), and this composition was used in all calculations. Each heat was analyzed once, on one sample (Table S1, Online Resource 2), so chemical homogeneity within a heat was not checked. The Omori alloy also contains 0.06 wt% (≈0.10 at%) phosphorus of unknown origin, most plausibly a residual from the melting stock. Phosphorus can segregate to grain boundaries and embrittle them. Its effect on the Omori alloy was not examined, but any such effect could only have degraded the reference behavior, and the Omori alloy still showed a stress-induced transformation (Sec. 3.2). Several ø13 mm rods were cut from the cast ingots by electrical discharge machining (EDM). The rods were homogenized at 1000 °C for 16 hours in an argon atmosphere, hot-rolled at 850 °C in multiple passes to reduce their thickness, and then cold-drawn to wire 0.36 mm in diameter for the LLM alloy and 0.64 mm for the Omori alloy (the test record of the Omori alloy’s heating-test specimen gives a diameter of 0.54 mm). Severe work hardening during cold drawing necessitated intermediate annealing at 1000 °C under argon between drawing passes to restore ductility. The cold-drawing reduction after the last process anneal was ≈85% in area.</w:t>
+        <w:t xml:space="preserve">. The measured composition of the Omori alloy, 42.7Fe-34.1Mn-15.2Al-7.8Ni (at%), was close to nominal. In the LLM alloy, only about half the intended silicon was recovered, 1.11 wt% against 2.2 wt% (2.04 against 4.0 at%), a shortfall consistent with oxidation loss during vacuum induction melting. The effect of this shortfall on phase stability is examined by calculation in Sec. 3.4. The measured composition of the LLM alloy is therefore 51.5Fe-29.8Mn-11.9Al-4.2Ni-2.0Si-0.45C (at%), and this composition was used in all calculations. Each heat was analyzed once, on one sample (Table S1, Online Resource 2), so chemical homogeneity within a heat was not checked. The Omori alloy also contains 0.06 wt% (≈0.10 at%) phosphorus of unknown origin, most plausibly a residual from the melting stock. Phosphorus can segregate to grain boundaries and embrittle them. Its effect on the Omori alloy was not examined, but any such effect could only have degraded the reference behavior, and the Omori alloy still showed a stress-induced transformation (Sec. 3.2). Several ø13 mm rods were cut from the cast ingots by electrical discharge machining (EDM). The rods were homogenized at 1000 °C for 16 hours in an argon atmosphere, hot-rolled at 850 °C in multiple passes to reduce their thickness, and then cold-drawn to wire 0.36 mm in diameter for the LLM alloy and 0.64 mm for the Omori alloy (the test record of the Omori alloy’s heating-test specimen gives a diameter of 0.54 mm). Severe work hardening during cold drawing necessitated intermediate annealing at 1000 °C under argon between drawing passes to restore ductility. The cold-drawing reduction after the last process anneal was ≈85% in area. The hot-rolling reductions and pass schedule, the redraw sequence, the number and duration of the intermediate anneals and the cooling media after each step are not documented in the processing records available to us.</w:t>
       </w:r>
     </w:p>
     <w:bookmarkEnd w:id="11"/>
@@ -499,7 +499,7 @@
         <w:t xml:space="preserve"> </w:t>
       </w:r>
       <w:r>
-        <w:t xml:space="preserve">is the nominal dwell: the time at temperature, which is set by the pass speed and the hot-zone length, was not measured separately. The Omori alloy wire used in Figs. 3, 4 and 6 received the same 1200 °C/1 min treatment. Static holds of 40 and 80 minutes at 1200 °C were also applied to the LLM-alloy wire. The aged condition of</w:t>
+        <w:t xml:space="preserve">is the nominal dwell: the time at temperature, which is set by the pass speed and the hot-zone length, was not measured separately. The hot-zone length, temperature calibration, wire tension and argon purity of the strand furnace are not documented in those records either. The Omori alloy wire used in Figs. 3, 4 and 6 received the same 1200 °C/1 min treatment. Static holds of 40 and 80 minutes at 1200 °C were also applied to the LLM-alloy wire. The aged condition of</w:t>
       </w:r>
       <w:r>
         <w:t xml:space="preserve"> </w:t>
@@ -515,7 +515,7 @@
         <w:t xml:space="preserve"> </w:t>
       </w:r>
       <w:r>
-        <w:t xml:space="preserve">was produced by aging the 1200 °C/1 min wire at 200 °C for 3 hours. Heat treatments above 1200 °C (static holds at 1250 °C and a cyclic exposure at 1300 °C) caused severe oxidation or furnace contamination and are not reported further; 1200 °C was therefore the practical upper limit of the processing window. Surface oxidation and decarburization during the treatments at or below 1200 °C were not measured.</w:t>
+        <w:t xml:space="preserve">was produced by aging the 1200 °C/1 min wire at 200 °C for 3 hours; the quench medium after the strand anneal, the transfer time, the aging atmosphere and the cooling after aging are not documented. Heat treatments above 1200 °C (static holds at 1250 °C and a cyclic exposure at 1300 °C) caused severe oxidation or furnace contamination and are not reported further; 1200 °C was therefore the practical upper limit of the processing window. Surface oxidation and decarburization during the treatments at or below 1200 °C were not measured, and no observation of the surface condition after treatment was recorded.</w:t>
       </w:r>
     </w:p>
     <w:p>
@@ -553,7 +553,7 @@
         <w:pStyle w:val="FirstParagraph"/>
       </w:pPr>
       <w:r>
-        <w:t xml:space="preserve">Wire cross-sections were embedded in cold-mount epoxy and ground sequentially with silicon-carbide papers from 180 to 800 grit. Final polishing used a 0.25 µm OP-S aluminum-oxide suspension on an automated polishing wheel until a scratch-free mirror finish was achieved. Polished cross-sections were imaged on a Clemex Vision PE optical microscope under bright-field illumination at magnifications between 100× and 1000×. In addition, scanning electron microscopy (SEM) and energy-dispersive X-ray spectroscopy (EDS) were used to study the microstructure and local chemistry; EDS was used qualitatively (Sec. 3.1).</w:t>
+        <w:t xml:space="preserve">Wire cross-sections were embedded in cold-mount epoxy and ground sequentially with silicon-carbide papers from 180 to 800 grit. Final polishing used a 0.25 µm OP-S aluminum-oxide suspension on an automated polishing wheel until a scratch-free mirror finish was achieved. Polished cross-sections were imaged on a Clemex Vision PE optical microscope under bright-field illumination at magnifications between 100× and 1000×. In addition, scanning electron microscopy (SEM) and energy-dispersive X-ray spectroscopy (EDS) were used to study the microstructure and local chemistry; EDS was used qualitatively (Sec. 3.1); its acquisition conditions and any point or map data are not available to us.</w:t>
       </w:r>
     </w:p>
     <w:bookmarkEnd w:id="13"/>
@@ -580,7 +580,7 @@
         <w:t xml:space="preserve">(Ref 18)</w:t>
       </w:r>
       <w:r>
-        <w:t xml:space="preserve">, for evaluating reversible transformation and strain recovery in fine superelastic wire. Unless stated otherwise, the gauge length was 127 mm (5.000 in), and the crosshead speed, where recorded (Table S1), was 0.25 in min⁻¹, corresponding to a nominal strain rate of 8.3 × 10⁻⁴ s⁻¹. Engineering stress was computed from the specimen diameter entered in the instrument record, and engineering strain was taken as the crosshead extension divided by the gauge length, without extensometry. No correction for load-train compliance or grip slip was applied; the elastic portion of each curve therefore includes the load-train compliance, and the moduli in</w:t>
+        <w:t xml:space="preserve">, for evaluating reversible transformation and strain recovery in fine superelastic wire. Unless stated otherwise, the gauge length was 127 mm (5.000 in), and the crosshead speed, where recorded (Table S1), was 0.25 in min⁻¹, corresponding to a nominal strain rate of 8.3 × 10⁻⁴ s⁻¹. In the exported test records available to us, data were logged at 5 Hz (10 Hz in the heating test), and each unloading ran at the same crosshead speed to approximately zero load; the machine model, load cell, grips and preload are not given in those records. The tests were run at laboratory ambient temperature, which was not recorded, nor was the time between heat treatment and test. Engineering stress was computed from the specimen diameter entered in the instrument record, and engineering strain was taken as the crosshead extension divided by the gauge length, without extensometry. No correction for load-train compliance or grip slip was applied; the elastic portion of each curve therefore includes the load-train compliance, and the moduli in</w:t>
       </w:r>
       <w:r>
         <w:t xml:space="preserve"> </w:t>
@@ -653,7 +653,7 @@
         <w:pStyle w:val="BodyText"/>
       </w:pPr>
       <w:r>
-        <w:t xml:space="preserve">A dedicated loading–unloading–heating test was also conducted on one specimen of each alloy in the 1200 °C/1 min condition to evaluate any shape-memory response. Each specimen was loaded to 3% strain and unloaded to zero stress, after which the crosshead was returned to its starting position (nominal zero strain). At the same time, the specimen was heated to ≈200 °C at ≈50 °C s⁻¹ and held for ≈10 s to trigger any reverse transformation of martensite to austenite; it was then reloaded. Any shape-memory effect would be revealed during the heating stage: it would cause the stress on reloading to rise at a strain lower than the residual strain after unloading.</w:t>
+        <w:t xml:space="preserve">A dedicated loading–unloading–heating test was also conducted on one specimen of each alloy in the 1200 °C/1 min condition to evaluate any shape-memory response. Each specimen was loaded to 3% strain and unloaded to zero stress, after which the crosshead was returned to its starting position (nominal zero strain) and the specimen was reloaded; the crosshead moved at 0.25 in min⁻¹ throughout, without a hold. While the specimen carried no load, it was heated to ≈200 °C at ≈50 °C s⁻¹ and held for ≈10 s to trigger any reverse transformation of martensite to austenite. The test record contains time, crosshead displacement and force only: specimen temperature was not logged, and no correction for fixture expansion was applied. Any shape-memory effect would be revealed during the heating stage: it would cause the stress on reloading to rise at a strain lower than the residual strain after unloading.</w:t>
       </w:r>
     </w:p>
     <w:bookmarkEnd w:id="14"/>
@@ -680,7 +680,7 @@
         <w:t xml:space="preserve">(Ref 20,21)</w:t>
       </w:r>
       <w:r>
-        <w:t xml:space="preserve">. The incident wavelength was λ = 0.12587 Å, and the beam size was 0.5 × 0.5 mm². Patterns were recorded in transmission on a 4288 × 4288-pixel area detector (100 µm pixels) located ≈1.83 m from the specimen. The beam center and the sample-to-detector distance were fitted from the Debye–Scherrer rings themselves and were consistent to better than 0.1% across six indexed rings; a CeO₂ calibrant frame gave the same beam center. Two-dimensional Debye–Scherrer patterns, one or two frames per specimen, were collected from separate specimens of each alloy before and after tensile deformation (10% strain for the LLM alloy, 8% for the Omori alloy) and from the cyclically treated LLM-alloy rod (Sec. 3.3). The deformed specimens were measured after unloading, at zero load. One specimen was measured per alloy and condition (Table S1). The 2D images were processed in FIT2D</w:t>
+        <w:t xml:space="preserve">. The incident wavelength was λ = 0.12587 Å, and the beam size was 0.5 × 0.5 mm². Patterns were recorded in transmission on a 4288 × 4288-pixel area detector (100 µm pixels) located ≈1.83 m from the specimen. The beam center and the sample-to-detector distance were fitted from the Debye–Scherrer rings themselves and were consistent to better than 0.1% across six indexed rings; a CeO₂ calibrant frame gave the same beam center. Two-dimensional Debye–Scherrer patterns, one or two frames per specimen, were collected from separate specimens of each alloy before and after tensile deformation (10% strain for the LLM alloy, 8% for the Omori alloy) and from the cyclically treated LLM-alloy rod (Sec. 3.3). The deformed specimens were measured after unloading, at zero load; their location along the gauge relative to the fracture or neck was not recorded. One specimen was measured per alloy and condition (Table S1). The 2D images were processed in FIT2D</w:t>
       </w:r>
       <w:r>
         <w:t xml:space="preserve"> </w:t>
@@ -710,7 +710,7 @@
         <w:t xml:space="preserve">(Ref 24)</w:t>
       </w:r>
       <w:r>
-        <w:t xml:space="preserve">.</w:t>
+        <w:t xml:space="preserve">. The detector model, exposure time per frame, background measurement and any specimen motion during exposure are not documented in the beamline records available to us, and the overspill of the 0.5 mm beam beyond the 0.36 mm wire was not corrected; the before/after comparisons are therefore treated as qualitative (Sec. 3.3).</w:t>
       </w:r>
     </w:p>
     <w:p>
@@ -848,7 +848,7 @@
         <w:t xml:space="preserve"> </w:t>
       </w:r>
       <w:r>
-        <w:t xml:space="preserve">shows the microstructure of the LLM alloy after heat treatment at 1200 °C for 1 minute. The alloy has a fine-grained, equiaxed microstructure with grain diameters well under 20 µm; this and the other grain sizes quoted here are visual estimates from the micrographs, not stereological measurements. Scanning electron microscopy (</w:t>
+        <w:t xml:space="preserve">shows the microstructure of the LLM alloy after heat treatment at 1200 °C for 1 minute. The alloy has a fine-grained, equiaxed microstructure with grain diameters well under 20 µm; this and the other grain sizes quoted here are visual estimates from the micrographs, not stereological measurements, and the number of fields inspected was not recorded. Scanning electron microscopy (</w:t>
       </w:r>
       <w:r>
         <w:rPr>

</xml_diff>